<commit_message>
java: multithreading threory added
</commit_message>
<xml_diff>
--- a/Java/Java_notes.docx
+++ b/Java/Java_notes.docx
@@ -6578,6 +6578,1111 @@
         </w:tc>
       </w:tr>
     </w:tbl>
+    <w:p>
+      <w:pPr>
+        <w:spacing w:after="0"/>
+        <w:rPr>
+          <w:rFonts w:cstheme="minorHAnsi"/>
+          <w:color w:val="000000" w:themeColor="text1"/>
+        </w:rPr>
+      </w:pPr>
+    </w:p>
+    <w:p>
+      <w:pPr>
+        <w:spacing w:after="0"/>
+        <w:rPr>
+          <w:rFonts w:cstheme="minorHAnsi"/>
+          <w:b/>
+          <w:bCs/>
+          <w:color w:val="0070C0"/>
+        </w:rPr>
+      </w:pPr>
+      <w:proofErr w:type="spellStart"/>
+      <w:r>
+        <w:rPr>
+          <w:rFonts w:cstheme="minorHAnsi"/>
+          <w:b/>
+          <w:bCs/>
+          <w:color w:val="0070C0"/>
+        </w:rPr>
+        <w:t>Multi threading</w:t>
+      </w:r>
+      <w:proofErr w:type="spellEnd"/>
+      <w:r>
+        <w:rPr>
+          <w:rFonts w:cstheme="minorHAnsi"/>
+          <w:b/>
+          <w:bCs/>
+          <w:color w:val="0070C0"/>
+        </w:rPr>
+        <w:t xml:space="preserve"> and </w:t>
+      </w:r>
+      <w:proofErr w:type="gramStart"/>
+      <w:r>
+        <w:rPr>
+          <w:rFonts w:cstheme="minorHAnsi"/>
+          <w:b/>
+          <w:bCs/>
+          <w:color w:val="0070C0"/>
+        </w:rPr>
+        <w:t>Concurrency :</w:t>
+      </w:r>
+      <w:proofErr w:type="gramEnd"/>
+      <w:r>
+        <w:rPr>
+          <w:rFonts w:cstheme="minorHAnsi"/>
+          <w:b/>
+          <w:bCs/>
+          <w:color w:val="0070C0"/>
+        </w:rPr>
+        <w:t xml:space="preserve"> </w:t>
+      </w:r>
+    </w:p>
+    <w:p>
+      <w:pPr>
+        <w:spacing w:after="0"/>
+        <w:rPr>
+          <w:rFonts w:cstheme="minorHAnsi"/>
+          <w:color w:val="000000" w:themeColor="text1"/>
+        </w:rPr>
+      </w:pPr>
+      <w:proofErr w:type="gramStart"/>
+      <w:r>
+        <w:rPr>
+          <w:rFonts w:cstheme="minorHAnsi"/>
+          <w:b/>
+          <w:bCs/>
+          <w:color w:val="000000" w:themeColor="text1"/>
+        </w:rPr>
+        <w:t>Process</w:t>
+      </w:r>
+      <w:r>
+        <w:rPr>
+          <w:rFonts w:cstheme="minorHAnsi"/>
+          <w:b/>
+          <w:bCs/>
+          <w:color w:val="000000" w:themeColor="text1"/>
+        </w:rPr>
+        <w:t xml:space="preserve"> :</w:t>
+      </w:r>
+      <w:proofErr w:type="gramEnd"/>
+      <w:r>
+        <w:rPr>
+          <w:rFonts w:cstheme="minorHAnsi"/>
+          <w:b/>
+          <w:bCs/>
+          <w:color w:val="000000" w:themeColor="text1"/>
+        </w:rPr>
+        <w:t xml:space="preserve"> </w:t>
+      </w:r>
+      <w:r>
+        <w:rPr>
+          <w:rFonts w:cstheme="minorHAnsi"/>
+          <w:color w:val="000000" w:themeColor="text1"/>
+        </w:rPr>
+        <w:t xml:space="preserve">Process is an instance of program which is getting executed. </w:t>
+      </w:r>
+    </w:p>
+    <w:p>
+      <w:pPr>
+        <w:spacing w:after="0"/>
+        <w:rPr>
+          <w:rFonts w:cstheme="minorHAnsi"/>
+          <w:color w:val="000000" w:themeColor="text1"/>
+        </w:rPr>
+      </w:pPr>
+      <w:r>
+        <w:rPr>
+          <w:rFonts w:cstheme="minorHAnsi"/>
+          <w:color w:val="000000" w:themeColor="text1"/>
+        </w:rPr>
+        <w:t>C</w:t>
+      </w:r>
+      <w:r>
+        <w:rPr>
+          <w:rFonts w:cstheme="minorHAnsi"/>
+          <w:color w:val="000000" w:themeColor="text1"/>
+        </w:rPr>
+        <w:t>ompilation (</w:t>
+      </w:r>
+      <w:proofErr w:type="spellStart"/>
+      <w:r>
+        <w:rPr>
+          <w:rFonts w:cstheme="minorHAnsi"/>
+          <w:color w:val="000000" w:themeColor="text1"/>
+        </w:rPr>
+        <w:t>iavac</w:t>
+      </w:r>
+      <w:proofErr w:type="spellEnd"/>
+      <w:r>
+        <w:rPr>
+          <w:rFonts w:cstheme="minorHAnsi"/>
+          <w:color w:val="000000" w:themeColor="text1"/>
+        </w:rPr>
+        <w:t xml:space="preserve"> Test.java</w:t>
+      </w:r>
+      <w:proofErr w:type="gramStart"/>
+      <w:r>
+        <w:rPr>
+          <w:rFonts w:cstheme="minorHAnsi"/>
+          <w:color w:val="000000" w:themeColor="text1"/>
+        </w:rPr>
+        <w:t>) :</w:t>
+      </w:r>
+      <w:proofErr w:type="gramEnd"/>
+      <w:r>
+        <w:rPr>
+          <w:rFonts w:cstheme="minorHAnsi"/>
+          <w:color w:val="000000" w:themeColor="text1"/>
+        </w:rPr>
+        <w:t xml:space="preserve"> generates bytecode that can be executed by JVM.</w:t>
+      </w:r>
+      <w:r>
+        <w:rPr>
+          <w:rFonts w:cstheme="minorHAnsi"/>
+          <w:color w:val="000000" w:themeColor="text1"/>
+        </w:rPr>
+        <w:t xml:space="preserve"> </w:t>
+      </w:r>
+    </w:p>
+    <w:p>
+      <w:pPr>
+        <w:spacing w:after="0"/>
+        <w:rPr>
+          <w:rFonts w:cstheme="minorHAnsi"/>
+          <w:color w:val="000000" w:themeColor="text1"/>
+        </w:rPr>
+      </w:pPr>
+      <w:r>
+        <w:rPr>
+          <w:rFonts w:cstheme="minorHAnsi"/>
+          <w:color w:val="000000" w:themeColor="text1"/>
+        </w:rPr>
+        <w:t>Execution (java Test</w:t>
+      </w:r>
+      <w:proofErr w:type="gramStart"/>
+      <w:r>
+        <w:rPr>
+          <w:rFonts w:cstheme="minorHAnsi"/>
+          <w:color w:val="000000" w:themeColor="text1"/>
+        </w:rPr>
+        <w:t>) :</w:t>
+      </w:r>
+      <w:proofErr w:type="gramEnd"/>
+      <w:r>
+        <w:rPr>
+          <w:rFonts w:cstheme="minorHAnsi"/>
+          <w:color w:val="000000" w:themeColor="text1"/>
+        </w:rPr>
+        <w:t xml:space="preserve"> at this point, JVM starts the new Process, here Test is the class which has "public</w:t>
+      </w:r>
+      <w:r>
+        <w:rPr>
+          <w:rFonts w:cstheme="minorHAnsi"/>
+          <w:color w:val="000000" w:themeColor="text1"/>
+        </w:rPr>
+        <w:t xml:space="preserve"> </w:t>
+      </w:r>
+      <w:r>
+        <w:rPr>
+          <w:rFonts w:cstheme="minorHAnsi"/>
+          <w:color w:val="000000" w:themeColor="text1"/>
+        </w:rPr>
+        <w:t>static void</w:t>
+      </w:r>
+      <w:r>
+        <w:rPr>
+          <w:rFonts w:cstheme="minorHAnsi"/>
+          <w:color w:val="000000" w:themeColor="text1"/>
+        </w:rPr>
+        <w:t xml:space="preserve"> </w:t>
+      </w:r>
+      <w:proofErr w:type="gramStart"/>
+      <w:r>
+        <w:rPr>
+          <w:rFonts w:cstheme="minorHAnsi"/>
+          <w:color w:val="000000" w:themeColor="text1"/>
+        </w:rPr>
+        <w:t>main(</w:t>
+      </w:r>
+      <w:proofErr w:type="gramEnd"/>
+      <w:r>
+        <w:rPr>
+          <w:rFonts w:cstheme="minorHAnsi"/>
+          <w:color w:val="000000" w:themeColor="text1"/>
+        </w:rPr>
+        <w:t xml:space="preserve">String </w:t>
+      </w:r>
+      <w:proofErr w:type="spellStart"/>
+      <w:r>
+        <w:rPr>
+          <w:rFonts w:cstheme="minorHAnsi"/>
+          <w:color w:val="000000" w:themeColor="text1"/>
+        </w:rPr>
+        <w:t>args</w:t>
+      </w:r>
+      <w:proofErr w:type="spellEnd"/>
+      <w:r>
+        <w:rPr>
+          <w:rFonts w:cstheme="minorHAnsi"/>
+          <w:color w:val="000000" w:themeColor="text1"/>
+        </w:rPr>
+        <w:t>)”</w:t>
+      </w:r>
+      <w:r>
+        <w:rPr>
+          <w:rFonts w:cstheme="minorHAnsi"/>
+          <w:color w:val="000000" w:themeColor="text1"/>
+        </w:rPr>
+        <w:t xml:space="preserve"> method.</w:t>
+      </w:r>
+    </w:p>
+    <w:p>
+      <w:pPr>
+        <w:spacing w:after="0"/>
+        <w:rPr>
+          <w:rFonts w:cstheme="minorHAnsi"/>
+          <w:color w:val="000000" w:themeColor="text1"/>
+        </w:rPr>
+      </w:pPr>
+      <w:proofErr w:type="gramStart"/>
+      <w:r>
+        <w:rPr>
+          <w:rFonts w:cstheme="minorHAnsi"/>
+          <w:b/>
+          <w:bCs/>
+          <w:color w:val="000000" w:themeColor="text1"/>
+        </w:rPr>
+        <w:t>Thread :</w:t>
+      </w:r>
+      <w:proofErr w:type="gramEnd"/>
+      <w:r>
+        <w:rPr>
+          <w:rFonts w:cstheme="minorHAnsi"/>
+          <w:b/>
+          <w:bCs/>
+          <w:color w:val="000000" w:themeColor="text1"/>
+        </w:rPr>
+        <w:t xml:space="preserve"> </w:t>
+      </w:r>
+      <w:r>
+        <w:rPr>
+          <w:rFonts w:cstheme="minorHAnsi"/>
+          <w:color w:val="000000" w:themeColor="text1"/>
+        </w:rPr>
+        <w:t>S</w:t>
+      </w:r>
+      <w:r>
+        <w:rPr>
+          <w:rFonts w:cstheme="minorHAnsi"/>
+          <w:color w:val="000000" w:themeColor="text1"/>
+        </w:rPr>
+        <w:t>mallest sequence of instructions that are executed by CPU independently.</w:t>
+      </w:r>
+    </w:p>
+    <w:p>
+      <w:pPr>
+        <w:spacing w:after="0"/>
+        <w:rPr>
+          <w:rFonts w:cstheme="minorHAnsi"/>
+          <w:color w:val="000000" w:themeColor="text1"/>
+        </w:rPr>
+      </w:pPr>
+    </w:p>
+    <w:p>
+      <w:pPr>
+        <w:spacing w:after="0"/>
+        <w:rPr>
+          <w:rFonts w:cstheme="minorHAnsi"/>
+          <w:color w:val="000000" w:themeColor="text1"/>
+        </w:rPr>
+      </w:pPr>
+      <w:r>
+        <w:rPr>
+          <w:rFonts w:cstheme="minorHAnsi"/>
+          <w:b/>
+          <w:bCs/>
+          <w:color w:val="000000" w:themeColor="text1"/>
+        </w:rPr>
+        <w:t>Multitasking</w:t>
+      </w:r>
+      <w:r>
+        <w:rPr>
+          <w:rFonts w:cstheme="minorHAnsi"/>
+          <w:color w:val="000000" w:themeColor="text1"/>
+        </w:rPr>
+        <w:t xml:space="preserve"> is the execution of multiple independent tasks, typically managed by the operating system</w:t>
+      </w:r>
+      <w:r>
+        <w:rPr>
+          <w:rFonts w:cstheme="minorHAnsi"/>
+          <w:color w:val="000000" w:themeColor="text1"/>
+        </w:rPr>
+        <w:t>.</w:t>
+      </w:r>
+    </w:p>
+    <w:p>
+      <w:pPr>
+        <w:spacing w:after="0"/>
+        <w:rPr>
+          <w:rFonts w:cstheme="minorHAnsi"/>
+          <w:color w:val="000000" w:themeColor="text1"/>
+        </w:rPr>
+      </w:pPr>
+      <w:r>
+        <w:rPr>
+          <w:rFonts w:cstheme="minorHAnsi"/>
+          <w:b/>
+          <w:bCs/>
+          <w:color w:val="000000" w:themeColor="text1"/>
+        </w:rPr>
+        <w:t>Multithreading</w:t>
+      </w:r>
+      <w:r>
+        <w:rPr>
+          <w:rFonts w:cstheme="minorHAnsi"/>
+          <w:color w:val="000000" w:themeColor="text1"/>
+        </w:rPr>
+        <w:t xml:space="preserve"> is the execution of multiple threads within the same process, where threads share the process's resources.</w:t>
+      </w:r>
+    </w:p>
+    <w:p>
+      <w:pPr>
+        <w:spacing w:after="0"/>
+        <w:rPr>
+          <w:rFonts w:cstheme="minorHAnsi"/>
+          <w:color w:val="000000" w:themeColor="text1"/>
+        </w:rPr>
+      </w:pPr>
+    </w:p>
+    <w:p>
+      <w:pPr>
+        <w:spacing w:after="0"/>
+        <w:rPr>
+          <w:rFonts w:cstheme="minorHAnsi"/>
+          <w:b/>
+          <w:bCs/>
+          <w:color w:val="000000" w:themeColor="text1"/>
+        </w:rPr>
+      </w:pPr>
+      <w:r>
+        <w:rPr>
+          <w:rFonts w:cstheme="minorHAnsi"/>
+          <w:b/>
+          <w:bCs/>
+          <w:color w:val="000000" w:themeColor="text1"/>
+        </w:rPr>
+        <w:t>Thread creation, thread lifecycle, inter thread communication</w:t>
+      </w:r>
+    </w:p>
+    <w:p>
+      <w:pPr>
+        <w:spacing w:after="0"/>
+        <w:rPr>
+          <w:rFonts w:cstheme="minorHAnsi"/>
+          <w:color w:val="000000" w:themeColor="text1"/>
+        </w:rPr>
+      </w:pPr>
+      <w:r>
+        <w:rPr>
+          <w:rFonts w:cstheme="minorHAnsi"/>
+          <w:color w:val="000000" w:themeColor="text1"/>
+        </w:rPr>
+        <w:t xml:space="preserve">Thread can be created using </w:t>
+      </w:r>
+      <w:r>
+        <w:rPr>
+          <w:rFonts w:cstheme="minorHAnsi"/>
+          <w:b/>
+          <w:bCs/>
+          <w:color w:val="000000" w:themeColor="text1"/>
+        </w:rPr>
+        <w:t>extends Thread</w:t>
+      </w:r>
+      <w:r>
+        <w:rPr>
+          <w:rFonts w:cstheme="minorHAnsi"/>
+          <w:color w:val="000000" w:themeColor="text1"/>
+        </w:rPr>
+        <w:t xml:space="preserve"> </w:t>
+      </w:r>
+      <w:r>
+        <w:rPr>
+          <w:rFonts w:cstheme="minorHAnsi"/>
+          <w:color w:val="000000" w:themeColor="text1"/>
+        </w:rPr>
+        <w:t xml:space="preserve">class </w:t>
+      </w:r>
+      <w:r>
+        <w:rPr>
+          <w:rFonts w:cstheme="minorHAnsi"/>
+          <w:color w:val="000000" w:themeColor="text1"/>
+        </w:rPr>
+        <w:t xml:space="preserve">or using </w:t>
+      </w:r>
+      <w:r>
+        <w:rPr>
+          <w:rFonts w:cstheme="minorHAnsi"/>
+          <w:b/>
+          <w:bCs/>
+          <w:color w:val="000000" w:themeColor="text1"/>
+        </w:rPr>
+        <w:t>implements</w:t>
+      </w:r>
+      <w:r>
+        <w:rPr>
+          <w:rFonts w:cstheme="minorHAnsi"/>
+          <w:color w:val="000000" w:themeColor="text1"/>
+        </w:rPr>
+        <w:t xml:space="preserve"> </w:t>
+      </w:r>
+      <w:r>
+        <w:rPr>
+          <w:rFonts w:cstheme="minorHAnsi"/>
+          <w:b/>
+          <w:bCs/>
+          <w:color w:val="000000" w:themeColor="text1"/>
+        </w:rPr>
+        <w:t>Runnable</w:t>
+      </w:r>
+      <w:r>
+        <w:rPr>
+          <w:rFonts w:cstheme="minorHAnsi"/>
+          <w:b/>
+          <w:bCs/>
+          <w:color w:val="000000" w:themeColor="text1"/>
+        </w:rPr>
+        <w:t xml:space="preserve"> </w:t>
+      </w:r>
+      <w:r>
+        <w:rPr>
+          <w:rFonts w:cstheme="minorHAnsi"/>
+          <w:color w:val="000000" w:themeColor="text1"/>
+        </w:rPr>
+        <w:t>interface</w:t>
+      </w:r>
+      <w:r>
+        <w:rPr>
+          <w:rFonts w:cstheme="minorHAnsi"/>
+          <w:color w:val="000000" w:themeColor="text1"/>
+        </w:rPr>
+        <w:t>.</w:t>
+      </w:r>
+    </w:p>
+    <w:p>
+      <w:pPr>
+        <w:spacing w:after="0"/>
+        <w:rPr>
+          <w:rFonts w:cstheme="minorHAnsi"/>
+          <w:b/>
+          <w:bCs/>
+          <w:color w:val="000000" w:themeColor="text1"/>
+        </w:rPr>
+      </w:pPr>
+      <w:r>
+        <w:rPr>
+          <w:rFonts w:cstheme="minorHAnsi"/>
+          <w:b/>
+          <w:bCs/>
+          <w:color w:val="000000" w:themeColor="text1"/>
+        </w:rPr>
+        <w:t xml:space="preserve">thread </w:t>
+      </w:r>
+      <w:proofErr w:type="gramStart"/>
+      <w:r>
+        <w:rPr>
+          <w:rFonts w:cstheme="minorHAnsi"/>
+          <w:b/>
+          <w:bCs/>
+          <w:color w:val="000000" w:themeColor="text1"/>
+        </w:rPr>
+        <w:t>lifecycle</w:t>
+      </w:r>
+      <w:r>
+        <w:rPr>
+          <w:rFonts w:cstheme="minorHAnsi"/>
+          <w:b/>
+          <w:bCs/>
+          <w:color w:val="000000" w:themeColor="text1"/>
+        </w:rPr>
+        <w:t xml:space="preserve"> :</w:t>
+      </w:r>
+      <w:proofErr w:type="gramEnd"/>
+      <w:r>
+        <w:rPr>
+          <w:rFonts w:cstheme="minorHAnsi"/>
+          <w:b/>
+          <w:bCs/>
+          <w:color w:val="000000" w:themeColor="text1"/>
+        </w:rPr>
+        <w:t xml:space="preserve"> </w:t>
+      </w:r>
+    </w:p>
+    <w:p>
+      <w:pPr>
+        <w:spacing w:after="0"/>
+        <w:rPr>
+          <w:rFonts w:cstheme="minorHAnsi"/>
+          <w:color w:val="000000" w:themeColor="text1"/>
+        </w:rPr>
+      </w:pPr>
+      <w:r>
+        <w:rPr>
+          <w:rFonts w:cstheme="minorHAnsi"/>
+          <w:color w:val="000000" w:themeColor="text1"/>
+        </w:rPr>
+        <w:t xml:space="preserve">The official Java </w:t>
+      </w:r>
+      <w:proofErr w:type="spellStart"/>
+      <w:r>
+        <w:rPr>
+          <w:rFonts w:cstheme="minorHAnsi"/>
+          <w:color w:val="000000" w:themeColor="text1"/>
+        </w:rPr>
+        <w:t>Thread.State</w:t>
+      </w:r>
+      <w:proofErr w:type="spellEnd"/>
+      <w:r>
+        <w:rPr>
+          <w:rFonts w:cstheme="minorHAnsi"/>
+          <w:color w:val="000000" w:themeColor="text1"/>
+        </w:rPr>
+        <w:t xml:space="preserve"> has </w:t>
+      </w:r>
+      <w:r>
+        <w:rPr>
+          <w:rFonts w:cstheme="minorHAnsi"/>
+          <w:b/>
+          <w:bCs/>
+          <w:color w:val="000000" w:themeColor="text1"/>
+        </w:rPr>
+        <w:t>6 states</w:t>
+      </w:r>
+      <w:r>
+        <w:rPr>
+          <w:rFonts w:cstheme="minorHAnsi"/>
+          <w:color w:val="000000" w:themeColor="text1"/>
+        </w:rPr>
+        <w:t>:</w:t>
+      </w:r>
+    </w:p>
+    <w:p>
+      <w:pPr>
+        <w:spacing w:after="0"/>
+        <w:rPr>
+          <w:rFonts w:ascii="Consolas" w:hAnsi="Consolas" w:cstheme="minorHAnsi"/>
+          <w:color w:val="000000" w:themeColor="text1"/>
+          <w:sz w:val="16"/>
+          <w:szCs w:val="16"/>
+        </w:rPr>
+      </w:pPr>
+      <w:r>
+        <w:rPr>
+          <w:rFonts w:ascii="Consolas" w:hAnsi="Consolas" w:cstheme="minorHAnsi"/>
+          <w:b/>
+          <w:bCs/>
+          <w:color w:val="000000" w:themeColor="text1"/>
+          <w:sz w:val="16"/>
+          <w:szCs w:val="16"/>
+        </w:rPr>
+        <w:t>NEW</w:t>
+      </w:r>
+      <w:r>
+        <w:rPr>
+          <w:rFonts w:ascii="Consolas" w:hAnsi="Consolas" w:cstheme="minorHAnsi"/>
+          <w:color w:val="000000" w:themeColor="text1"/>
+          <w:sz w:val="16"/>
+          <w:szCs w:val="16"/>
+        </w:rPr>
+        <w:t xml:space="preserve"> </w:t>
+      </w:r>
+      <w:r>
+        <w:rPr>
+          <w:rFonts w:ascii="Consolas" w:hAnsi="Consolas" w:cstheme="minorHAnsi"/>
+          <w:color w:val="000000" w:themeColor="text1"/>
+          <w:sz w:val="16"/>
+          <w:szCs w:val="16"/>
+        </w:rPr>
+        <w:t>-&gt;</w:t>
+      </w:r>
+      <w:r>
+        <w:rPr>
+          <w:rFonts w:ascii="Consolas" w:hAnsi="Consolas" w:cstheme="minorHAnsi"/>
+          <w:color w:val="000000" w:themeColor="text1"/>
+          <w:sz w:val="16"/>
+          <w:szCs w:val="16"/>
+        </w:rPr>
+        <w:t xml:space="preserve"> </w:t>
+      </w:r>
+      <w:r>
+        <w:rPr>
+          <w:rFonts w:ascii="Consolas" w:hAnsi="Consolas" w:cstheme="minorHAnsi"/>
+          <w:b/>
+          <w:bCs/>
+          <w:color w:val="000000" w:themeColor="text1"/>
+          <w:sz w:val="16"/>
+          <w:szCs w:val="16"/>
+        </w:rPr>
+        <w:t>RUNNABLE</w:t>
+      </w:r>
+      <w:r>
+        <w:rPr>
+          <w:rFonts w:ascii="Consolas" w:hAnsi="Consolas" w:cstheme="minorHAnsi"/>
+          <w:color w:val="000000" w:themeColor="text1"/>
+          <w:sz w:val="16"/>
+          <w:szCs w:val="16"/>
+        </w:rPr>
+        <w:t xml:space="preserve"> </w:t>
+      </w:r>
+      <w:r>
+        <w:rPr>
+          <w:rFonts w:ascii="Consolas" w:hAnsi="Consolas" w:cstheme="minorHAnsi"/>
+          <w:color w:val="000000" w:themeColor="text1"/>
+          <w:sz w:val="16"/>
+          <w:szCs w:val="16"/>
+        </w:rPr>
+        <w:t>-&gt;</w:t>
+      </w:r>
+      <w:r>
+        <w:rPr>
+          <w:rFonts w:ascii="Consolas" w:hAnsi="Consolas" w:cstheme="minorHAnsi"/>
+          <w:color w:val="000000" w:themeColor="text1"/>
+          <w:sz w:val="16"/>
+          <w:szCs w:val="16"/>
+        </w:rPr>
+        <w:t xml:space="preserve"> RUNNING* </w:t>
+      </w:r>
+      <w:r>
+        <w:rPr>
+          <w:rFonts w:ascii="Consolas" w:hAnsi="Consolas" w:cstheme="minorHAnsi"/>
+          <w:color w:val="000000" w:themeColor="text1"/>
+          <w:sz w:val="16"/>
+          <w:szCs w:val="16"/>
+        </w:rPr>
+        <w:t>-&gt;</w:t>
+      </w:r>
+      <w:r>
+        <w:rPr>
+          <w:rFonts w:ascii="Consolas" w:hAnsi="Consolas" w:cstheme="minorHAnsi"/>
+          <w:color w:val="000000" w:themeColor="text1"/>
+          <w:sz w:val="16"/>
+          <w:szCs w:val="16"/>
+        </w:rPr>
+        <w:t xml:space="preserve"> </w:t>
+      </w:r>
+      <w:r>
+        <w:rPr>
+          <w:rFonts w:ascii="Consolas" w:hAnsi="Consolas" w:cstheme="minorHAnsi"/>
+          <w:b/>
+          <w:bCs/>
+          <w:color w:val="000000" w:themeColor="text1"/>
+          <w:sz w:val="16"/>
+          <w:szCs w:val="16"/>
+        </w:rPr>
+        <w:t>TERMINATED</w:t>
+      </w:r>
+    </w:p>
+    <w:p>
+      <w:pPr>
+        <w:spacing w:after="0"/>
+        <w:rPr>
+          <w:rFonts w:ascii="Consolas" w:hAnsi="Consolas" w:cstheme="minorHAnsi"/>
+          <w:color w:val="000000" w:themeColor="text1"/>
+          <w:sz w:val="16"/>
+          <w:szCs w:val="16"/>
+        </w:rPr>
+      </w:pPr>
+    </w:p>
+    <w:p>
+      <w:pPr>
+        <w:spacing w:after="0"/>
+        <w:rPr>
+          <w:rFonts w:ascii="Consolas" w:hAnsi="Consolas" w:cstheme="minorHAnsi"/>
+          <w:color w:val="000000" w:themeColor="text1"/>
+          <w:sz w:val="16"/>
+          <w:szCs w:val="16"/>
+        </w:rPr>
+      </w:pPr>
+      <w:r>
+        <w:rPr>
+          <w:rFonts w:ascii="Consolas" w:hAnsi="Consolas" w:cstheme="minorHAnsi"/>
+          <w:color w:val="000000" w:themeColor="text1"/>
+          <w:sz w:val="16"/>
+          <w:szCs w:val="16"/>
+        </w:rPr>
+        <w:t>And while runnable, it can temporarily enter:</w:t>
+      </w:r>
+    </w:p>
+    <w:p>
+      <w:pPr>
+        <w:spacing w:after="0"/>
+        <w:rPr>
+          <w:rFonts w:ascii="Consolas" w:hAnsi="Consolas" w:cstheme="minorHAnsi"/>
+          <w:b/>
+          <w:bCs/>
+          <w:color w:val="000000" w:themeColor="text1"/>
+          <w:sz w:val="16"/>
+          <w:szCs w:val="16"/>
+        </w:rPr>
+      </w:pPr>
+      <w:proofErr w:type="gramStart"/>
+      <w:r>
+        <w:rPr>
+          <w:rFonts w:ascii="Consolas" w:hAnsi="Consolas" w:cstheme="minorHAnsi"/>
+          <w:b/>
+          <w:bCs/>
+          <w:color w:val="000000" w:themeColor="text1"/>
+          <w:sz w:val="16"/>
+          <w:szCs w:val="16"/>
+        </w:rPr>
+        <w:t>WAITING</w:t>
+      </w:r>
+      <w:r>
+        <w:rPr>
+          <w:rFonts w:ascii="Consolas" w:hAnsi="Consolas" w:cstheme="minorHAnsi"/>
+          <w:color w:val="000000" w:themeColor="text1"/>
+          <w:sz w:val="16"/>
+          <w:szCs w:val="16"/>
+        </w:rPr>
+        <w:t>,</w:t>
+      </w:r>
+      <w:r>
+        <w:rPr>
+          <w:rFonts w:ascii="Consolas" w:hAnsi="Consolas" w:cstheme="minorHAnsi"/>
+          <w:b/>
+          <w:bCs/>
+          <w:color w:val="000000" w:themeColor="text1"/>
+          <w:sz w:val="16"/>
+          <w:szCs w:val="16"/>
+        </w:rPr>
+        <w:t>TIMED</w:t>
+      </w:r>
+      <w:proofErr w:type="gramEnd"/>
+      <w:r>
+        <w:rPr>
+          <w:rFonts w:ascii="Consolas" w:hAnsi="Consolas" w:cstheme="minorHAnsi"/>
+          <w:b/>
+          <w:bCs/>
+          <w:color w:val="000000" w:themeColor="text1"/>
+          <w:sz w:val="16"/>
+          <w:szCs w:val="16"/>
+        </w:rPr>
+        <w:t>_WAITING</w:t>
+      </w:r>
+      <w:r>
+        <w:rPr>
+          <w:rFonts w:ascii="Consolas" w:hAnsi="Consolas" w:cstheme="minorHAnsi"/>
+          <w:color w:val="000000" w:themeColor="text1"/>
+          <w:sz w:val="16"/>
+          <w:szCs w:val="16"/>
+        </w:rPr>
+        <w:t>,</w:t>
+      </w:r>
+      <w:r>
+        <w:rPr>
+          <w:rFonts w:ascii="Consolas" w:hAnsi="Consolas" w:cstheme="minorHAnsi"/>
+          <w:color w:val="000000" w:themeColor="text1"/>
+          <w:sz w:val="16"/>
+          <w:szCs w:val="16"/>
+        </w:rPr>
+        <w:t xml:space="preserve"> </w:t>
+      </w:r>
+      <w:r>
+        <w:rPr>
+          <w:rFonts w:ascii="Consolas" w:hAnsi="Consolas" w:cstheme="minorHAnsi"/>
+          <w:b/>
+          <w:bCs/>
+          <w:color w:val="000000" w:themeColor="text1"/>
+          <w:sz w:val="16"/>
+          <w:szCs w:val="16"/>
+        </w:rPr>
+        <w:t>BLOCKED</w:t>
+      </w:r>
+    </w:p>
+    <w:p>
+      <w:pPr>
+        <w:spacing w:after="0"/>
+        <w:rPr>
+          <w:rFonts w:ascii="Consolas" w:hAnsi="Consolas" w:cstheme="minorHAnsi"/>
+          <w:b/>
+          <w:bCs/>
+          <w:color w:val="000000" w:themeColor="text1"/>
+          <w:sz w:val="16"/>
+          <w:szCs w:val="16"/>
+        </w:rPr>
+      </w:pPr>
+    </w:p>
+    <w:p>
+      <w:pPr>
+        <w:spacing w:after="0"/>
+        <w:rPr>
+          <w:rFonts w:ascii="Consolas" w:hAnsi="Consolas" w:cstheme="minorHAnsi"/>
+          <w:color w:val="000000" w:themeColor="text1"/>
+          <w:sz w:val="16"/>
+          <w:szCs w:val="16"/>
+        </w:rPr>
+      </w:pPr>
+      <w:r>
+        <w:rPr>
+          <w:rFonts w:ascii="Consolas" w:hAnsi="Consolas" w:cstheme="minorHAnsi"/>
+          <w:color w:val="000000" w:themeColor="text1"/>
+          <w:sz w:val="16"/>
+          <w:szCs w:val="16"/>
+        </w:rPr>
+        <w:t xml:space="preserve">             ┌── BLOCKED ───────┐</w:t>
+      </w:r>
+    </w:p>
+    <w:p>
+      <w:pPr>
+        <w:spacing w:after="0"/>
+        <w:rPr>
+          <w:rFonts w:ascii="Consolas" w:hAnsi="Consolas" w:cstheme="minorHAnsi"/>
+          <w:color w:val="000000" w:themeColor="text1"/>
+          <w:sz w:val="16"/>
+          <w:szCs w:val="16"/>
+        </w:rPr>
+      </w:pPr>
+      <w:r>
+        <w:rPr>
+          <w:rFonts w:ascii="Consolas" w:hAnsi="Consolas" w:cstheme="minorHAnsi"/>
+          <w:color w:val="000000" w:themeColor="text1"/>
+          <w:sz w:val="16"/>
+          <w:szCs w:val="16"/>
+        </w:rPr>
+        <w:t xml:space="preserve">             │                  ↓</w:t>
+      </w:r>
+    </w:p>
+    <w:p>
+      <w:pPr>
+        <w:spacing w:after="0"/>
+        <w:rPr>
+          <w:rFonts w:ascii="Consolas" w:hAnsi="Consolas" w:cstheme="minorHAnsi"/>
+          <w:color w:val="000000" w:themeColor="text1"/>
+          <w:sz w:val="16"/>
+          <w:szCs w:val="16"/>
+        </w:rPr>
+      </w:pPr>
+      <w:r>
+        <w:rPr>
+          <w:rFonts w:ascii="Consolas" w:hAnsi="Consolas" w:cstheme="minorHAnsi"/>
+          <w:color w:val="000000" w:themeColor="text1"/>
+          <w:sz w:val="16"/>
+          <w:szCs w:val="16"/>
+        </w:rPr>
+        <w:t>NEW → RUNNABLE ← WAITING        │──</w:t>
+      </w:r>
+      <w:r>
+        <w:rPr>
+          <w:rFonts w:ascii="Consolas" w:hAnsi="Consolas" w:cstheme="minorHAnsi"/>
+          <w:color w:val="000000" w:themeColor="text1"/>
+          <w:sz w:val="16"/>
+          <w:szCs w:val="16"/>
+        </w:rPr>
+        <w:t xml:space="preserve">&gt; </w:t>
+      </w:r>
+      <w:r>
+        <w:rPr>
+          <w:rFonts w:ascii="Consolas" w:hAnsi="Consolas" w:cstheme="minorHAnsi"/>
+          <w:color w:val="000000" w:themeColor="text1"/>
+          <w:sz w:val="16"/>
+          <w:szCs w:val="16"/>
+        </w:rPr>
+        <w:t>TERMINATED</w:t>
+      </w:r>
+    </w:p>
+    <w:p>
+      <w:pPr>
+        <w:spacing w:after="0"/>
+        <w:rPr>
+          <w:rFonts w:ascii="Consolas" w:hAnsi="Consolas" w:cstheme="minorHAnsi"/>
+          <w:color w:val="000000" w:themeColor="text1"/>
+          <w:sz w:val="16"/>
+          <w:szCs w:val="16"/>
+        </w:rPr>
+      </w:pPr>
+      <w:r>
+        <w:rPr>
+          <w:rFonts w:ascii="Consolas" w:hAnsi="Consolas" w:cstheme="minorHAnsi"/>
+          <w:color w:val="000000" w:themeColor="text1"/>
+          <w:sz w:val="16"/>
+          <w:szCs w:val="16"/>
+        </w:rPr>
+        <w:t xml:space="preserve">             ↑                  │</w:t>
+      </w:r>
+    </w:p>
+    <w:p>
+      <w:pPr>
+        <w:spacing w:after="0"/>
+        <w:rPr>
+          <w:rFonts w:ascii="Consolas" w:hAnsi="Consolas" w:cstheme="minorHAnsi"/>
+          <w:color w:val="000000" w:themeColor="text1"/>
+          <w:sz w:val="16"/>
+          <w:szCs w:val="16"/>
+        </w:rPr>
+      </w:pPr>
+      <w:r>
+        <w:rPr>
+          <w:rFonts w:ascii="Consolas" w:hAnsi="Consolas" w:cstheme="minorHAnsi"/>
+          <w:color w:val="000000" w:themeColor="text1"/>
+          <w:sz w:val="16"/>
+          <w:szCs w:val="16"/>
+        </w:rPr>
+        <w:t xml:space="preserve">             └ TIMED_WAITING ───┘    </w:t>
+      </w:r>
+    </w:p>
+    <w:p>
+      <w:pPr>
+        <w:spacing w:after="0"/>
+        <w:rPr>
+          <w:rFonts w:ascii="Consolas" w:hAnsi="Consolas" w:cstheme="minorHAnsi"/>
+          <w:color w:val="000000" w:themeColor="text1"/>
+          <w:sz w:val="16"/>
+          <w:szCs w:val="16"/>
+        </w:rPr>
+      </w:pPr>
+    </w:p>
+    <w:p>
+      <w:pPr>
+        <w:spacing w:after="0"/>
+        <w:rPr>
+          <w:rFonts w:cstheme="minorHAnsi"/>
+          <w:color w:val="000000" w:themeColor="text1"/>
+        </w:rPr>
+      </w:pPr>
+      <w:r>
+        <w:rPr>
+          <w:rFonts w:cstheme="minorHAnsi"/>
+          <w:b/>
+          <w:bCs/>
+          <w:color w:val="000000" w:themeColor="text1"/>
+        </w:rPr>
+        <w:t>Thread communication</w:t>
+      </w:r>
+      <w:r>
+        <w:rPr>
+          <w:rFonts w:cstheme="minorHAnsi"/>
+          <w:color w:val="000000" w:themeColor="text1"/>
+        </w:rPr>
+        <w:t xml:space="preserve">: </w:t>
+      </w:r>
+    </w:p>
+    <w:p>
+      <w:pPr>
+        <w:spacing w:after="0"/>
+        <w:rPr>
+          <w:rFonts w:cstheme="minorHAnsi"/>
+          <w:color w:val="000000" w:themeColor="text1"/>
+        </w:rPr>
+      </w:pPr>
+      <w:r>
+        <w:rPr>
+          <w:rFonts w:cstheme="minorHAnsi"/>
+          <w:color w:val="000000" w:themeColor="text1"/>
+        </w:rPr>
+        <w:t xml:space="preserve">Monitor </w:t>
+      </w:r>
+      <w:proofErr w:type="gramStart"/>
+      <w:r>
+        <w:rPr>
+          <w:rFonts w:cstheme="minorHAnsi"/>
+          <w:color w:val="000000" w:themeColor="text1"/>
+        </w:rPr>
+        <w:t>Lock :</w:t>
+      </w:r>
+      <w:proofErr w:type="gramEnd"/>
+      <w:r>
+        <w:rPr>
+          <w:rFonts w:cstheme="minorHAnsi"/>
+          <w:color w:val="000000" w:themeColor="text1"/>
+        </w:rPr>
+        <w:t xml:space="preserve"> </w:t>
+      </w:r>
+      <w:r>
+        <w:rPr>
+          <w:rFonts w:cstheme="minorHAnsi"/>
+          <w:color w:val="000000" w:themeColor="text1"/>
+        </w:rPr>
+        <w:t xml:space="preserve">A </w:t>
+      </w:r>
+      <w:r>
+        <w:rPr>
+          <w:rFonts w:cstheme="minorHAnsi"/>
+          <w:b/>
+          <w:bCs/>
+          <w:color w:val="000000" w:themeColor="text1"/>
+        </w:rPr>
+        <w:t>monitor lock</w:t>
+      </w:r>
+      <w:r>
+        <w:rPr>
+          <w:rFonts w:cstheme="minorHAnsi"/>
+          <w:color w:val="000000" w:themeColor="text1"/>
+        </w:rPr>
+        <w:t xml:space="preserve"> is Java's built-in mechanism for ensuring that </w:t>
+      </w:r>
+      <w:r>
+        <w:rPr>
+          <w:rFonts w:cstheme="minorHAnsi"/>
+          <w:color w:val="000000" w:themeColor="text1"/>
+        </w:rPr>
+        <w:t xml:space="preserve">only one thread at a time can execute a </w:t>
+      </w:r>
+      <w:r>
+        <w:rPr>
+          <w:rFonts w:cstheme="minorHAnsi"/>
+          <w:b/>
+          <w:bCs/>
+          <w:color w:val="000000" w:themeColor="text1"/>
+        </w:rPr>
+        <w:t>synchronized section</w:t>
+      </w:r>
+      <w:r>
+        <w:rPr>
+          <w:rFonts w:cstheme="minorHAnsi"/>
+          <w:color w:val="000000" w:themeColor="text1"/>
+        </w:rPr>
+        <w:t xml:space="preserve"> for a particular object.</w:t>
+      </w:r>
+    </w:p>
+    <w:p>
+      <w:pPr>
+        <w:spacing w:after="0"/>
+        <w:rPr>
+          <w:rFonts w:cstheme="minorHAnsi"/>
+          <w:color w:val="000000" w:themeColor="text1"/>
+        </w:rPr>
+      </w:pPr>
+      <w:r>
+        <w:rPr>
+          <w:rFonts w:cstheme="minorHAnsi"/>
+          <w:color w:val="000000" w:themeColor="text1"/>
+        </w:rPr>
+        <w:t xml:space="preserve"> </w:t>
+      </w:r>
+      <w:r>
+        <w:rPr>
+          <w:rFonts w:cstheme="minorHAnsi"/>
+          <w:color w:val="000000" w:themeColor="text1"/>
+        </w:rPr>
+        <w:t xml:space="preserve">A </w:t>
+      </w:r>
+      <w:r>
+        <w:rPr>
+          <w:rFonts w:cstheme="minorHAnsi"/>
+          <w:b/>
+          <w:bCs/>
+          <w:color w:val="000000" w:themeColor="text1"/>
+        </w:rPr>
+        <w:t>monitor lock belongs to an object</w:t>
+      </w:r>
+      <w:r>
+        <w:rPr>
+          <w:rFonts w:cstheme="minorHAnsi"/>
+          <w:color w:val="000000" w:themeColor="text1"/>
+        </w:rPr>
+        <w:t>, not to the synchronized keyword itself.</w:t>
+      </w:r>
+    </w:p>
     <w:p>
       <w:pPr>
         <w:spacing w:after="0"/>
@@ -12030,7 +13135,6 @@
   <w:style w:type="character" w:default="1" w:styleId="DefaultParagraphFont">
     <w:name w:val="Default Paragraph Font"/>
     <w:uiPriority w:val="1"/>
-    <w:semiHidden/>
     <w:unhideWhenUsed/>
   </w:style>
   <w:style w:type="table" w:default="1" w:styleId="TableNormal">

</xml_diff>

<commit_message>
desingn patterns: theory updated
</commit_message>
<xml_diff>
--- a/Java/Java_notes.docx
+++ b/Java/Java_notes.docx
@@ -6654,7 +6654,440 @@
           <w:bCs/>
           <w:color w:val="000000" w:themeColor="text1"/>
         </w:rPr>
-        <w:t>Process</w:t>
+        <w:t>Process :</w:t>
+      </w:r>
+      <w:proofErr w:type="gramEnd"/>
+      <w:r>
+        <w:rPr>
+          <w:rFonts w:cstheme="minorHAnsi"/>
+          <w:b/>
+          <w:bCs/>
+          <w:color w:val="000000" w:themeColor="text1"/>
+        </w:rPr>
+        <w:t xml:space="preserve"> </w:t>
+      </w:r>
+      <w:r>
+        <w:rPr>
+          <w:rFonts w:cstheme="minorHAnsi"/>
+          <w:color w:val="000000" w:themeColor="text1"/>
+        </w:rPr>
+        <w:t xml:space="preserve">Process is an instance of program which is getting executed. </w:t>
+      </w:r>
+    </w:p>
+    <w:p>
+      <w:pPr>
+        <w:spacing w:after="0"/>
+        <w:rPr>
+          <w:rFonts w:cstheme="minorHAnsi"/>
+          <w:color w:val="000000" w:themeColor="text1"/>
+        </w:rPr>
+      </w:pPr>
+      <w:r>
+        <w:rPr>
+          <w:rFonts w:cstheme="minorHAnsi"/>
+          <w:color w:val="000000" w:themeColor="text1"/>
+        </w:rPr>
+        <w:t>C</w:t>
+      </w:r>
+      <w:r>
+        <w:rPr>
+          <w:rFonts w:cstheme="minorHAnsi"/>
+          <w:color w:val="000000" w:themeColor="text1"/>
+        </w:rPr>
+        <w:t>ompilation (</w:t>
+      </w:r>
+      <w:proofErr w:type="spellStart"/>
+      <w:r>
+        <w:rPr>
+          <w:rFonts w:cstheme="minorHAnsi"/>
+          <w:color w:val="000000" w:themeColor="text1"/>
+        </w:rPr>
+        <w:t>iavac</w:t>
+      </w:r>
+      <w:proofErr w:type="spellEnd"/>
+      <w:r>
+        <w:rPr>
+          <w:rFonts w:cstheme="minorHAnsi"/>
+          <w:color w:val="000000" w:themeColor="text1"/>
+        </w:rPr>
+        <w:t xml:space="preserve"> Test.java</w:t>
+      </w:r>
+      <w:proofErr w:type="gramStart"/>
+      <w:r>
+        <w:rPr>
+          <w:rFonts w:cstheme="minorHAnsi"/>
+          <w:color w:val="000000" w:themeColor="text1"/>
+        </w:rPr>
+        <w:t>) :</w:t>
+      </w:r>
+      <w:proofErr w:type="gramEnd"/>
+      <w:r>
+        <w:rPr>
+          <w:rFonts w:cstheme="minorHAnsi"/>
+          <w:color w:val="000000" w:themeColor="text1"/>
+        </w:rPr>
+        <w:t xml:space="preserve"> generates bytecode that can be executed by JVM.</w:t>
+      </w:r>
+      <w:r>
+        <w:rPr>
+          <w:rFonts w:cstheme="minorHAnsi"/>
+          <w:color w:val="000000" w:themeColor="text1"/>
+        </w:rPr>
+        <w:t xml:space="preserve"> </w:t>
+      </w:r>
+    </w:p>
+    <w:p>
+      <w:pPr>
+        <w:spacing w:after="0"/>
+        <w:rPr>
+          <w:rFonts w:cstheme="minorHAnsi"/>
+          <w:color w:val="000000" w:themeColor="text1"/>
+        </w:rPr>
+      </w:pPr>
+      <w:r>
+        <w:rPr>
+          <w:rFonts w:cstheme="minorHAnsi"/>
+          <w:color w:val="000000" w:themeColor="text1"/>
+        </w:rPr>
+        <w:t>Execution (java Test</w:t>
+      </w:r>
+      <w:proofErr w:type="gramStart"/>
+      <w:r>
+        <w:rPr>
+          <w:rFonts w:cstheme="minorHAnsi"/>
+          <w:color w:val="000000" w:themeColor="text1"/>
+        </w:rPr>
+        <w:t>) :</w:t>
+      </w:r>
+      <w:proofErr w:type="gramEnd"/>
+      <w:r>
+        <w:rPr>
+          <w:rFonts w:cstheme="minorHAnsi"/>
+          <w:color w:val="000000" w:themeColor="text1"/>
+        </w:rPr>
+        <w:t xml:space="preserve"> at this point, JVM starts the new Process, here Test is the class which has "public</w:t>
+      </w:r>
+      <w:r>
+        <w:rPr>
+          <w:rFonts w:cstheme="minorHAnsi"/>
+          <w:color w:val="000000" w:themeColor="text1"/>
+        </w:rPr>
+        <w:t xml:space="preserve"> </w:t>
+      </w:r>
+      <w:r>
+        <w:rPr>
+          <w:rFonts w:cstheme="minorHAnsi"/>
+          <w:color w:val="000000" w:themeColor="text1"/>
+        </w:rPr>
+        <w:t>static void</w:t>
+      </w:r>
+      <w:r>
+        <w:rPr>
+          <w:rFonts w:cstheme="minorHAnsi"/>
+          <w:color w:val="000000" w:themeColor="text1"/>
+        </w:rPr>
+        <w:t xml:space="preserve"> </w:t>
+      </w:r>
+      <w:proofErr w:type="gramStart"/>
+      <w:r>
+        <w:rPr>
+          <w:rFonts w:cstheme="minorHAnsi"/>
+          <w:color w:val="000000" w:themeColor="text1"/>
+        </w:rPr>
+        <w:t>main(</w:t>
+      </w:r>
+      <w:proofErr w:type="gramEnd"/>
+      <w:r>
+        <w:rPr>
+          <w:rFonts w:cstheme="minorHAnsi"/>
+          <w:color w:val="000000" w:themeColor="text1"/>
+        </w:rPr>
+        <w:t xml:space="preserve">String </w:t>
+      </w:r>
+      <w:proofErr w:type="spellStart"/>
+      <w:r>
+        <w:rPr>
+          <w:rFonts w:cstheme="minorHAnsi"/>
+          <w:color w:val="000000" w:themeColor="text1"/>
+        </w:rPr>
+        <w:t>args</w:t>
+      </w:r>
+      <w:proofErr w:type="spellEnd"/>
+      <w:r>
+        <w:rPr>
+          <w:rFonts w:cstheme="minorHAnsi"/>
+          <w:color w:val="000000" w:themeColor="text1"/>
+        </w:rPr>
+        <w:t>)”</w:t>
+      </w:r>
+      <w:r>
+        <w:rPr>
+          <w:rFonts w:cstheme="minorHAnsi"/>
+          <w:color w:val="000000" w:themeColor="text1"/>
+        </w:rPr>
+        <w:t xml:space="preserve"> method.</w:t>
+      </w:r>
+    </w:p>
+    <w:p>
+      <w:pPr>
+        <w:spacing w:after="0"/>
+        <w:rPr>
+          <w:rFonts w:cstheme="minorHAnsi"/>
+          <w:color w:val="000000" w:themeColor="text1"/>
+        </w:rPr>
+      </w:pPr>
+      <w:proofErr w:type="gramStart"/>
+      <w:r>
+        <w:rPr>
+          <w:rFonts w:cstheme="minorHAnsi"/>
+          <w:b/>
+          <w:bCs/>
+          <w:color w:val="000000" w:themeColor="text1"/>
+        </w:rPr>
+        <w:t>Thread :</w:t>
+      </w:r>
+      <w:proofErr w:type="gramEnd"/>
+      <w:r>
+        <w:rPr>
+          <w:rFonts w:cstheme="minorHAnsi"/>
+          <w:b/>
+          <w:bCs/>
+          <w:color w:val="000000" w:themeColor="text1"/>
+        </w:rPr>
+        <w:t xml:space="preserve"> </w:t>
+      </w:r>
+      <w:r>
+        <w:rPr>
+          <w:rFonts w:cstheme="minorHAnsi"/>
+          <w:color w:val="000000" w:themeColor="text1"/>
+        </w:rPr>
+        <w:t>S</w:t>
+      </w:r>
+      <w:r>
+        <w:rPr>
+          <w:rFonts w:cstheme="minorHAnsi"/>
+          <w:color w:val="000000" w:themeColor="text1"/>
+        </w:rPr>
+        <w:t>mallest sequence of instructions that are executed by CPU independently.</w:t>
+      </w:r>
+    </w:p>
+    <w:p>
+      <w:pPr>
+        <w:spacing w:after="0"/>
+        <w:rPr>
+          <w:rFonts w:cstheme="minorHAnsi"/>
+          <w:color w:val="000000" w:themeColor="text1"/>
+        </w:rPr>
+      </w:pPr>
+    </w:p>
+    <w:p>
+      <w:pPr>
+        <w:spacing w:after="0"/>
+        <w:rPr>
+          <w:rFonts w:cstheme="minorHAnsi"/>
+          <w:color w:val="000000" w:themeColor="text1"/>
+        </w:rPr>
+      </w:pPr>
+      <w:r>
+        <w:rPr>
+          <w:rFonts w:cstheme="minorHAnsi"/>
+          <w:b/>
+          <w:bCs/>
+          <w:color w:val="000000" w:themeColor="text1"/>
+        </w:rPr>
+        <w:t>Multitasking</w:t>
+      </w:r>
+      <w:r>
+        <w:rPr>
+          <w:rFonts w:cstheme="minorHAnsi"/>
+          <w:color w:val="000000" w:themeColor="text1"/>
+        </w:rPr>
+        <w:t xml:space="preserve"> is the execution of multiple independent tasks, typically managed by the operating system</w:t>
+      </w:r>
+      <w:r>
+        <w:rPr>
+          <w:rFonts w:cstheme="minorHAnsi"/>
+          <w:color w:val="000000" w:themeColor="text1"/>
+        </w:rPr>
+        <w:t>.</w:t>
+      </w:r>
+    </w:p>
+    <w:p>
+      <w:pPr>
+        <w:spacing w:after="0"/>
+        <w:rPr>
+          <w:rFonts w:cstheme="minorHAnsi"/>
+          <w:color w:val="000000" w:themeColor="text1"/>
+        </w:rPr>
+      </w:pPr>
+      <w:r>
+        <w:rPr>
+          <w:rFonts w:cstheme="minorHAnsi"/>
+          <w:b/>
+          <w:bCs/>
+          <w:color w:val="000000" w:themeColor="text1"/>
+        </w:rPr>
+        <w:t>Multithreading</w:t>
+      </w:r>
+      <w:r>
+        <w:rPr>
+          <w:rFonts w:cstheme="minorHAnsi"/>
+          <w:color w:val="000000" w:themeColor="text1"/>
+        </w:rPr>
+        <w:t xml:space="preserve"> is the execution of multiple threads within the same process, where threads share the process's resources.</w:t>
+      </w:r>
+    </w:p>
+    <w:p>
+      <w:pPr>
+        <w:spacing w:after="0"/>
+        <w:rPr>
+          <w:rFonts w:cstheme="minorHAnsi"/>
+          <w:color w:val="000000" w:themeColor="text1"/>
+        </w:rPr>
+      </w:pPr>
+    </w:p>
+    <w:p>
+      <w:pPr>
+        <w:spacing w:after="0"/>
+        <w:rPr>
+          <w:rFonts w:cstheme="minorHAnsi"/>
+          <w:b/>
+          <w:bCs/>
+          <w:color w:val="000000" w:themeColor="text1"/>
+        </w:rPr>
+      </w:pPr>
+      <w:r>
+        <w:rPr>
+          <w:rFonts w:cstheme="minorHAnsi"/>
+          <w:b/>
+          <w:bCs/>
+          <w:color w:val="000000" w:themeColor="text1"/>
+        </w:rPr>
+        <w:t>Thread creation, thread lifecycle, inter thread communication</w:t>
+      </w:r>
+    </w:p>
+    <w:p>
+      <w:pPr>
+        <w:spacing w:after="0"/>
+        <w:rPr>
+          <w:rFonts w:cstheme="minorHAnsi"/>
+          <w:color w:val="000000" w:themeColor="text1"/>
+        </w:rPr>
+      </w:pPr>
+      <w:r>
+        <w:rPr>
+          <w:rFonts w:cstheme="minorHAnsi"/>
+          <w:color w:val="000000" w:themeColor="text1"/>
+        </w:rPr>
+        <w:t xml:space="preserve">Thread can be created using </w:t>
+      </w:r>
+      <w:r>
+        <w:rPr>
+          <w:rFonts w:cstheme="minorHAnsi"/>
+          <w:b/>
+          <w:bCs/>
+          <w:color w:val="000000" w:themeColor="text1"/>
+        </w:rPr>
+        <w:t>extends Thread</w:t>
+      </w:r>
+      <w:r>
+        <w:rPr>
+          <w:rFonts w:cstheme="minorHAnsi"/>
+          <w:color w:val="000000" w:themeColor="text1"/>
+        </w:rPr>
+        <w:t xml:space="preserve"> </w:t>
+      </w:r>
+      <w:r>
+        <w:rPr>
+          <w:rFonts w:cstheme="minorHAnsi"/>
+          <w:color w:val="000000" w:themeColor="text1"/>
+        </w:rPr>
+        <w:t xml:space="preserve">class </w:t>
+      </w:r>
+      <w:r>
+        <w:rPr>
+          <w:rFonts w:cstheme="minorHAnsi"/>
+          <w:color w:val="000000" w:themeColor="text1"/>
+        </w:rPr>
+        <w:t xml:space="preserve">or using </w:t>
+      </w:r>
+      <w:r>
+        <w:rPr>
+          <w:rFonts w:cstheme="minorHAnsi"/>
+          <w:b/>
+          <w:bCs/>
+          <w:color w:val="000000" w:themeColor="text1"/>
+        </w:rPr>
+        <w:t>implements</w:t>
+      </w:r>
+      <w:r>
+        <w:rPr>
+          <w:rFonts w:cstheme="minorHAnsi"/>
+          <w:color w:val="000000" w:themeColor="text1"/>
+        </w:rPr>
+        <w:t xml:space="preserve"> </w:t>
+      </w:r>
+      <w:r>
+        <w:rPr>
+          <w:rFonts w:cstheme="minorHAnsi"/>
+          <w:b/>
+          <w:bCs/>
+          <w:color w:val="000000" w:themeColor="text1"/>
+        </w:rPr>
+        <w:t>Runnable</w:t>
+      </w:r>
+      <w:r>
+        <w:rPr>
+          <w:rFonts w:cstheme="minorHAnsi"/>
+          <w:b/>
+          <w:bCs/>
+          <w:color w:val="000000" w:themeColor="text1"/>
+        </w:rPr>
+        <w:t xml:space="preserve"> </w:t>
+      </w:r>
+      <w:r>
+        <w:rPr>
+          <w:rFonts w:cstheme="minorHAnsi"/>
+          <w:color w:val="000000" w:themeColor="text1"/>
+        </w:rPr>
+        <w:t>interface</w:t>
+      </w:r>
+      <w:r>
+        <w:rPr>
+          <w:rFonts w:cstheme="minorHAnsi"/>
+          <w:color w:val="000000" w:themeColor="text1"/>
+        </w:rPr>
+        <w:t>.</w:t>
+      </w:r>
+    </w:p>
+    <w:p>
+      <w:pPr>
+        <w:spacing w:after="0"/>
+        <w:rPr>
+          <w:rFonts w:cstheme="minorHAnsi"/>
+          <w:b/>
+          <w:bCs/>
+          <w:color w:val="000000" w:themeColor="text1"/>
+        </w:rPr>
+      </w:pPr>
+      <w:r>
+        <w:rPr>
+          <w:rFonts w:cstheme="minorHAnsi"/>
+          <w:b/>
+          <w:bCs/>
+          <w:color w:val="000000" w:themeColor="text1"/>
+        </w:rPr>
+        <w:t xml:space="preserve">thread </w:t>
+      </w:r>
+      <w:proofErr w:type="gramStart"/>
+      <w:r>
+        <w:rPr>
+          <w:rFonts w:cstheme="minorHAnsi"/>
+          <w:b/>
+          <w:bCs/>
+          <w:color w:val="000000" w:themeColor="text1"/>
+        </w:rPr>
+        <w:t>lifecycle</w:t>
       </w:r>
       <w:r>
         <w:rPr>
@@ -6675,35 +7108,21 @@
         </w:rPr>
         <w:t xml:space="preserve"> </w:t>
       </w:r>
-      <w:r>
-        <w:rPr>
-          <w:rFonts w:cstheme="minorHAnsi"/>
-          <w:color w:val="000000" w:themeColor="text1"/>
-        </w:rPr>
-        <w:t xml:space="preserve">Process is an instance of program which is getting executed. </w:t>
-      </w:r>
-    </w:p>
-    <w:p>
-      <w:pPr>
-        <w:spacing w:after="0"/>
-        <w:rPr>
-          <w:rFonts w:cstheme="minorHAnsi"/>
-          <w:color w:val="000000" w:themeColor="text1"/>
-        </w:rPr>
-      </w:pPr>
-      <w:r>
-        <w:rPr>
-          <w:rFonts w:cstheme="minorHAnsi"/>
-          <w:color w:val="000000" w:themeColor="text1"/>
-        </w:rPr>
-        <w:t>C</w:t>
-      </w:r>
-      <w:r>
-        <w:rPr>
-          <w:rFonts w:cstheme="minorHAnsi"/>
-          <w:color w:val="000000" w:themeColor="text1"/>
-        </w:rPr>
-        <w:t>ompilation (</w:t>
+    </w:p>
+    <w:p>
+      <w:pPr>
+        <w:spacing w:after="0"/>
+        <w:rPr>
+          <w:rFonts w:cstheme="minorHAnsi"/>
+          <w:color w:val="000000" w:themeColor="text1"/>
+        </w:rPr>
+      </w:pPr>
+      <w:r>
+        <w:rPr>
+          <w:rFonts w:cstheme="minorHAnsi"/>
+          <w:color w:val="000000" w:themeColor="text1"/>
+        </w:rPr>
+        <w:t xml:space="preserve">The official Java </w:t>
       </w:r>
       <w:proofErr w:type="spellStart"/>
       <w:r>
@@ -6711,7 +7130,7 @@
           <w:rFonts w:cstheme="minorHAnsi"/>
           <w:color w:val="000000" w:themeColor="text1"/>
         </w:rPr>
-        <w:t>iavac</w:t>
+        <w:t>Thread.State</w:t>
       </w:r>
       <w:proofErr w:type="spellEnd"/>
       <w:r>
@@ -6719,7 +7138,435 @@
           <w:rFonts w:cstheme="minorHAnsi"/>
           <w:color w:val="000000" w:themeColor="text1"/>
         </w:rPr>
-        <w:t xml:space="preserve"> Test.java</w:t>
+        <w:t xml:space="preserve"> has </w:t>
+      </w:r>
+      <w:r>
+        <w:rPr>
+          <w:rFonts w:cstheme="minorHAnsi"/>
+          <w:b/>
+          <w:bCs/>
+          <w:color w:val="000000" w:themeColor="text1"/>
+        </w:rPr>
+        <w:t>6 states</w:t>
+      </w:r>
+      <w:r>
+        <w:rPr>
+          <w:rFonts w:cstheme="minorHAnsi"/>
+          <w:color w:val="000000" w:themeColor="text1"/>
+        </w:rPr>
+        <w:t>:</w:t>
+      </w:r>
+    </w:p>
+    <w:p>
+      <w:pPr>
+        <w:spacing w:after="0"/>
+        <w:rPr>
+          <w:rFonts w:ascii="Consolas" w:hAnsi="Consolas" w:cstheme="minorHAnsi"/>
+          <w:color w:val="000000" w:themeColor="text1"/>
+          <w:sz w:val="16"/>
+          <w:szCs w:val="16"/>
+        </w:rPr>
+      </w:pPr>
+      <w:r>
+        <w:rPr>
+          <w:rFonts w:ascii="Consolas" w:hAnsi="Consolas" w:cstheme="minorHAnsi"/>
+          <w:b/>
+          <w:bCs/>
+          <w:color w:val="000000" w:themeColor="text1"/>
+          <w:sz w:val="16"/>
+          <w:szCs w:val="16"/>
+        </w:rPr>
+        <w:t>NEW</w:t>
+      </w:r>
+      <w:r>
+        <w:rPr>
+          <w:rFonts w:ascii="Consolas" w:hAnsi="Consolas" w:cstheme="minorHAnsi"/>
+          <w:color w:val="000000" w:themeColor="text1"/>
+          <w:sz w:val="16"/>
+          <w:szCs w:val="16"/>
+        </w:rPr>
+        <w:t xml:space="preserve"> </w:t>
+      </w:r>
+      <w:r>
+        <w:rPr>
+          <w:rFonts w:ascii="Consolas" w:hAnsi="Consolas" w:cstheme="minorHAnsi"/>
+          <w:color w:val="000000" w:themeColor="text1"/>
+          <w:sz w:val="16"/>
+          <w:szCs w:val="16"/>
+        </w:rPr>
+        <w:t>-&gt;</w:t>
+      </w:r>
+      <w:r>
+        <w:rPr>
+          <w:rFonts w:ascii="Consolas" w:hAnsi="Consolas" w:cstheme="minorHAnsi"/>
+          <w:color w:val="000000" w:themeColor="text1"/>
+          <w:sz w:val="16"/>
+          <w:szCs w:val="16"/>
+        </w:rPr>
+        <w:t xml:space="preserve"> </w:t>
+      </w:r>
+      <w:r>
+        <w:rPr>
+          <w:rFonts w:ascii="Consolas" w:hAnsi="Consolas" w:cstheme="minorHAnsi"/>
+          <w:b/>
+          <w:bCs/>
+          <w:color w:val="000000" w:themeColor="text1"/>
+          <w:sz w:val="16"/>
+          <w:szCs w:val="16"/>
+        </w:rPr>
+        <w:t>RUNNABLE</w:t>
+      </w:r>
+      <w:r>
+        <w:rPr>
+          <w:rFonts w:ascii="Consolas" w:hAnsi="Consolas" w:cstheme="minorHAnsi"/>
+          <w:color w:val="000000" w:themeColor="text1"/>
+          <w:sz w:val="16"/>
+          <w:szCs w:val="16"/>
+        </w:rPr>
+        <w:t xml:space="preserve"> </w:t>
+      </w:r>
+      <w:r>
+        <w:rPr>
+          <w:rFonts w:ascii="Consolas" w:hAnsi="Consolas" w:cstheme="minorHAnsi"/>
+          <w:color w:val="000000" w:themeColor="text1"/>
+          <w:sz w:val="16"/>
+          <w:szCs w:val="16"/>
+        </w:rPr>
+        <w:t>-&gt;</w:t>
+      </w:r>
+      <w:r>
+        <w:rPr>
+          <w:rFonts w:ascii="Consolas" w:hAnsi="Consolas" w:cstheme="minorHAnsi"/>
+          <w:color w:val="000000" w:themeColor="text1"/>
+          <w:sz w:val="16"/>
+          <w:szCs w:val="16"/>
+        </w:rPr>
+        <w:t xml:space="preserve"> RUNNING* </w:t>
+      </w:r>
+      <w:r>
+        <w:rPr>
+          <w:rFonts w:ascii="Consolas" w:hAnsi="Consolas" w:cstheme="minorHAnsi"/>
+          <w:color w:val="000000" w:themeColor="text1"/>
+          <w:sz w:val="16"/>
+          <w:szCs w:val="16"/>
+        </w:rPr>
+        <w:t>-&gt;</w:t>
+      </w:r>
+      <w:r>
+        <w:rPr>
+          <w:rFonts w:ascii="Consolas" w:hAnsi="Consolas" w:cstheme="minorHAnsi"/>
+          <w:color w:val="000000" w:themeColor="text1"/>
+          <w:sz w:val="16"/>
+          <w:szCs w:val="16"/>
+        </w:rPr>
+        <w:t xml:space="preserve"> </w:t>
+      </w:r>
+      <w:r>
+        <w:rPr>
+          <w:rFonts w:ascii="Consolas" w:hAnsi="Consolas" w:cstheme="minorHAnsi"/>
+          <w:b/>
+          <w:bCs/>
+          <w:color w:val="000000" w:themeColor="text1"/>
+          <w:sz w:val="16"/>
+          <w:szCs w:val="16"/>
+        </w:rPr>
+        <w:t>TERMINATED</w:t>
+      </w:r>
+    </w:p>
+    <w:p>
+      <w:pPr>
+        <w:spacing w:after="0"/>
+        <w:rPr>
+          <w:rFonts w:ascii="Consolas" w:hAnsi="Consolas" w:cstheme="minorHAnsi"/>
+          <w:color w:val="000000" w:themeColor="text1"/>
+          <w:sz w:val="16"/>
+          <w:szCs w:val="16"/>
+        </w:rPr>
+      </w:pPr>
+    </w:p>
+    <w:p>
+      <w:pPr>
+        <w:spacing w:after="0"/>
+        <w:rPr>
+          <w:rFonts w:ascii="Consolas" w:hAnsi="Consolas" w:cstheme="minorHAnsi"/>
+          <w:color w:val="000000" w:themeColor="text1"/>
+          <w:sz w:val="16"/>
+          <w:szCs w:val="16"/>
+        </w:rPr>
+      </w:pPr>
+      <w:r>
+        <w:rPr>
+          <w:rFonts w:ascii="Consolas" w:hAnsi="Consolas" w:cstheme="minorHAnsi"/>
+          <w:color w:val="000000" w:themeColor="text1"/>
+          <w:sz w:val="16"/>
+          <w:szCs w:val="16"/>
+        </w:rPr>
+        <w:t>And while runnable, it can temporarily enter:</w:t>
+      </w:r>
+    </w:p>
+    <w:p>
+      <w:pPr>
+        <w:spacing w:after="0"/>
+        <w:rPr>
+          <w:rFonts w:ascii="Consolas" w:hAnsi="Consolas" w:cstheme="minorHAnsi"/>
+          <w:b/>
+          <w:bCs/>
+          <w:color w:val="000000" w:themeColor="text1"/>
+          <w:sz w:val="16"/>
+          <w:szCs w:val="16"/>
+        </w:rPr>
+      </w:pPr>
+      <w:r>
+        <w:rPr>
+          <w:rFonts w:ascii="Consolas" w:hAnsi="Consolas" w:cstheme="minorHAnsi"/>
+          <w:b/>
+          <w:bCs/>
+          <w:color w:val="000000" w:themeColor="text1"/>
+          <w:sz w:val="16"/>
+          <w:szCs w:val="16"/>
+        </w:rPr>
+        <w:t>WAITING</w:t>
+      </w:r>
+      <w:r>
+        <w:rPr>
+          <w:rFonts w:ascii="Consolas" w:hAnsi="Consolas" w:cstheme="minorHAnsi"/>
+          <w:color w:val="000000" w:themeColor="text1"/>
+          <w:sz w:val="16"/>
+          <w:szCs w:val="16"/>
+        </w:rPr>
+        <w:t>,</w:t>
+      </w:r>
+      <w:r>
+        <w:rPr>
+          <w:rFonts w:ascii="Consolas" w:hAnsi="Consolas" w:cstheme="minorHAnsi"/>
+          <w:color w:val="000000" w:themeColor="text1"/>
+          <w:sz w:val="16"/>
+          <w:szCs w:val="16"/>
+        </w:rPr>
+        <w:t xml:space="preserve"> </w:t>
+      </w:r>
+      <w:r>
+        <w:rPr>
+          <w:rFonts w:ascii="Consolas" w:hAnsi="Consolas" w:cstheme="minorHAnsi"/>
+          <w:b/>
+          <w:bCs/>
+          <w:color w:val="000000" w:themeColor="text1"/>
+          <w:sz w:val="16"/>
+          <w:szCs w:val="16"/>
+        </w:rPr>
+        <w:t>TIMED_WAITING</w:t>
+      </w:r>
+      <w:r>
+        <w:rPr>
+          <w:rFonts w:ascii="Consolas" w:hAnsi="Consolas" w:cstheme="minorHAnsi"/>
+          <w:color w:val="000000" w:themeColor="text1"/>
+          <w:sz w:val="16"/>
+          <w:szCs w:val="16"/>
+        </w:rPr>
+        <w:t>,</w:t>
+      </w:r>
+      <w:r>
+        <w:rPr>
+          <w:rFonts w:ascii="Consolas" w:hAnsi="Consolas" w:cstheme="minorHAnsi"/>
+          <w:color w:val="000000" w:themeColor="text1"/>
+          <w:sz w:val="16"/>
+          <w:szCs w:val="16"/>
+        </w:rPr>
+        <w:t xml:space="preserve"> </w:t>
+      </w:r>
+      <w:r>
+        <w:rPr>
+          <w:rFonts w:ascii="Consolas" w:hAnsi="Consolas" w:cstheme="minorHAnsi"/>
+          <w:b/>
+          <w:bCs/>
+          <w:color w:val="000000" w:themeColor="text1"/>
+          <w:sz w:val="16"/>
+          <w:szCs w:val="16"/>
+        </w:rPr>
+        <w:t>BLOCKED</w:t>
+      </w:r>
+    </w:p>
+    <w:p>
+      <w:pPr>
+        <w:spacing w:after="0"/>
+        <w:rPr>
+          <w:rFonts w:ascii="Consolas" w:hAnsi="Consolas" w:cstheme="minorHAnsi"/>
+          <w:b/>
+          <w:bCs/>
+          <w:color w:val="000000" w:themeColor="text1"/>
+          <w:sz w:val="16"/>
+          <w:szCs w:val="16"/>
+        </w:rPr>
+      </w:pPr>
+    </w:p>
+    <w:p>
+      <w:pPr>
+        <w:spacing w:after="0"/>
+        <w:rPr>
+          <w:rFonts w:ascii="Consolas" w:hAnsi="Consolas" w:cstheme="minorHAnsi"/>
+          <w:color w:val="000000" w:themeColor="text1"/>
+          <w:sz w:val="16"/>
+          <w:szCs w:val="16"/>
+        </w:rPr>
+      </w:pPr>
+      <w:r>
+        <w:rPr>
+          <w:rFonts w:ascii="Consolas" w:hAnsi="Consolas" w:cstheme="minorHAnsi"/>
+          <w:color w:val="000000" w:themeColor="text1"/>
+          <w:sz w:val="16"/>
+          <w:szCs w:val="16"/>
+        </w:rPr>
+        <w:t xml:space="preserve">             ┌── BLOCKED ───────┐</w:t>
+      </w:r>
+    </w:p>
+    <w:p>
+      <w:pPr>
+        <w:spacing w:after="0"/>
+        <w:rPr>
+          <w:rFonts w:ascii="Consolas" w:hAnsi="Consolas" w:cstheme="minorHAnsi"/>
+          <w:color w:val="000000" w:themeColor="text1"/>
+          <w:sz w:val="16"/>
+          <w:szCs w:val="16"/>
+        </w:rPr>
+      </w:pPr>
+      <w:r>
+        <w:rPr>
+          <w:rFonts w:ascii="Consolas" w:hAnsi="Consolas" w:cstheme="minorHAnsi"/>
+          <w:color w:val="000000" w:themeColor="text1"/>
+          <w:sz w:val="16"/>
+          <w:szCs w:val="16"/>
+        </w:rPr>
+        <w:t xml:space="preserve">             │                  ↓</w:t>
+      </w:r>
+    </w:p>
+    <w:p>
+      <w:pPr>
+        <w:spacing w:after="0"/>
+        <w:rPr>
+          <w:rFonts w:ascii="Consolas" w:hAnsi="Consolas" w:cstheme="minorHAnsi"/>
+          <w:color w:val="000000" w:themeColor="text1"/>
+          <w:sz w:val="16"/>
+          <w:szCs w:val="16"/>
+        </w:rPr>
+      </w:pPr>
+      <w:r>
+        <w:rPr>
+          <w:rFonts w:ascii="Consolas" w:hAnsi="Consolas" w:cstheme="minorHAnsi"/>
+          <w:color w:val="000000" w:themeColor="text1"/>
+          <w:sz w:val="16"/>
+          <w:szCs w:val="16"/>
+        </w:rPr>
+        <w:t>NEW → RUNNABLE ← WAITING        │──</w:t>
+      </w:r>
+      <w:r>
+        <w:rPr>
+          <w:rFonts w:ascii="Consolas" w:hAnsi="Consolas" w:cstheme="minorHAnsi"/>
+          <w:color w:val="000000" w:themeColor="text1"/>
+          <w:sz w:val="16"/>
+          <w:szCs w:val="16"/>
+        </w:rPr>
+        <w:t xml:space="preserve">&gt; </w:t>
+      </w:r>
+      <w:r>
+        <w:rPr>
+          <w:rFonts w:ascii="Consolas" w:hAnsi="Consolas" w:cstheme="minorHAnsi"/>
+          <w:color w:val="000000" w:themeColor="text1"/>
+          <w:sz w:val="16"/>
+          <w:szCs w:val="16"/>
+        </w:rPr>
+        <w:t>TERMINATED</w:t>
+      </w:r>
+    </w:p>
+    <w:p>
+      <w:pPr>
+        <w:spacing w:after="0"/>
+        <w:rPr>
+          <w:rFonts w:ascii="Consolas" w:hAnsi="Consolas" w:cstheme="minorHAnsi"/>
+          <w:color w:val="000000" w:themeColor="text1"/>
+          <w:sz w:val="16"/>
+          <w:szCs w:val="16"/>
+        </w:rPr>
+      </w:pPr>
+      <w:r>
+        <w:rPr>
+          <w:rFonts w:ascii="Consolas" w:hAnsi="Consolas" w:cstheme="minorHAnsi"/>
+          <w:color w:val="000000" w:themeColor="text1"/>
+          <w:sz w:val="16"/>
+          <w:szCs w:val="16"/>
+        </w:rPr>
+        <w:t xml:space="preserve">             ↑                  │</w:t>
+      </w:r>
+    </w:p>
+    <w:p>
+      <w:pPr>
+        <w:spacing w:after="0"/>
+        <w:rPr>
+          <w:rFonts w:ascii="Consolas" w:hAnsi="Consolas" w:cstheme="minorHAnsi"/>
+          <w:color w:val="000000" w:themeColor="text1"/>
+          <w:sz w:val="16"/>
+          <w:szCs w:val="16"/>
+        </w:rPr>
+      </w:pPr>
+      <w:r>
+        <w:rPr>
+          <w:rFonts w:ascii="Consolas" w:hAnsi="Consolas" w:cstheme="minorHAnsi"/>
+          <w:color w:val="000000" w:themeColor="text1"/>
+          <w:sz w:val="16"/>
+          <w:szCs w:val="16"/>
+        </w:rPr>
+        <w:t xml:space="preserve">             └ TIMED_WAITING ───┘    </w:t>
+      </w:r>
+    </w:p>
+    <w:p>
+      <w:pPr>
+        <w:spacing w:after="0"/>
+        <w:rPr>
+          <w:rFonts w:ascii="Consolas" w:hAnsi="Consolas" w:cstheme="minorHAnsi"/>
+          <w:color w:val="000000" w:themeColor="text1"/>
+          <w:sz w:val="16"/>
+          <w:szCs w:val="16"/>
+        </w:rPr>
+      </w:pPr>
+    </w:p>
+    <w:p>
+      <w:pPr>
+        <w:spacing w:after="0"/>
+        <w:rPr>
+          <w:rFonts w:cstheme="minorHAnsi"/>
+          <w:color w:val="000000" w:themeColor="text1"/>
+        </w:rPr>
+      </w:pPr>
+      <w:r>
+        <w:rPr>
+          <w:rFonts w:cstheme="minorHAnsi"/>
+          <w:b/>
+          <w:bCs/>
+          <w:color w:val="000000" w:themeColor="text1"/>
+        </w:rPr>
+        <w:t>Thread communication</w:t>
+      </w:r>
+      <w:r>
+        <w:rPr>
+          <w:rFonts w:cstheme="minorHAnsi"/>
+          <w:color w:val="000000" w:themeColor="text1"/>
+        </w:rPr>
+        <w:t xml:space="preserve">: </w:t>
+      </w:r>
+    </w:p>
+    <w:p>
+      <w:pPr>
+        <w:spacing w:after="0"/>
+        <w:rPr>
+          <w:rFonts w:cstheme="minorHAnsi"/>
+          <w:color w:val="000000" w:themeColor="text1"/>
+        </w:rPr>
+      </w:pPr>
+      <w:r>
+        <w:rPr>
+          <w:rFonts w:cstheme="minorHAnsi"/>
+          <w:color w:val="000000" w:themeColor="text1"/>
+        </w:rPr>
+        <w:t xml:space="preserve">Monitor </w:t>
       </w:r>
       <w:proofErr w:type="gramStart"/>
       <w:r>
@@ -6727,7 +7574,7 @@
           <w:rFonts w:cstheme="minorHAnsi"/>
           <w:color w:val="000000" w:themeColor="text1"/>
         </w:rPr>
-        <w:t>) :</w:t>
+        <w:t>Lock :</w:t>
       </w:r>
       <w:proofErr w:type="gramEnd"/>
       <w:r>
@@ -6735,75 +7582,154 @@
           <w:rFonts w:cstheme="minorHAnsi"/>
           <w:color w:val="000000" w:themeColor="text1"/>
         </w:rPr>
-        <w:t xml:space="preserve"> generates bytecode that can be executed by JVM.</w:t>
-      </w:r>
-      <w:r>
-        <w:rPr>
-          <w:rFonts w:cstheme="minorHAnsi"/>
-          <w:color w:val="000000" w:themeColor="text1"/>
-        </w:rPr>
         <w:t xml:space="preserve"> </w:t>
       </w:r>
-    </w:p>
-    <w:p>
-      <w:pPr>
-        <w:spacing w:after="0"/>
-        <w:rPr>
-          <w:rFonts w:cstheme="minorHAnsi"/>
-          <w:color w:val="000000" w:themeColor="text1"/>
-        </w:rPr>
-      </w:pPr>
-      <w:r>
-        <w:rPr>
-          <w:rFonts w:cstheme="minorHAnsi"/>
-          <w:color w:val="000000" w:themeColor="text1"/>
-        </w:rPr>
-        <w:t>Execution (java Test</w:t>
-      </w:r>
+      <w:r>
+        <w:rPr>
+          <w:rFonts w:cstheme="minorHAnsi"/>
+          <w:color w:val="000000" w:themeColor="text1"/>
+        </w:rPr>
+        <w:t xml:space="preserve">A </w:t>
+      </w:r>
+      <w:r>
+        <w:rPr>
+          <w:rFonts w:cstheme="minorHAnsi"/>
+          <w:b/>
+          <w:bCs/>
+          <w:color w:val="000000" w:themeColor="text1"/>
+        </w:rPr>
+        <w:t>monitor lock</w:t>
+      </w:r>
+      <w:r>
+        <w:rPr>
+          <w:rFonts w:cstheme="minorHAnsi"/>
+          <w:color w:val="000000" w:themeColor="text1"/>
+        </w:rPr>
+        <w:t xml:space="preserve"> is Java's built-in mechanism for ensuring that </w:t>
+      </w:r>
+      <w:r>
+        <w:rPr>
+          <w:rFonts w:cstheme="minorHAnsi"/>
+          <w:color w:val="000000" w:themeColor="text1"/>
+        </w:rPr>
+        <w:t xml:space="preserve">only one thread at a time can execute a </w:t>
+      </w:r>
+      <w:r>
+        <w:rPr>
+          <w:rFonts w:cstheme="minorHAnsi"/>
+          <w:b/>
+          <w:bCs/>
+          <w:color w:val="000000" w:themeColor="text1"/>
+        </w:rPr>
+        <w:t>synchronized section</w:t>
+      </w:r>
+      <w:r>
+        <w:rPr>
+          <w:rFonts w:cstheme="minorHAnsi"/>
+          <w:color w:val="000000" w:themeColor="text1"/>
+        </w:rPr>
+        <w:t xml:space="preserve"> for a particular object.</w:t>
+      </w:r>
+    </w:p>
+    <w:p>
+      <w:pPr>
+        <w:spacing w:after="0"/>
+        <w:rPr>
+          <w:rFonts w:cstheme="minorHAnsi"/>
+          <w:color w:val="000000" w:themeColor="text1"/>
+        </w:rPr>
+      </w:pPr>
+      <w:r>
+        <w:rPr>
+          <w:rFonts w:cstheme="minorHAnsi"/>
+          <w:color w:val="000000" w:themeColor="text1"/>
+        </w:rPr>
+        <w:t xml:space="preserve"> </w:t>
+      </w:r>
+      <w:r>
+        <w:rPr>
+          <w:rFonts w:cstheme="minorHAnsi"/>
+          <w:color w:val="000000" w:themeColor="text1"/>
+        </w:rPr>
+        <w:t xml:space="preserve">A </w:t>
+      </w:r>
+      <w:r>
+        <w:rPr>
+          <w:rFonts w:cstheme="minorHAnsi"/>
+          <w:b/>
+          <w:bCs/>
+          <w:color w:val="000000" w:themeColor="text1"/>
+        </w:rPr>
+        <w:t>monitor lock belongs to an object</w:t>
+      </w:r>
+      <w:r>
+        <w:rPr>
+          <w:rFonts w:cstheme="minorHAnsi"/>
+          <w:color w:val="000000" w:themeColor="text1"/>
+        </w:rPr>
+        <w:t>, not to the synchronized keyword itself.</w:t>
+      </w:r>
+    </w:p>
+    <w:p>
+      <w:pPr>
+        <w:spacing w:after="0"/>
+        <w:rPr>
+          <w:rFonts w:cstheme="minorHAnsi"/>
+          <w:color w:val="000000" w:themeColor="text1"/>
+        </w:rPr>
+      </w:pPr>
+    </w:p>
+    <w:p>
+      <w:pPr>
+        <w:spacing w:after="0"/>
+        <w:rPr>
+          <w:rFonts w:cstheme="minorHAnsi"/>
+          <w:color w:val="000000" w:themeColor="text1"/>
+        </w:rPr>
+      </w:pPr>
       <w:proofErr w:type="gramStart"/>
       <w:r>
         <w:rPr>
           <w:rFonts w:cstheme="minorHAnsi"/>
-          <w:color w:val="000000" w:themeColor="text1"/>
-        </w:rPr>
-        <w:t>) :</w:t>
+          <w:b/>
+          <w:bCs/>
+          <w:color w:val="000000" w:themeColor="text1"/>
+        </w:rPr>
+        <w:t>wait(</w:t>
       </w:r>
       <w:proofErr w:type="gramEnd"/>
       <w:r>
         <w:rPr>
           <w:rFonts w:cstheme="minorHAnsi"/>
-          <w:color w:val="000000" w:themeColor="text1"/>
-        </w:rPr>
-        <w:t xml:space="preserve"> at this point, JVM starts the new Process, here Test is the class which has "public</w:t>
-      </w:r>
-      <w:r>
-        <w:rPr>
-          <w:rFonts w:cstheme="minorHAnsi"/>
-          <w:color w:val="000000" w:themeColor="text1"/>
-        </w:rPr>
-        <w:t xml:space="preserve"> </w:t>
-      </w:r>
-      <w:r>
-        <w:rPr>
-          <w:rFonts w:cstheme="minorHAnsi"/>
-          <w:color w:val="000000" w:themeColor="text1"/>
-        </w:rPr>
-        <w:t>static void</w:t>
-      </w:r>
-      <w:r>
-        <w:rPr>
-          <w:rFonts w:cstheme="minorHAnsi"/>
-          <w:color w:val="000000" w:themeColor="text1"/>
-        </w:rPr>
-        <w:t xml:space="preserve"> </w:t>
-      </w:r>
+          <w:b/>
+          <w:bCs/>
+          <w:color w:val="000000" w:themeColor="text1"/>
+        </w:rPr>
+        <w:t>)</w:t>
+      </w:r>
+      <w:r>
+        <w:rPr>
+          <w:rFonts w:cstheme="minorHAnsi"/>
+          <w:color w:val="000000" w:themeColor="text1"/>
+        </w:rPr>
+        <w:t xml:space="preserve"> releases the object's monitor lock and puts the current thread into the WAITING state until it is notified (notify()/</w:t>
+      </w:r>
+      <w:proofErr w:type="spellStart"/>
       <w:proofErr w:type="gramStart"/>
       <w:r>
         <w:rPr>
           <w:rFonts w:cstheme="minorHAnsi"/>
           <w:color w:val="000000" w:themeColor="text1"/>
         </w:rPr>
-        <w:t>main(</w:t>
+        <w:t>notifyAll</w:t>
+      </w:r>
+      <w:proofErr w:type="spellEnd"/>
+      <w:r>
+        <w:rPr>
+          <w:rFonts w:cstheme="minorHAnsi"/>
+          <w:color w:val="000000" w:themeColor="text1"/>
+        </w:rPr>
+        <w:t>(</w:t>
       </w:r>
       <w:proofErr w:type="gramEnd"/>
       <w:r>
@@ -6811,30 +7737,46 @@
           <w:rFonts w:cstheme="minorHAnsi"/>
           <w:color w:val="000000" w:themeColor="text1"/>
         </w:rPr>
-        <w:t xml:space="preserve">String </w:t>
+        <w:t xml:space="preserve">)) or </w:t>
       </w:r>
       <w:proofErr w:type="spellStart"/>
-      <w:r>
-        <w:rPr>
-          <w:rFonts w:cstheme="minorHAnsi"/>
-          <w:color w:val="000000" w:themeColor="text1"/>
-        </w:rPr>
-        <w:t>args</w:t>
+      <w:proofErr w:type="gramStart"/>
+      <w:r>
+        <w:rPr>
+          <w:rFonts w:cstheme="minorHAnsi"/>
+          <w:color w:val="000000" w:themeColor="text1"/>
+        </w:rPr>
+        <w:t>interrupted.</w:t>
+      </w:r>
+      <w:r>
+        <w:rPr>
+          <w:rFonts w:cstheme="minorHAnsi"/>
+          <w:color w:val="000000" w:themeColor="text1"/>
+        </w:rPr>
+        <w:t>sleep</w:t>
       </w:r>
       <w:proofErr w:type="spellEnd"/>
-      <w:r>
-        <w:rPr>
-          <w:rFonts w:cstheme="minorHAnsi"/>
-          <w:color w:val="000000" w:themeColor="text1"/>
-        </w:rPr>
-        <w:t>)”</w:t>
-      </w:r>
-      <w:r>
-        <w:rPr>
-          <w:rFonts w:cstheme="minorHAnsi"/>
-          <w:color w:val="000000" w:themeColor="text1"/>
-        </w:rPr>
-        <w:t xml:space="preserve"> method.</w:t>
+      <w:proofErr w:type="gramEnd"/>
+      <w:r>
+        <w:rPr>
+          <w:rFonts w:cstheme="minorHAnsi"/>
+          <w:color w:val="000000" w:themeColor="text1"/>
+        </w:rPr>
+        <w:t>() does not</w:t>
+      </w:r>
+      <w:r>
+        <w:rPr>
+          <w:rFonts w:cstheme="minorHAnsi"/>
+          <w:color w:val="000000" w:themeColor="text1"/>
+        </w:rPr>
+        <w:t xml:space="preserve"> release lock</w:t>
+      </w:r>
+      <w:r>
+        <w:rPr>
+          <w:rFonts w:cstheme="minorHAnsi"/>
+          <w:color w:val="000000" w:themeColor="text1"/>
+        </w:rPr>
+        <w:t xml:space="preserve">. </w:t>
       </w:r>
     </w:p>
     <w:p>
@@ -6853,7 +7795,7 @@
           <w:bCs/>
           <w:color w:val="000000" w:themeColor="text1"/>
         </w:rPr>
-        <w:t>Thread :</w:t>
+        <w:t>sleep(</w:t>
       </w:r>
       <w:proofErr w:type="gramEnd"/>
       <w:r>
@@ -6863,8 +7805,1050 @@
           <w:bCs/>
           <w:color w:val="000000" w:themeColor="text1"/>
         </w:rPr>
-        <w:t xml:space="preserve"> </w:t>
-      </w:r>
+        <w:t>)</w:t>
+      </w:r>
+      <w:r>
+        <w:rPr>
+          <w:rFonts w:cstheme="minorHAnsi"/>
+          <w:color w:val="000000" w:themeColor="text1"/>
+        </w:rPr>
+        <w:t xml:space="preserve"> pauses the current thread for a specified amount of time. It does NOT release any monitor lock the thread currently holds.</w:t>
+      </w:r>
+    </w:p>
+    <w:p>
+      <w:pPr>
+        <w:spacing w:after="0"/>
+        <w:rPr>
+          <w:rFonts w:cstheme="minorHAnsi"/>
+          <w:color w:val="000000" w:themeColor="text1"/>
+        </w:rPr>
+      </w:pPr>
+      <w:proofErr w:type="gramStart"/>
+      <w:r>
+        <w:rPr>
+          <w:rFonts w:cstheme="minorHAnsi"/>
+          <w:b/>
+          <w:bCs/>
+          <w:color w:val="000000" w:themeColor="text1"/>
+        </w:rPr>
+        <w:t>notify(</w:t>
+      </w:r>
+      <w:proofErr w:type="gramEnd"/>
+      <w:r>
+        <w:rPr>
+          <w:rFonts w:cstheme="minorHAnsi"/>
+          <w:b/>
+          <w:bCs/>
+          <w:color w:val="000000" w:themeColor="text1"/>
+        </w:rPr>
+        <w:t>)</w:t>
+      </w:r>
+      <w:r>
+        <w:rPr>
+          <w:rFonts w:cstheme="minorHAnsi"/>
+          <w:color w:val="000000" w:themeColor="text1"/>
+        </w:rPr>
+        <w:t xml:space="preserve"> wakes one thread that is waiting on the same object's monitor. The lock is NOT released immediately; the notifying thread must first leave the synchronized block/method, after which the awakened thread can compete to acquire the lock.</w:t>
+      </w:r>
+    </w:p>
+    <w:p>
+      <w:pPr>
+        <w:spacing w:after="0"/>
+        <w:rPr>
+          <w:rFonts w:ascii="Consolas" w:hAnsi="Consolas" w:cstheme="minorHAnsi"/>
+          <w:color w:val="000000" w:themeColor="text1"/>
+          <w:sz w:val="16"/>
+          <w:szCs w:val="16"/>
+        </w:rPr>
+      </w:pPr>
+      <w:r>
+        <w:rPr>
+          <w:rFonts w:ascii="Consolas" w:hAnsi="Consolas" w:cstheme="minorHAnsi"/>
+          <w:color w:val="000000" w:themeColor="text1"/>
+          <w:sz w:val="16"/>
+          <w:szCs w:val="16"/>
+        </w:rPr>
+        <w:t xml:space="preserve">Thread A → owns lock → </w:t>
+      </w:r>
+      <w:proofErr w:type="gramStart"/>
+      <w:r>
+        <w:rPr>
+          <w:rFonts w:ascii="Consolas" w:hAnsi="Consolas" w:cstheme="minorHAnsi"/>
+          <w:color w:val="000000" w:themeColor="text1"/>
+          <w:sz w:val="16"/>
+          <w:szCs w:val="16"/>
+        </w:rPr>
+        <w:t>notify(</w:t>
+      </w:r>
+      <w:proofErr w:type="gramEnd"/>
+      <w:r>
+        <w:rPr>
+          <w:rFonts w:ascii="Consolas" w:hAnsi="Consolas" w:cstheme="minorHAnsi"/>
+          <w:color w:val="000000" w:themeColor="text1"/>
+          <w:sz w:val="16"/>
+          <w:szCs w:val="16"/>
+        </w:rPr>
+        <w:t>)</w:t>
+      </w:r>
+    </w:p>
+    <w:p>
+      <w:pPr>
+        <w:spacing w:after="0"/>
+        <w:rPr>
+          <w:rFonts w:ascii="Consolas" w:hAnsi="Consolas" w:cstheme="minorHAnsi"/>
+          <w:color w:val="000000" w:themeColor="text1"/>
+          <w:sz w:val="16"/>
+          <w:szCs w:val="16"/>
+        </w:rPr>
+      </w:pPr>
+      <w:r>
+        <w:rPr>
+          <w:rFonts w:ascii="Consolas" w:hAnsi="Consolas" w:cstheme="minorHAnsi"/>
+          <w:color w:val="000000" w:themeColor="text1"/>
+          <w:sz w:val="16"/>
+          <w:szCs w:val="16"/>
+        </w:rPr>
+        <w:t xml:space="preserve">                    ↓</w:t>
+      </w:r>
+    </w:p>
+    <w:p>
+      <w:pPr>
+        <w:spacing w:after="0"/>
+        <w:rPr>
+          <w:rFonts w:ascii="Consolas" w:hAnsi="Consolas" w:cstheme="minorHAnsi"/>
+          <w:color w:val="000000" w:themeColor="text1"/>
+          <w:sz w:val="16"/>
+          <w:szCs w:val="16"/>
+        </w:rPr>
+      </w:pPr>
+      <w:r>
+        <w:rPr>
+          <w:rFonts w:ascii="Consolas" w:hAnsi="Consolas" w:cstheme="minorHAnsi"/>
+          <w:color w:val="000000" w:themeColor="text1"/>
+          <w:sz w:val="16"/>
+          <w:szCs w:val="16"/>
+        </w:rPr>
+        <w:t xml:space="preserve">             Thread B is awakened</w:t>
+      </w:r>
+    </w:p>
+    <w:p>
+      <w:pPr>
+        <w:spacing w:after="0"/>
+        <w:rPr>
+          <w:rFonts w:ascii="Consolas" w:hAnsi="Consolas" w:cstheme="minorHAnsi"/>
+          <w:color w:val="000000" w:themeColor="text1"/>
+          <w:sz w:val="16"/>
+          <w:szCs w:val="16"/>
+        </w:rPr>
+      </w:pPr>
+      <w:r>
+        <w:rPr>
+          <w:rFonts w:ascii="Consolas" w:hAnsi="Consolas" w:cstheme="minorHAnsi"/>
+          <w:color w:val="000000" w:themeColor="text1"/>
+          <w:sz w:val="16"/>
+          <w:szCs w:val="16"/>
+        </w:rPr>
+        <w:t xml:space="preserve">                    ↓</w:t>
+      </w:r>
+    </w:p>
+    <w:p>
+      <w:pPr>
+        <w:spacing w:after="0"/>
+        <w:rPr>
+          <w:rFonts w:ascii="Consolas" w:hAnsi="Consolas" w:cstheme="minorHAnsi"/>
+          <w:color w:val="000000" w:themeColor="text1"/>
+          <w:sz w:val="16"/>
+          <w:szCs w:val="16"/>
+        </w:rPr>
+      </w:pPr>
+      <w:r>
+        <w:rPr>
+          <w:rFonts w:ascii="Consolas" w:hAnsi="Consolas" w:cstheme="minorHAnsi"/>
+          <w:color w:val="000000" w:themeColor="text1"/>
+          <w:sz w:val="16"/>
+          <w:szCs w:val="16"/>
+        </w:rPr>
+        <w:t>Thread A still owns lock</w:t>
+      </w:r>
+    </w:p>
+    <w:p>
+      <w:pPr>
+        <w:spacing w:after="0"/>
+        <w:rPr>
+          <w:rFonts w:ascii="Consolas" w:hAnsi="Consolas" w:cstheme="minorHAnsi"/>
+          <w:color w:val="000000" w:themeColor="text1"/>
+          <w:sz w:val="16"/>
+          <w:szCs w:val="16"/>
+        </w:rPr>
+      </w:pPr>
+      <w:r>
+        <w:rPr>
+          <w:rFonts w:ascii="Consolas" w:hAnsi="Consolas" w:cstheme="minorHAnsi"/>
+          <w:color w:val="000000" w:themeColor="text1"/>
+          <w:sz w:val="16"/>
+          <w:szCs w:val="16"/>
+        </w:rPr>
+        <w:t xml:space="preserve">                    ↓</w:t>
+      </w:r>
+    </w:p>
+    <w:p>
+      <w:pPr>
+        <w:spacing w:after="0"/>
+        <w:rPr>
+          <w:rFonts w:ascii="Consolas" w:hAnsi="Consolas" w:cstheme="minorHAnsi"/>
+          <w:color w:val="000000" w:themeColor="text1"/>
+          <w:sz w:val="16"/>
+          <w:szCs w:val="16"/>
+        </w:rPr>
+      </w:pPr>
+      <w:r>
+        <w:rPr>
+          <w:rFonts w:ascii="Consolas" w:hAnsi="Consolas" w:cstheme="minorHAnsi"/>
+          <w:color w:val="000000" w:themeColor="text1"/>
+          <w:sz w:val="16"/>
+          <w:szCs w:val="16"/>
+        </w:rPr>
+        <w:t>Thread A exits synchronized block</w:t>
+      </w:r>
+    </w:p>
+    <w:p>
+      <w:pPr>
+        <w:spacing w:after="0"/>
+        <w:rPr>
+          <w:rFonts w:ascii="Consolas" w:hAnsi="Consolas" w:cstheme="minorHAnsi"/>
+          <w:color w:val="000000" w:themeColor="text1"/>
+          <w:sz w:val="16"/>
+          <w:szCs w:val="16"/>
+        </w:rPr>
+      </w:pPr>
+      <w:r>
+        <w:rPr>
+          <w:rFonts w:ascii="Consolas" w:hAnsi="Consolas" w:cstheme="minorHAnsi"/>
+          <w:color w:val="000000" w:themeColor="text1"/>
+          <w:sz w:val="16"/>
+          <w:szCs w:val="16"/>
+        </w:rPr>
+        <w:t xml:space="preserve">                    ↓</w:t>
+      </w:r>
+    </w:p>
+    <w:p>
+      <w:pPr>
+        <w:spacing w:after="0"/>
+        <w:rPr>
+          <w:rFonts w:ascii="Consolas" w:hAnsi="Consolas" w:cstheme="minorHAnsi"/>
+          <w:color w:val="000000" w:themeColor="text1"/>
+          <w:sz w:val="16"/>
+          <w:szCs w:val="16"/>
+        </w:rPr>
+      </w:pPr>
+      <w:r>
+        <w:rPr>
+          <w:rFonts w:ascii="Consolas" w:hAnsi="Consolas" w:cstheme="minorHAnsi"/>
+          <w:color w:val="000000" w:themeColor="text1"/>
+          <w:sz w:val="16"/>
+          <w:szCs w:val="16"/>
+        </w:rPr>
+        <w:t>Thread B can acquire lock</w:t>
+      </w:r>
+    </w:p>
+    <w:p>
+      <w:pPr>
+        <w:spacing w:after="0"/>
+        <w:rPr>
+          <w:rFonts w:ascii="Consolas" w:hAnsi="Consolas" w:cstheme="minorHAnsi"/>
+          <w:color w:val="000000" w:themeColor="text1"/>
+          <w:sz w:val="16"/>
+          <w:szCs w:val="16"/>
+        </w:rPr>
+      </w:pPr>
+    </w:p>
+    <w:p>
+      <w:pPr>
+        <w:spacing w:after="0"/>
+        <w:rPr>
+          <w:rFonts w:cstheme="minorHAnsi"/>
+          <w:color w:val="000000" w:themeColor="text1"/>
+        </w:rPr>
+      </w:pPr>
+      <w:proofErr w:type="spellStart"/>
+      <w:proofErr w:type="gramStart"/>
+      <w:r>
+        <w:rPr>
+          <w:rFonts w:cstheme="minorHAnsi"/>
+          <w:b/>
+          <w:bCs/>
+          <w:color w:val="000000" w:themeColor="text1"/>
+        </w:rPr>
+        <w:t>notifyAll</w:t>
+      </w:r>
+      <w:proofErr w:type="spellEnd"/>
+      <w:r>
+        <w:rPr>
+          <w:rFonts w:cstheme="minorHAnsi"/>
+          <w:b/>
+          <w:bCs/>
+          <w:color w:val="000000" w:themeColor="text1"/>
+        </w:rPr>
+        <w:t>(</w:t>
+      </w:r>
+      <w:proofErr w:type="gramEnd"/>
+      <w:r>
+        <w:rPr>
+          <w:rFonts w:cstheme="minorHAnsi"/>
+          <w:b/>
+          <w:bCs/>
+          <w:color w:val="000000" w:themeColor="text1"/>
+        </w:rPr>
+        <w:t>)</w:t>
+      </w:r>
+      <w:r>
+        <w:rPr>
+          <w:rFonts w:cstheme="minorHAnsi"/>
+          <w:color w:val="000000" w:themeColor="text1"/>
+        </w:rPr>
+        <w:t xml:space="preserve"> wakes all threads waiting on the same object's monitor. They don't immediately run; they must compete to reacquire the monitor after the current thread releases it.</w:t>
+      </w:r>
+    </w:p>
+    <w:p>
+      <w:pPr>
+        <w:spacing w:after="0"/>
+        <w:rPr>
+          <w:rFonts w:ascii="Consolas" w:hAnsi="Consolas" w:cstheme="minorHAnsi"/>
+          <w:color w:val="000000" w:themeColor="text1"/>
+          <w:sz w:val="16"/>
+          <w:szCs w:val="16"/>
+        </w:rPr>
+      </w:pPr>
+    </w:p>
+    <w:tbl>
+      <w:tblPr>
+        <w:tblW w:w="0" w:type="auto"/>
+        <w:tblCellSpacing w:w="15" w:type="dxa"/>
+        <w:tblCellMar>
+          <w:top w:w="15" w:type="dxa"/>
+          <w:left w:w="15" w:type="dxa"/>
+          <w:bottom w:w="15" w:type="dxa"/>
+          <w:right w:w="15" w:type="dxa"/>
+        </w:tblCellMar>
+        <w:tblLook w:val="04A0" w:firstRow="1" w:lastRow="0" w:firstColumn="1" w:lastColumn="0" w:noHBand="0" w:noVBand="1"/>
+      </w:tblPr>
+      <w:tblGrid>
+        <w:gridCol w:w="1043"/>
+        <w:gridCol w:w="2875"/>
+        <w:gridCol w:w="2011"/>
+      </w:tblGrid>
+      <w:tr>
+        <w:trPr>
+          <w:tblHeader/>
+          <w:tblCellSpacing w:w="15" w:type="dxa"/>
+        </w:trPr>
+        <w:tc>
+          <w:tcPr>
+            <w:tcW w:w="0" w:type="auto"/>
+            <w:vAlign w:val="center"/>
+            <w:hideMark/>
+          </w:tcPr>
+          <w:p>
+            <w:pPr>
+              <w:spacing w:after="0"/>
+              <w:rPr>
+                <w:rFonts w:ascii="Consolas" w:hAnsi="Consolas" w:cstheme="minorHAnsi"/>
+                <w:b/>
+                <w:bCs/>
+                <w:color w:val="000000" w:themeColor="text1"/>
+                <w:sz w:val="16"/>
+                <w:szCs w:val="16"/>
+              </w:rPr>
+            </w:pPr>
+            <w:r>
+              <w:rPr>
+                <w:rFonts w:ascii="Consolas" w:hAnsi="Consolas" w:cstheme="minorHAnsi"/>
+                <w:b/>
+                <w:bCs/>
+                <w:color w:val="000000" w:themeColor="text1"/>
+                <w:sz w:val="16"/>
+                <w:szCs w:val="16"/>
+              </w:rPr>
+              <w:t>Method</w:t>
+            </w:r>
+          </w:p>
+        </w:tc>
+        <w:tc>
+          <w:tcPr>
+            <w:tcW w:w="0" w:type="auto"/>
+            <w:vAlign w:val="center"/>
+            <w:hideMark/>
+          </w:tcPr>
+          <w:p>
+            <w:pPr>
+              <w:spacing w:after="0"/>
+              <w:rPr>
+                <w:rFonts w:ascii="Consolas" w:hAnsi="Consolas" w:cstheme="minorHAnsi"/>
+                <w:b/>
+                <w:bCs/>
+                <w:color w:val="000000" w:themeColor="text1"/>
+                <w:sz w:val="16"/>
+                <w:szCs w:val="16"/>
+              </w:rPr>
+            </w:pPr>
+            <w:r>
+              <w:rPr>
+                <w:rFonts w:ascii="Consolas" w:hAnsi="Consolas" w:cstheme="minorHAnsi"/>
+                <w:b/>
+                <w:bCs/>
+                <w:color w:val="000000" w:themeColor="text1"/>
+                <w:sz w:val="16"/>
+                <w:szCs w:val="16"/>
+              </w:rPr>
+              <w:t>What happens to current thread</w:t>
+            </w:r>
+          </w:p>
+        </w:tc>
+        <w:tc>
+          <w:tcPr>
+            <w:tcW w:w="0" w:type="auto"/>
+            <w:vAlign w:val="center"/>
+            <w:hideMark/>
+          </w:tcPr>
+          <w:p>
+            <w:pPr>
+              <w:spacing w:after="0"/>
+              <w:rPr>
+                <w:rFonts w:ascii="Consolas" w:hAnsi="Consolas" w:cstheme="minorHAnsi"/>
+                <w:b/>
+                <w:bCs/>
+                <w:color w:val="000000" w:themeColor="text1"/>
+                <w:sz w:val="16"/>
+                <w:szCs w:val="16"/>
+              </w:rPr>
+            </w:pPr>
+            <w:r>
+              <w:rPr>
+                <w:rFonts w:ascii="Consolas" w:hAnsi="Consolas" w:cstheme="minorHAnsi"/>
+                <w:b/>
+                <w:bCs/>
+                <w:color w:val="000000" w:themeColor="text1"/>
+                <w:sz w:val="16"/>
+                <w:szCs w:val="16"/>
+              </w:rPr>
+              <w:t>Releases monitor lock?</w:t>
+            </w:r>
+          </w:p>
+        </w:tc>
+      </w:tr>
+      <w:tr>
+        <w:trPr>
+          <w:tblCellSpacing w:w="15" w:type="dxa"/>
+        </w:trPr>
+        <w:tc>
+          <w:tcPr>
+            <w:tcW w:w="0" w:type="auto"/>
+            <w:vAlign w:val="center"/>
+            <w:hideMark/>
+          </w:tcPr>
+          <w:p>
+            <w:pPr>
+              <w:spacing w:after="0"/>
+              <w:rPr>
+                <w:rFonts w:ascii="Consolas" w:hAnsi="Consolas" w:cstheme="minorHAnsi"/>
+                <w:color w:val="000000" w:themeColor="text1"/>
+                <w:sz w:val="16"/>
+                <w:szCs w:val="16"/>
+              </w:rPr>
+            </w:pPr>
+            <w:proofErr w:type="gramStart"/>
+            <w:r>
+              <w:rPr>
+                <w:rFonts w:ascii="Consolas" w:hAnsi="Consolas" w:cstheme="minorHAnsi"/>
+                <w:color w:val="000000" w:themeColor="text1"/>
+                <w:sz w:val="16"/>
+                <w:szCs w:val="16"/>
+              </w:rPr>
+              <w:t>wait(</w:t>
+            </w:r>
+            <w:proofErr w:type="gramEnd"/>
+            <w:r>
+              <w:rPr>
+                <w:rFonts w:ascii="Consolas" w:hAnsi="Consolas" w:cstheme="minorHAnsi"/>
+                <w:color w:val="000000" w:themeColor="text1"/>
+                <w:sz w:val="16"/>
+                <w:szCs w:val="16"/>
+              </w:rPr>
+              <w:t>)</w:t>
+            </w:r>
+          </w:p>
+        </w:tc>
+        <w:tc>
+          <w:tcPr>
+            <w:tcW w:w="0" w:type="auto"/>
+            <w:vAlign w:val="center"/>
+            <w:hideMark/>
+          </w:tcPr>
+          <w:p>
+            <w:pPr>
+              <w:spacing w:after="0"/>
+              <w:rPr>
+                <w:rFonts w:ascii="Consolas" w:hAnsi="Consolas" w:cstheme="minorHAnsi"/>
+                <w:color w:val="000000" w:themeColor="text1"/>
+                <w:sz w:val="16"/>
+                <w:szCs w:val="16"/>
+              </w:rPr>
+            </w:pPr>
+            <w:r>
+              <w:rPr>
+                <w:rFonts w:ascii="Consolas" w:hAnsi="Consolas" w:cstheme="minorHAnsi"/>
+                <w:color w:val="000000" w:themeColor="text1"/>
+                <w:sz w:val="16"/>
+                <w:szCs w:val="16"/>
+              </w:rPr>
+              <w:t>Waits until notified/interrupted</w:t>
+            </w:r>
+          </w:p>
+        </w:tc>
+        <w:tc>
+          <w:tcPr>
+            <w:tcW w:w="0" w:type="auto"/>
+            <w:vAlign w:val="center"/>
+            <w:hideMark/>
+          </w:tcPr>
+          <w:p>
+            <w:pPr>
+              <w:spacing w:after="0"/>
+              <w:rPr>
+                <w:rFonts w:ascii="Consolas" w:hAnsi="Consolas" w:cstheme="minorHAnsi"/>
+                <w:color w:val="000000" w:themeColor="text1"/>
+                <w:sz w:val="16"/>
+                <w:szCs w:val="16"/>
+              </w:rPr>
+            </w:pPr>
+            <w:r>
+              <w:rPr>
+                <w:rFonts w:ascii="Segoe UI Emoji" w:hAnsi="Segoe UI Emoji" w:cs="Segoe UI Emoji"/>
+                <w:color w:val="000000" w:themeColor="text1"/>
+                <w:sz w:val="16"/>
+                <w:szCs w:val="16"/>
+              </w:rPr>
+              <w:t>✅</w:t>
+            </w:r>
+            <w:r>
+              <w:rPr>
+                <w:rFonts w:ascii="Consolas" w:hAnsi="Consolas" w:cstheme="minorHAnsi"/>
+                <w:color w:val="000000" w:themeColor="text1"/>
+                <w:sz w:val="16"/>
+                <w:szCs w:val="16"/>
+              </w:rPr>
+              <w:t xml:space="preserve"> Yes</w:t>
+            </w:r>
+          </w:p>
+        </w:tc>
+      </w:tr>
+      <w:tr>
+        <w:trPr>
+          <w:tblCellSpacing w:w="15" w:type="dxa"/>
+        </w:trPr>
+        <w:tc>
+          <w:tcPr>
+            <w:tcW w:w="0" w:type="auto"/>
+            <w:vAlign w:val="center"/>
+            <w:hideMark/>
+          </w:tcPr>
+          <w:p>
+            <w:pPr>
+              <w:spacing w:after="0"/>
+              <w:rPr>
+                <w:rFonts w:ascii="Consolas" w:hAnsi="Consolas" w:cstheme="minorHAnsi"/>
+                <w:color w:val="000000" w:themeColor="text1"/>
+                <w:sz w:val="16"/>
+                <w:szCs w:val="16"/>
+              </w:rPr>
+            </w:pPr>
+            <w:proofErr w:type="gramStart"/>
+            <w:r>
+              <w:rPr>
+                <w:rFonts w:ascii="Consolas" w:hAnsi="Consolas" w:cstheme="minorHAnsi"/>
+                <w:color w:val="000000" w:themeColor="text1"/>
+                <w:sz w:val="16"/>
+                <w:szCs w:val="16"/>
+              </w:rPr>
+              <w:t>sleep(</w:t>
+            </w:r>
+            <w:proofErr w:type="gramEnd"/>
+            <w:r>
+              <w:rPr>
+                <w:rFonts w:ascii="Consolas" w:hAnsi="Consolas" w:cstheme="minorHAnsi"/>
+                <w:color w:val="000000" w:themeColor="text1"/>
+                <w:sz w:val="16"/>
+                <w:szCs w:val="16"/>
+              </w:rPr>
+              <w:t>)</w:t>
+            </w:r>
+          </w:p>
+        </w:tc>
+        <w:tc>
+          <w:tcPr>
+            <w:tcW w:w="0" w:type="auto"/>
+            <w:vAlign w:val="center"/>
+            <w:hideMark/>
+          </w:tcPr>
+          <w:p>
+            <w:pPr>
+              <w:spacing w:after="0"/>
+              <w:rPr>
+                <w:rFonts w:ascii="Consolas" w:hAnsi="Consolas" w:cstheme="minorHAnsi"/>
+                <w:color w:val="000000" w:themeColor="text1"/>
+                <w:sz w:val="16"/>
+                <w:szCs w:val="16"/>
+              </w:rPr>
+            </w:pPr>
+            <w:r>
+              <w:rPr>
+                <w:rFonts w:ascii="Consolas" w:hAnsi="Consolas" w:cstheme="minorHAnsi"/>
+                <w:color w:val="000000" w:themeColor="text1"/>
+                <w:sz w:val="16"/>
+                <w:szCs w:val="16"/>
+              </w:rPr>
+              <w:t>Pauses for specified time</w:t>
+            </w:r>
+          </w:p>
+        </w:tc>
+        <w:tc>
+          <w:tcPr>
+            <w:tcW w:w="0" w:type="auto"/>
+            <w:vAlign w:val="center"/>
+            <w:hideMark/>
+          </w:tcPr>
+          <w:p>
+            <w:pPr>
+              <w:spacing w:after="0"/>
+              <w:rPr>
+                <w:rFonts w:ascii="Consolas" w:hAnsi="Consolas" w:cstheme="minorHAnsi"/>
+                <w:color w:val="000000" w:themeColor="text1"/>
+                <w:sz w:val="16"/>
+                <w:szCs w:val="16"/>
+              </w:rPr>
+            </w:pPr>
+            <w:r>
+              <w:rPr>
+                <w:rFonts w:ascii="Segoe UI Emoji" w:hAnsi="Segoe UI Emoji" w:cs="Segoe UI Emoji"/>
+                <w:color w:val="000000" w:themeColor="text1"/>
+                <w:sz w:val="16"/>
+                <w:szCs w:val="16"/>
+              </w:rPr>
+              <w:t>❌</w:t>
+            </w:r>
+            <w:r>
+              <w:rPr>
+                <w:rFonts w:ascii="Consolas" w:hAnsi="Consolas" w:cstheme="minorHAnsi"/>
+                <w:color w:val="000000" w:themeColor="text1"/>
+                <w:sz w:val="16"/>
+                <w:szCs w:val="16"/>
+              </w:rPr>
+              <w:t xml:space="preserve"> No</w:t>
+            </w:r>
+          </w:p>
+        </w:tc>
+      </w:tr>
+      <w:tr>
+        <w:trPr>
+          <w:tblCellSpacing w:w="15" w:type="dxa"/>
+        </w:trPr>
+        <w:tc>
+          <w:tcPr>
+            <w:tcW w:w="0" w:type="auto"/>
+            <w:vAlign w:val="center"/>
+            <w:hideMark/>
+          </w:tcPr>
+          <w:p>
+            <w:pPr>
+              <w:spacing w:after="0"/>
+              <w:rPr>
+                <w:rFonts w:ascii="Consolas" w:hAnsi="Consolas" w:cstheme="minorHAnsi"/>
+                <w:color w:val="000000" w:themeColor="text1"/>
+                <w:sz w:val="16"/>
+                <w:szCs w:val="16"/>
+              </w:rPr>
+            </w:pPr>
+            <w:proofErr w:type="gramStart"/>
+            <w:r>
+              <w:rPr>
+                <w:rFonts w:ascii="Consolas" w:hAnsi="Consolas" w:cstheme="minorHAnsi"/>
+                <w:color w:val="000000" w:themeColor="text1"/>
+                <w:sz w:val="16"/>
+                <w:szCs w:val="16"/>
+              </w:rPr>
+              <w:lastRenderedPageBreak/>
+              <w:t>notify(</w:t>
+            </w:r>
+            <w:proofErr w:type="gramEnd"/>
+            <w:r>
+              <w:rPr>
+                <w:rFonts w:ascii="Consolas" w:hAnsi="Consolas" w:cstheme="minorHAnsi"/>
+                <w:color w:val="000000" w:themeColor="text1"/>
+                <w:sz w:val="16"/>
+                <w:szCs w:val="16"/>
+              </w:rPr>
+              <w:t>)</w:t>
+            </w:r>
+          </w:p>
+        </w:tc>
+        <w:tc>
+          <w:tcPr>
+            <w:tcW w:w="0" w:type="auto"/>
+            <w:vAlign w:val="center"/>
+            <w:hideMark/>
+          </w:tcPr>
+          <w:p>
+            <w:pPr>
+              <w:spacing w:after="0"/>
+              <w:rPr>
+                <w:rFonts w:ascii="Consolas" w:hAnsi="Consolas" w:cstheme="minorHAnsi"/>
+                <w:color w:val="000000" w:themeColor="text1"/>
+                <w:sz w:val="16"/>
+                <w:szCs w:val="16"/>
+              </w:rPr>
+            </w:pPr>
+            <w:r>
+              <w:rPr>
+                <w:rFonts w:ascii="Consolas" w:hAnsi="Consolas" w:cstheme="minorHAnsi"/>
+                <w:color w:val="000000" w:themeColor="text1"/>
+                <w:sz w:val="16"/>
+                <w:szCs w:val="16"/>
+              </w:rPr>
+              <w:t xml:space="preserve">Wakes </w:t>
+            </w:r>
+            <w:r>
+              <w:rPr>
+                <w:rFonts w:ascii="Consolas" w:hAnsi="Consolas" w:cstheme="minorHAnsi"/>
+                <w:b/>
+                <w:bCs/>
+                <w:color w:val="000000" w:themeColor="text1"/>
+                <w:sz w:val="16"/>
+                <w:szCs w:val="16"/>
+              </w:rPr>
+              <w:t>one</w:t>
+            </w:r>
+            <w:r>
+              <w:rPr>
+                <w:rFonts w:ascii="Consolas" w:hAnsi="Consolas" w:cstheme="minorHAnsi"/>
+                <w:color w:val="000000" w:themeColor="text1"/>
+                <w:sz w:val="16"/>
+                <w:szCs w:val="16"/>
+              </w:rPr>
+              <w:t xml:space="preserve"> waiting thread</w:t>
+            </w:r>
+          </w:p>
+        </w:tc>
+        <w:tc>
+          <w:tcPr>
+            <w:tcW w:w="0" w:type="auto"/>
+            <w:vAlign w:val="center"/>
+            <w:hideMark/>
+          </w:tcPr>
+          <w:p>
+            <w:pPr>
+              <w:spacing w:after="0"/>
+              <w:rPr>
+                <w:rFonts w:ascii="Consolas" w:hAnsi="Consolas" w:cstheme="minorHAnsi"/>
+                <w:color w:val="000000" w:themeColor="text1"/>
+                <w:sz w:val="16"/>
+                <w:szCs w:val="16"/>
+              </w:rPr>
+            </w:pPr>
+            <w:r>
+              <w:rPr>
+                <w:rFonts w:ascii="Segoe UI Emoji" w:hAnsi="Segoe UI Emoji" w:cs="Segoe UI Emoji"/>
+                <w:color w:val="000000" w:themeColor="text1"/>
+                <w:sz w:val="16"/>
+                <w:szCs w:val="16"/>
+              </w:rPr>
+              <w:t>❌</w:t>
+            </w:r>
+            <w:r>
+              <w:rPr>
+                <w:rFonts w:ascii="Consolas" w:hAnsi="Consolas" w:cstheme="minorHAnsi"/>
+                <w:color w:val="000000" w:themeColor="text1"/>
+                <w:sz w:val="16"/>
+                <w:szCs w:val="16"/>
+              </w:rPr>
+              <w:t xml:space="preserve"> Not immediately</w:t>
+            </w:r>
+          </w:p>
+        </w:tc>
+      </w:tr>
+      <w:tr>
+        <w:trPr>
+          <w:tblCellSpacing w:w="15" w:type="dxa"/>
+        </w:trPr>
+        <w:tc>
+          <w:tcPr>
+            <w:tcW w:w="0" w:type="auto"/>
+            <w:vAlign w:val="center"/>
+            <w:hideMark/>
+          </w:tcPr>
+          <w:p>
+            <w:pPr>
+              <w:spacing w:after="0"/>
+              <w:rPr>
+                <w:rFonts w:ascii="Consolas" w:hAnsi="Consolas" w:cstheme="minorHAnsi"/>
+                <w:color w:val="000000" w:themeColor="text1"/>
+                <w:sz w:val="16"/>
+                <w:szCs w:val="16"/>
+              </w:rPr>
+            </w:pPr>
+            <w:proofErr w:type="spellStart"/>
+            <w:proofErr w:type="gramStart"/>
+            <w:r>
+              <w:rPr>
+                <w:rFonts w:ascii="Consolas" w:hAnsi="Consolas" w:cstheme="minorHAnsi"/>
+                <w:color w:val="000000" w:themeColor="text1"/>
+                <w:sz w:val="16"/>
+                <w:szCs w:val="16"/>
+              </w:rPr>
+              <w:t>notifyAll</w:t>
+            </w:r>
+            <w:proofErr w:type="spellEnd"/>
+            <w:r>
+              <w:rPr>
+                <w:rFonts w:ascii="Consolas" w:hAnsi="Consolas" w:cstheme="minorHAnsi"/>
+                <w:color w:val="000000" w:themeColor="text1"/>
+                <w:sz w:val="16"/>
+                <w:szCs w:val="16"/>
+              </w:rPr>
+              <w:t>(</w:t>
+            </w:r>
+            <w:proofErr w:type="gramEnd"/>
+            <w:r>
+              <w:rPr>
+                <w:rFonts w:ascii="Consolas" w:hAnsi="Consolas" w:cstheme="minorHAnsi"/>
+                <w:color w:val="000000" w:themeColor="text1"/>
+                <w:sz w:val="16"/>
+                <w:szCs w:val="16"/>
+              </w:rPr>
+              <w:t>)</w:t>
+            </w:r>
+          </w:p>
+        </w:tc>
+        <w:tc>
+          <w:tcPr>
+            <w:tcW w:w="0" w:type="auto"/>
+            <w:vAlign w:val="center"/>
+            <w:hideMark/>
+          </w:tcPr>
+          <w:p>
+            <w:pPr>
+              <w:spacing w:after="0"/>
+              <w:rPr>
+                <w:rFonts w:ascii="Consolas" w:hAnsi="Consolas" w:cstheme="minorHAnsi"/>
+                <w:color w:val="000000" w:themeColor="text1"/>
+                <w:sz w:val="16"/>
+                <w:szCs w:val="16"/>
+              </w:rPr>
+            </w:pPr>
+            <w:r>
+              <w:rPr>
+                <w:rFonts w:ascii="Consolas" w:hAnsi="Consolas" w:cstheme="minorHAnsi"/>
+                <w:color w:val="000000" w:themeColor="text1"/>
+                <w:sz w:val="16"/>
+                <w:szCs w:val="16"/>
+              </w:rPr>
+              <w:t xml:space="preserve">Wakes </w:t>
+            </w:r>
+            <w:r>
+              <w:rPr>
+                <w:rFonts w:ascii="Consolas" w:hAnsi="Consolas" w:cstheme="minorHAnsi"/>
+                <w:b/>
+                <w:bCs/>
+                <w:color w:val="000000" w:themeColor="text1"/>
+                <w:sz w:val="16"/>
+                <w:szCs w:val="16"/>
+              </w:rPr>
+              <w:t>all</w:t>
+            </w:r>
+            <w:r>
+              <w:rPr>
+                <w:rFonts w:ascii="Consolas" w:hAnsi="Consolas" w:cstheme="minorHAnsi"/>
+                <w:color w:val="000000" w:themeColor="text1"/>
+                <w:sz w:val="16"/>
+                <w:szCs w:val="16"/>
+              </w:rPr>
+              <w:t xml:space="preserve"> waiting threads</w:t>
+            </w:r>
+          </w:p>
+        </w:tc>
+        <w:tc>
+          <w:tcPr>
+            <w:tcW w:w="0" w:type="auto"/>
+            <w:vAlign w:val="center"/>
+            <w:hideMark/>
+          </w:tcPr>
+          <w:p>
+            <w:pPr>
+              <w:spacing w:after="0"/>
+              <w:rPr>
+                <w:rFonts w:ascii="Consolas" w:hAnsi="Consolas" w:cstheme="minorHAnsi"/>
+                <w:color w:val="000000" w:themeColor="text1"/>
+                <w:sz w:val="16"/>
+                <w:szCs w:val="16"/>
+              </w:rPr>
+            </w:pPr>
+            <w:r>
+              <w:rPr>
+                <w:rFonts w:ascii="Segoe UI Emoji" w:hAnsi="Segoe UI Emoji" w:cs="Segoe UI Emoji"/>
+                <w:color w:val="000000" w:themeColor="text1"/>
+                <w:sz w:val="16"/>
+                <w:szCs w:val="16"/>
+              </w:rPr>
+              <w:t>❌</w:t>
+            </w:r>
+            <w:r>
+              <w:rPr>
+                <w:rFonts w:ascii="Consolas" w:hAnsi="Consolas" w:cstheme="minorHAnsi"/>
+                <w:color w:val="000000" w:themeColor="text1"/>
+                <w:sz w:val="16"/>
+                <w:szCs w:val="16"/>
+              </w:rPr>
+              <w:t xml:space="preserve"> Not immediately</w:t>
+            </w:r>
+          </w:p>
+        </w:tc>
+      </w:tr>
+    </w:tbl>
+    <w:p>
+      <w:pPr>
+        <w:spacing w:after="0"/>
+        <w:rPr>
+          <w:rFonts w:cstheme="minorHAnsi"/>
+          <w:color w:val="000000" w:themeColor="text1"/>
+        </w:rPr>
+      </w:pPr>
+    </w:p>
+    <w:p>
+      <w:pPr>
+        <w:spacing w:after="0"/>
+        <w:rPr>
+          <w:rFonts w:cstheme="minorHAnsi"/>
+          <w:color w:val="000000" w:themeColor="text1"/>
+        </w:rPr>
+      </w:pPr>
+      <w:r>
+        <w:rPr>
+          <w:rFonts w:cstheme="minorHAnsi"/>
+          <w:color w:val="000000" w:themeColor="text1"/>
+        </w:rPr>
+        <w:t>Why stop, suspended and resume depreciated?</w:t>
+      </w:r>
+    </w:p>
+    <w:p>
+      <w:pPr>
+        <w:spacing w:after="0"/>
+        <w:rPr>
+          <w:rFonts w:cstheme="minorHAnsi"/>
+          <w:color w:val="000000" w:themeColor="text1"/>
+        </w:rPr>
+      </w:pPr>
+      <w:r>
+        <w:rPr>
+          <w:rFonts w:cstheme="minorHAnsi"/>
+          <w:color w:val="000000" w:themeColor="text1"/>
+        </w:rPr>
+        <w:t xml:space="preserve">Since both stop and suspend can </w:t>
+      </w:r>
+      <w:proofErr w:type="gramStart"/>
+      <w:r>
+        <w:rPr>
+          <w:rFonts w:cstheme="minorHAnsi"/>
+          <w:color w:val="000000" w:themeColor="text1"/>
+        </w:rPr>
+        <w:t>lead  to</w:t>
+      </w:r>
+      <w:proofErr w:type="gramEnd"/>
+      <w:r>
+        <w:rPr>
+          <w:rFonts w:cstheme="minorHAnsi"/>
+          <w:color w:val="000000" w:themeColor="text1"/>
+        </w:rPr>
+        <w:t xml:space="preserve"> issues like dead lock.</w:t>
+      </w:r>
+    </w:p>
+    <w:p>
+      <w:pPr>
+        <w:spacing w:after="0"/>
+        <w:rPr>
+          <w:rFonts w:cstheme="minorHAnsi"/>
+          <w:color w:val="000000" w:themeColor="text1"/>
+        </w:rPr>
+      </w:pPr>
+      <w:proofErr w:type="gramStart"/>
+      <w:r>
+        <w:rPr>
+          <w:rFonts w:cstheme="minorHAnsi"/>
+          <w:color w:val="000000" w:themeColor="text1"/>
+        </w:rPr>
+        <w:t>Stop :</w:t>
+      </w:r>
+      <w:proofErr w:type="gramEnd"/>
+      <w:r>
+        <w:rPr>
+          <w:rFonts w:cstheme="minorHAnsi"/>
+          <w:color w:val="000000" w:themeColor="text1"/>
+        </w:rPr>
+        <w:t xml:space="preserve"> Terminates the thread abruptly. No lock release </w:t>
+      </w:r>
+      <w:proofErr w:type="gramStart"/>
+      <w:r>
+        <w:rPr>
+          <w:rFonts w:cstheme="minorHAnsi"/>
+          <w:color w:val="000000" w:themeColor="text1"/>
+        </w:rPr>
+        <w:t>happen</w:t>
+      </w:r>
+      <w:proofErr w:type="gramEnd"/>
+      <w:r>
+        <w:rPr>
+          <w:rFonts w:cstheme="minorHAnsi"/>
+          <w:color w:val="000000" w:themeColor="text1"/>
+        </w:rPr>
+        <w:t xml:space="preserve">, </w:t>
+      </w:r>
+      <w:proofErr w:type="gramStart"/>
+      <w:r>
+        <w:rPr>
+          <w:rFonts w:cstheme="minorHAnsi"/>
+          <w:color w:val="000000" w:themeColor="text1"/>
+        </w:rPr>
+        <w:t>No</w:t>
+      </w:r>
+      <w:proofErr w:type="gramEnd"/>
+      <w:r>
+        <w:rPr>
+          <w:rFonts w:cstheme="minorHAnsi"/>
+          <w:color w:val="000000" w:themeColor="text1"/>
+        </w:rPr>
+        <w:t xml:space="preserve"> resource clean up happened. So may be other thread is waiting for clean</w:t>
+      </w:r>
+      <w:r>
+        <w:rPr>
+          <w:rFonts w:cstheme="minorHAnsi"/>
+          <w:color w:val="000000" w:themeColor="text1"/>
+        </w:rPr>
+        <w:t>up or lock</w:t>
+      </w:r>
+      <w:r>
+        <w:rPr>
+          <w:rFonts w:cstheme="minorHAnsi"/>
+          <w:color w:val="000000" w:themeColor="text1"/>
+        </w:rPr>
+        <w:t>.</w:t>
+      </w:r>
+    </w:p>
+    <w:p>
+      <w:pPr>
+        <w:spacing w:after="0"/>
+        <w:rPr>
+          <w:rFonts w:cstheme="minorHAnsi"/>
+          <w:color w:val="000000" w:themeColor="text1"/>
+        </w:rPr>
+      </w:pPr>
       <w:r>
         <w:rPr>
           <w:rFonts w:cstheme="minorHAnsi"/>
@@ -6877,41 +8861,30 @@
           <w:rFonts w:cstheme="minorHAnsi"/>
           <w:color w:val="000000" w:themeColor="text1"/>
         </w:rPr>
-        <w:t>mallest sequence of instructions that are executed by CPU independently.</w:t>
-      </w:r>
-    </w:p>
-    <w:p>
-      <w:pPr>
-        <w:spacing w:after="0"/>
-        <w:rPr>
-          <w:rFonts w:cstheme="minorHAnsi"/>
-          <w:color w:val="000000" w:themeColor="text1"/>
-        </w:rPr>
-      </w:pPr>
-    </w:p>
-    <w:p>
-      <w:pPr>
-        <w:spacing w:after="0"/>
-        <w:rPr>
-          <w:rFonts w:cstheme="minorHAnsi"/>
-          <w:color w:val="000000" w:themeColor="text1"/>
-        </w:rPr>
-      </w:pPr>
-      <w:r>
-        <w:rPr>
-          <w:rFonts w:cstheme="minorHAnsi"/>
-          <w:b/>
-          <w:bCs/>
-          <w:color w:val="000000" w:themeColor="text1"/>
-        </w:rPr>
-        <w:t>Multitasking</w:t>
-      </w:r>
-      <w:r>
-        <w:rPr>
-          <w:rFonts w:cstheme="minorHAnsi"/>
-          <w:color w:val="000000" w:themeColor="text1"/>
-        </w:rPr>
-        <w:t xml:space="preserve"> is the execution of multiple independent tasks, typically managed by the operating system</w:t>
+        <w:t>uspend</w:t>
+      </w:r>
+      <w:r>
+        <w:rPr>
+          <w:rFonts w:cstheme="minorHAnsi"/>
+          <w:color w:val="000000" w:themeColor="text1"/>
+        </w:rPr>
+        <w:t>: Put the thread on hold(suspend) for temporary time. No lock is release too.</w:t>
+      </w:r>
+    </w:p>
+    <w:p>
+      <w:pPr>
+        <w:spacing w:after="0"/>
+        <w:rPr>
+          <w:rFonts w:cstheme="minorHAnsi"/>
+          <w:color w:val="000000" w:themeColor="text1"/>
+        </w:rPr>
+      </w:pPr>
+      <w:r>
+        <w:rPr>
+          <w:rFonts w:cstheme="minorHAnsi"/>
+          <w:color w:val="000000" w:themeColor="text1"/>
+        </w:rPr>
+        <w:t>Resume: used to resume the suspended thread. Since suspend got depreciated, so it also got depreciated</w:t>
       </w:r>
       <w:r>
         <w:rPr>
@@ -6919,768 +8892,6 @@
           <w:color w:val="000000" w:themeColor="text1"/>
         </w:rPr>
         <w:t>.</w:t>
-      </w:r>
-    </w:p>
-    <w:p>
-      <w:pPr>
-        <w:spacing w:after="0"/>
-        <w:rPr>
-          <w:rFonts w:cstheme="minorHAnsi"/>
-          <w:color w:val="000000" w:themeColor="text1"/>
-        </w:rPr>
-      </w:pPr>
-      <w:r>
-        <w:rPr>
-          <w:rFonts w:cstheme="minorHAnsi"/>
-          <w:b/>
-          <w:bCs/>
-          <w:color w:val="000000" w:themeColor="text1"/>
-        </w:rPr>
-        <w:t>Multithreading</w:t>
-      </w:r>
-      <w:r>
-        <w:rPr>
-          <w:rFonts w:cstheme="minorHAnsi"/>
-          <w:color w:val="000000" w:themeColor="text1"/>
-        </w:rPr>
-        <w:t xml:space="preserve"> is the execution of multiple threads within the same process, where threads share the process's resources.</w:t>
-      </w:r>
-    </w:p>
-    <w:p>
-      <w:pPr>
-        <w:spacing w:after="0"/>
-        <w:rPr>
-          <w:rFonts w:cstheme="minorHAnsi"/>
-          <w:color w:val="000000" w:themeColor="text1"/>
-        </w:rPr>
-      </w:pPr>
-    </w:p>
-    <w:p>
-      <w:pPr>
-        <w:spacing w:after="0"/>
-        <w:rPr>
-          <w:rFonts w:cstheme="minorHAnsi"/>
-          <w:b/>
-          <w:bCs/>
-          <w:color w:val="000000" w:themeColor="text1"/>
-        </w:rPr>
-      </w:pPr>
-      <w:r>
-        <w:rPr>
-          <w:rFonts w:cstheme="minorHAnsi"/>
-          <w:b/>
-          <w:bCs/>
-          <w:color w:val="000000" w:themeColor="text1"/>
-        </w:rPr>
-        <w:t>Thread creation, thread lifecycle, inter thread communication</w:t>
-      </w:r>
-    </w:p>
-    <w:p>
-      <w:pPr>
-        <w:spacing w:after="0"/>
-        <w:rPr>
-          <w:rFonts w:cstheme="minorHAnsi"/>
-          <w:color w:val="000000" w:themeColor="text1"/>
-        </w:rPr>
-      </w:pPr>
-      <w:r>
-        <w:rPr>
-          <w:rFonts w:cstheme="minorHAnsi"/>
-          <w:color w:val="000000" w:themeColor="text1"/>
-        </w:rPr>
-        <w:t xml:space="preserve">Thread can be created using </w:t>
-      </w:r>
-      <w:r>
-        <w:rPr>
-          <w:rFonts w:cstheme="minorHAnsi"/>
-          <w:b/>
-          <w:bCs/>
-          <w:color w:val="000000" w:themeColor="text1"/>
-        </w:rPr>
-        <w:t>extends Thread</w:t>
-      </w:r>
-      <w:r>
-        <w:rPr>
-          <w:rFonts w:cstheme="minorHAnsi"/>
-          <w:color w:val="000000" w:themeColor="text1"/>
-        </w:rPr>
-        <w:t xml:space="preserve"> </w:t>
-      </w:r>
-      <w:r>
-        <w:rPr>
-          <w:rFonts w:cstheme="minorHAnsi"/>
-          <w:color w:val="000000" w:themeColor="text1"/>
-        </w:rPr>
-        <w:t xml:space="preserve">class </w:t>
-      </w:r>
-      <w:r>
-        <w:rPr>
-          <w:rFonts w:cstheme="minorHAnsi"/>
-          <w:color w:val="000000" w:themeColor="text1"/>
-        </w:rPr>
-        <w:t xml:space="preserve">or using </w:t>
-      </w:r>
-      <w:r>
-        <w:rPr>
-          <w:rFonts w:cstheme="minorHAnsi"/>
-          <w:b/>
-          <w:bCs/>
-          <w:color w:val="000000" w:themeColor="text1"/>
-        </w:rPr>
-        <w:t>implements</w:t>
-      </w:r>
-      <w:r>
-        <w:rPr>
-          <w:rFonts w:cstheme="minorHAnsi"/>
-          <w:color w:val="000000" w:themeColor="text1"/>
-        </w:rPr>
-        <w:t xml:space="preserve"> </w:t>
-      </w:r>
-      <w:r>
-        <w:rPr>
-          <w:rFonts w:cstheme="minorHAnsi"/>
-          <w:b/>
-          <w:bCs/>
-          <w:color w:val="000000" w:themeColor="text1"/>
-        </w:rPr>
-        <w:t>Runnable</w:t>
-      </w:r>
-      <w:r>
-        <w:rPr>
-          <w:rFonts w:cstheme="minorHAnsi"/>
-          <w:b/>
-          <w:bCs/>
-          <w:color w:val="000000" w:themeColor="text1"/>
-        </w:rPr>
-        <w:t xml:space="preserve"> </w:t>
-      </w:r>
-      <w:r>
-        <w:rPr>
-          <w:rFonts w:cstheme="minorHAnsi"/>
-          <w:color w:val="000000" w:themeColor="text1"/>
-        </w:rPr>
-        <w:t>interface</w:t>
-      </w:r>
-      <w:r>
-        <w:rPr>
-          <w:rFonts w:cstheme="minorHAnsi"/>
-          <w:color w:val="000000" w:themeColor="text1"/>
-        </w:rPr>
-        <w:t>.</w:t>
-      </w:r>
-    </w:p>
-    <w:p>
-      <w:pPr>
-        <w:spacing w:after="0"/>
-        <w:rPr>
-          <w:rFonts w:cstheme="minorHAnsi"/>
-          <w:b/>
-          <w:bCs/>
-          <w:color w:val="000000" w:themeColor="text1"/>
-        </w:rPr>
-      </w:pPr>
-      <w:r>
-        <w:rPr>
-          <w:rFonts w:cstheme="minorHAnsi"/>
-          <w:b/>
-          <w:bCs/>
-          <w:color w:val="000000" w:themeColor="text1"/>
-        </w:rPr>
-        <w:t xml:space="preserve">thread </w:t>
-      </w:r>
-      <w:proofErr w:type="gramStart"/>
-      <w:r>
-        <w:rPr>
-          <w:rFonts w:cstheme="minorHAnsi"/>
-          <w:b/>
-          <w:bCs/>
-          <w:color w:val="000000" w:themeColor="text1"/>
-        </w:rPr>
-        <w:t>lifecycle</w:t>
-      </w:r>
-      <w:r>
-        <w:rPr>
-          <w:rFonts w:cstheme="minorHAnsi"/>
-          <w:b/>
-          <w:bCs/>
-          <w:color w:val="000000" w:themeColor="text1"/>
-        </w:rPr>
-        <w:t xml:space="preserve"> :</w:t>
-      </w:r>
-      <w:proofErr w:type="gramEnd"/>
-      <w:r>
-        <w:rPr>
-          <w:rFonts w:cstheme="minorHAnsi"/>
-          <w:b/>
-          <w:bCs/>
-          <w:color w:val="000000" w:themeColor="text1"/>
-        </w:rPr>
-        <w:t xml:space="preserve"> </w:t>
-      </w:r>
-    </w:p>
-    <w:p>
-      <w:pPr>
-        <w:spacing w:after="0"/>
-        <w:rPr>
-          <w:rFonts w:cstheme="minorHAnsi"/>
-          <w:color w:val="000000" w:themeColor="text1"/>
-        </w:rPr>
-      </w:pPr>
-      <w:r>
-        <w:rPr>
-          <w:rFonts w:cstheme="minorHAnsi"/>
-          <w:color w:val="000000" w:themeColor="text1"/>
-        </w:rPr>
-        <w:t xml:space="preserve">The official Java </w:t>
-      </w:r>
-      <w:proofErr w:type="spellStart"/>
-      <w:r>
-        <w:rPr>
-          <w:rFonts w:cstheme="minorHAnsi"/>
-          <w:color w:val="000000" w:themeColor="text1"/>
-        </w:rPr>
-        <w:t>Thread.State</w:t>
-      </w:r>
-      <w:proofErr w:type="spellEnd"/>
-      <w:r>
-        <w:rPr>
-          <w:rFonts w:cstheme="minorHAnsi"/>
-          <w:color w:val="000000" w:themeColor="text1"/>
-        </w:rPr>
-        <w:t xml:space="preserve"> has </w:t>
-      </w:r>
-      <w:r>
-        <w:rPr>
-          <w:rFonts w:cstheme="minorHAnsi"/>
-          <w:b/>
-          <w:bCs/>
-          <w:color w:val="000000" w:themeColor="text1"/>
-        </w:rPr>
-        <w:t>6 states</w:t>
-      </w:r>
-      <w:r>
-        <w:rPr>
-          <w:rFonts w:cstheme="minorHAnsi"/>
-          <w:color w:val="000000" w:themeColor="text1"/>
-        </w:rPr>
-        <w:t>:</w:t>
-      </w:r>
-    </w:p>
-    <w:p>
-      <w:pPr>
-        <w:spacing w:after="0"/>
-        <w:rPr>
-          <w:rFonts w:ascii="Consolas" w:hAnsi="Consolas" w:cstheme="minorHAnsi"/>
-          <w:color w:val="000000" w:themeColor="text1"/>
-          <w:sz w:val="16"/>
-          <w:szCs w:val="16"/>
-        </w:rPr>
-      </w:pPr>
-      <w:r>
-        <w:rPr>
-          <w:rFonts w:ascii="Consolas" w:hAnsi="Consolas" w:cstheme="minorHAnsi"/>
-          <w:b/>
-          <w:bCs/>
-          <w:color w:val="000000" w:themeColor="text1"/>
-          <w:sz w:val="16"/>
-          <w:szCs w:val="16"/>
-        </w:rPr>
-        <w:t>NEW</w:t>
-      </w:r>
-      <w:r>
-        <w:rPr>
-          <w:rFonts w:ascii="Consolas" w:hAnsi="Consolas" w:cstheme="minorHAnsi"/>
-          <w:color w:val="000000" w:themeColor="text1"/>
-          <w:sz w:val="16"/>
-          <w:szCs w:val="16"/>
-        </w:rPr>
-        <w:t xml:space="preserve"> </w:t>
-      </w:r>
-      <w:r>
-        <w:rPr>
-          <w:rFonts w:ascii="Consolas" w:hAnsi="Consolas" w:cstheme="minorHAnsi"/>
-          <w:color w:val="000000" w:themeColor="text1"/>
-          <w:sz w:val="16"/>
-          <w:szCs w:val="16"/>
-        </w:rPr>
-        <w:t>-&gt;</w:t>
-      </w:r>
-      <w:r>
-        <w:rPr>
-          <w:rFonts w:ascii="Consolas" w:hAnsi="Consolas" w:cstheme="minorHAnsi"/>
-          <w:color w:val="000000" w:themeColor="text1"/>
-          <w:sz w:val="16"/>
-          <w:szCs w:val="16"/>
-        </w:rPr>
-        <w:t xml:space="preserve"> </w:t>
-      </w:r>
-      <w:r>
-        <w:rPr>
-          <w:rFonts w:ascii="Consolas" w:hAnsi="Consolas" w:cstheme="minorHAnsi"/>
-          <w:b/>
-          <w:bCs/>
-          <w:color w:val="000000" w:themeColor="text1"/>
-          <w:sz w:val="16"/>
-          <w:szCs w:val="16"/>
-        </w:rPr>
-        <w:t>RUNNABLE</w:t>
-      </w:r>
-      <w:r>
-        <w:rPr>
-          <w:rFonts w:ascii="Consolas" w:hAnsi="Consolas" w:cstheme="minorHAnsi"/>
-          <w:color w:val="000000" w:themeColor="text1"/>
-          <w:sz w:val="16"/>
-          <w:szCs w:val="16"/>
-        </w:rPr>
-        <w:t xml:space="preserve"> </w:t>
-      </w:r>
-      <w:r>
-        <w:rPr>
-          <w:rFonts w:ascii="Consolas" w:hAnsi="Consolas" w:cstheme="minorHAnsi"/>
-          <w:color w:val="000000" w:themeColor="text1"/>
-          <w:sz w:val="16"/>
-          <w:szCs w:val="16"/>
-        </w:rPr>
-        <w:t>-&gt;</w:t>
-      </w:r>
-      <w:r>
-        <w:rPr>
-          <w:rFonts w:ascii="Consolas" w:hAnsi="Consolas" w:cstheme="minorHAnsi"/>
-          <w:color w:val="000000" w:themeColor="text1"/>
-          <w:sz w:val="16"/>
-          <w:szCs w:val="16"/>
-        </w:rPr>
-        <w:t xml:space="preserve"> RUNNING* </w:t>
-      </w:r>
-      <w:r>
-        <w:rPr>
-          <w:rFonts w:ascii="Consolas" w:hAnsi="Consolas" w:cstheme="minorHAnsi"/>
-          <w:color w:val="000000" w:themeColor="text1"/>
-          <w:sz w:val="16"/>
-          <w:szCs w:val="16"/>
-        </w:rPr>
-        <w:t>-&gt;</w:t>
-      </w:r>
-      <w:r>
-        <w:rPr>
-          <w:rFonts w:ascii="Consolas" w:hAnsi="Consolas" w:cstheme="minorHAnsi"/>
-          <w:color w:val="000000" w:themeColor="text1"/>
-          <w:sz w:val="16"/>
-          <w:szCs w:val="16"/>
-        </w:rPr>
-        <w:t xml:space="preserve"> </w:t>
-      </w:r>
-      <w:r>
-        <w:rPr>
-          <w:rFonts w:ascii="Consolas" w:hAnsi="Consolas" w:cstheme="minorHAnsi"/>
-          <w:b/>
-          <w:bCs/>
-          <w:color w:val="000000" w:themeColor="text1"/>
-          <w:sz w:val="16"/>
-          <w:szCs w:val="16"/>
-        </w:rPr>
-        <w:t>TERMINATED</w:t>
-      </w:r>
-    </w:p>
-    <w:p>
-      <w:pPr>
-        <w:spacing w:after="0"/>
-        <w:rPr>
-          <w:rFonts w:ascii="Consolas" w:hAnsi="Consolas" w:cstheme="minorHAnsi"/>
-          <w:color w:val="000000" w:themeColor="text1"/>
-          <w:sz w:val="16"/>
-          <w:szCs w:val="16"/>
-        </w:rPr>
-      </w:pPr>
-    </w:p>
-    <w:p>
-      <w:pPr>
-        <w:spacing w:after="0"/>
-        <w:rPr>
-          <w:rFonts w:ascii="Consolas" w:hAnsi="Consolas" w:cstheme="minorHAnsi"/>
-          <w:color w:val="000000" w:themeColor="text1"/>
-          <w:sz w:val="16"/>
-          <w:szCs w:val="16"/>
-        </w:rPr>
-      </w:pPr>
-      <w:r>
-        <w:rPr>
-          <w:rFonts w:ascii="Consolas" w:hAnsi="Consolas" w:cstheme="minorHAnsi"/>
-          <w:color w:val="000000" w:themeColor="text1"/>
-          <w:sz w:val="16"/>
-          <w:szCs w:val="16"/>
-        </w:rPr>
-        <w:t>And while runnable, it can temporarily enter:</w:t>
-      </w:r>
-    </w:p>
-    <w:p>
-      <w:pPr>
-        <w:spacing w:after="0"/>
-        <w:rPr>
-          <w:rFonts w:ascii="Consolas" w:hAnsi="Consolas" w:cstheme="minorHAnsi"/>
-          <w:b/>
-          <w:bCs/>
-          <w:color w:val="000000" w:themeColor="text1"/>
-          <w:sz w:val="16"/>
-          <w:szCs w:val="16"/>
-        </w:rPr>
-      </w:pPr>
-      <w:proofErr w:type="gramStart"/>
-      <w:r>
-        <w:rPr>
-          <w:rFonts w:ascii="Consolas" w:hAnsi="Consolas" w:cstheme="minorHAnsi"/>
-          <w:b/>
-          <w:bCs/>
-          <w:color w:val="000000" w:themeColor="text1"/>
-          <w:sz w:val="16"/>
-          <w:szCs w:val="16"/>
-        </w:rPr>
-        <w:t>WAITING</w:t>
-      </w:r>
-      <w:r>
-        <w:rPr>
-          <w:rFonts w:ascii="Consolas" w:hAnsi="Consolas" w:cstheme="minorHAnsi"/>
-          <w:color w:val="000000" w:themeColor="text1"/>
-          <w:sz w:val="16"/>
-          <w:szCs w:val="16"/>
-        </w:rPr>
-        <w:t>,</w:t>
-      </w:r>
-      <w:r>
-        <w:rPr>
-          <w:rFonts w:ascii="Consolas" w:hAnsi="Consolas" w:cstheme="minorHAnsi"/>
-          <w:b/>
-          <w:bCs/>
-          <w:color w:val="000000" w:themeColor="text1"/>
-          <w:sz w:val="16"/>
-          <w:szCs w:val="16"/>
-        </w:rPr>
-        <w:t>TIMED</w:t>
-      </w:r>
-      <w:proofErr w:type="gramEnd"/>
-      <w:r>
-        <w:rPr>
-          <w:rFonts w:ascii="Consolas" w:hAnsi="Consolas" w:cstheme="minorHAnsi"/>
-          <w:b/>
-          <w:bCs/>
-          <w:color w:val="000000" w:themeColor="text1"/>
-          <w:sz w:val="16"/>
-          <w:szCs w:val="16"/>
-        </w:rPr>
-        <w:t>_WAITING</w:t>
-      </w:r>
-      <w:r>
-        <w:rPr>
-          <w:rFonts w:ascii="Consolas" w:hAnsi="Consolas" w:cstheme="minorHAnsi"/>
-          <w:color w:val="000000" w:themeColor="text1"/>
-          <w:sz w:val="16"/>
-          <w:szCs w:val="16"/>
-        </w:rPr>
-        <w:t>,</w:t>
-      </w:r>
-      <w:r>
-        <w:rPr>
-          <w:rFonts w:ascii="Consolas" w:hAnsi="Consolas" w:cstheme="minorHAnsi"/>
-          <w:color w:val="000000" w:themeColor="text1"/>
-          <w:sz w:val="16"/>
-          <w:szCs w:val="16"/>
-        </w:rPr>
-        <w:t xml:space="preserve"> </w:t>
-      </w:r>
-      <w:r>
-        <w:rPr>
-          <w:rFonts w:ascii="Consolas" w:hAnsi="Consolas" w:cstheme="minorHAnsi"/>
-          <w:b/>
-          <w:bCs/>
-          <w:color w:val="000000" w:themeColor="text1"/>
-          <w:sz w:val="16"/>
-          <w:szCs w:val="16"/>
-        </w:rPr>
-        <w:t>BLOCKED</w:t>
-      </w:r>
-    </w:p>
-    <w:p>
-      <w:pPr>
-        <w:spacing w:after="0"/>
-        <w:rPr>
-          <w:rFonts w:ascii="Consolas" w:hAnsi="Consolas" w:cstheme="minorHAnsi"/>
-          <w:b/>
-          <w:bCs/>
-          <w:color w:val="000000" w:themeColor="text1"/>
-          <w:sz w:val="16"/>
-          <w:szCs w:val="16"/>
-        </w:rPr>
-      </w:pPr>
-    </w:p>
-    <w:p>
-      <w:pPr>
-        <w:spacing w:after="0"/>
-        <w:rPr>
-          <w:rFonts w:ascii="Consolas" w:hAnsi="Consolas" w:cstheme="minorHAnsi"/>
-          <w:color w:val="000000" w:themeColor="text1"/>
-          <w:sz w:val="16"/>
-          <w:szCs w:val="16"/>
-        </w:rPr>
-      </w:pPr>
-      <w:r>
-        <w:rPr>
-          <w:rFonts w:ascii="Consolas" w:hAnsi="Consolas" w:cstheme="minorHAnsi"/>
-          <w:color w:val="000000" w:themeColor="text1"/>
-          <w:sz w:val="16"/>
-          <w:szCs w:val="16"/>
-        </w:rPr>
-        <w:t xml:space="preserve">             ┌── BLOCKED ───────┐</w:t>
-      </w:r>
-    </w:p>
-    <w:p>
-      <w:pPr>
-        <w:spacing w:after="0"/>
-        <w:rPr>
-          <w:rFonts w:ascii="Consolas" w:hAnsi="Consolas" w:cstheme="minorHAnsi"/>
-          <w:color w:val="000000" w:themeColor="text1"/>
-          <w:sz w:val="16"/>
-          <w:szCs w:val="16"/>
-        </w:rPr>
-      </w:pPr>
-      <w:r>
-        <w:rPr>
-          <w:rFonts w:ascii="Consolas" w:hAnsi="Consolas" w:cstheme="minorHAnsi"/>
-          <w:color w:val="000000" w:themeColor="text1"/>
-          <w:sz w:val="16"/>
-          <w:szCs w:val="16"/>
-        </w:rPr>
-        <w:t xml:space="preserve">             │                  ↓</w:t>
-      </w:r>
-    </w:p>
-    <w:p>
-      <w:pPr>
-        <w:spacing w:after="0"/>
-        <w:rPr>
-          <w:rFonts w:ascii="Consolas" w:hAnsi="Consolas" w:cstheme="minorHAnsi"/>
-          <w:color w:val="000000" w:themeColor="text1"/>
-          <w:sz w:val="16"/>
-          <w:szCs w:val="16"/>
-        </w:rPr>
-      </w:pPr>
-      <w:r>
-        <w:rPr>
-          <w:rFonts w:ascii="Consolas" w:hAnsi="Consolas" w:cstheme="minorHAnsi"/>
-          <w:color w:val="000000" w:themeColor="text1"/>
-          <w:sz w:val="16"/>
-          <w:szCs w:val="16"/>
-        </w:rPr>
-        <w:t>NEW → RUNNABLE ← WAITING        │──</w:t>
-      </w:r>
-      <w:r>
-        <w:rPr>
-          <w:rFonts w:ascii="Consolas" w:hAnsi="Consolas" w:cstheme="minorHAnsi"/>
-          <w:color w:val="000000" w:themeColor="text1"/>
-          <w:sz w:val="16"/>
-          <w:szCs w:val="16"/>
-        </w:rPr>
-        <w:t xml:space="preserve">&gt; </w:t>
-      </w:r>
-      <w:r>
-        <w:rPr>
-          <w:rFonts w:ascii="Consolas" w:hAnsi="Consolas" w:cstheme="minorHAnsi"/>
-          <w:color w:val="000000" w:themeColor="text1"/>
-          <w:sz w:val="16"/>
-          <w:szCs w:val="16"/>
-        </w:rPr>
-        <w:t>TERMINATED</w:t>
-      </w:r>
-    </w:p>
-    <w:p>
-      <w:pPr>
-        <w:spacing w:after="0"/>
-        <w:rPr>
-          <w:rFonts w:ascii="Consolas" w:hAnsi="Consolas" w:cstheme="minorHAnsi"/>
-          <w:color w:val="000000" w:themeColor="text1"/>
-          <w:sz w:val="16"/>
-          <w:szCs w:val="16"/>
-        </w:rPr>
-      </w:pPr>
-      <w:r>
-        <w:rPr>
-          <w:rFonts w:ascii="Consolas" w:hAnsi="Consolas" w:cstheme="minorHAnsi"/>
-          <w:color w:val="000000" w:themeColor="text1"/>
-          <w:sz w:val="16"/>
-          <w:szCs w:val="16"/>
-        </w:rPr>
-        <w:t xml:space="preserve">             ↑                  │</w:t>
-      </w:r>
-    </w:p>
-    <w:p>
-      <w:pPr>
-        <w:spacing w:after="0"/>
-        <w:rPr>
-          <w:rFonts w:ascii="Consolas" w:hAnsi="Consolas" w:cstheme="minorHAnsi"/>
-          <w:color w:val="000000" w:themeColor="text1"/>
-          <w:sz w:val="16"/>
-          <w:szCs w:val="16"/>
-        </w:rPr>
-      </w:pPr>
-      <w:r>
-        <w:rPr>
-          <w:rFonts w:ascii="Consolas" w:hAnsi="Consolas" w:cstheme="minorHAnsi"/>
-          <w:color w:val="000000" w:themeColor="text1"/>
-          <w:sz w:val="16"/>
-          <w:szCs w:val="16"/>
-        </w:rPr>
-        <w:t xml:space="preserve">             └ TIMED_WAITING ───┘    </w:t>
-      </w:r>
-    </w:p>
-    <w:p>
-      <w:pPr>
-        <w:spacing w:after="0"/>
-        <w:rPr>
-          <w:rFonts w:ascii="Consolas" w:hAnsi="Consolas" w:cstheme="minorHAnsi"/>
-          <w:color w:val="000000" w:themeColor="text1"/>
-          <w:sz w:val="16"/>
-          <w:szCs w:val="16"/>
-        </w:rPr>
-      </w:pPr>
-    </w:p>
-    <w:p>
-      <w:pPr>
-        <w:spacing w:after="0"/>
-        <w:rPr>
-          <w:rFonts w:cstheme="minorHAnsi"/>
-          <w:color w:val="000000" w:themeColor="text1"/>
-        </w:rPr>
-      </w:pPr>
-      <w:r>
-        <w:rPr>
-          <w:rFonts w:cstheme="minorHAnsi"/>
-          <w:b/>
-          <w:bCs/>
-          <w:color w:val="000000" w:themeColor="text1"/>
-        </w:rPr>
-        <w:t>Thread communication</w:t>
-      </w:r>
-      <w:r>
-        <w:rPr>
-          <w:rFonts w:cstheme="minorHAnsi"/>
-          <w:color w:val="000000" w:themeColor="text1"/>
-        </w:rPr>
-        <w:t xml:space="preserve">: </w:t>
-      </w:r>
-    </w:p>
-    <w:p>
-      <w:pPr>
-        <w:spacing w:after="0"/>
-        <w:rPr>
-          <w:rFonts w:cstheme="minorHAnsi"/>
-          <w:color w:val="000000" w:themeColor="text1"/>
-        </w:rPr>
-      </w:pPr>
-      <w:r>
-        <w:rPr>
-          <w:rFonts w:cstheme="minorHAnsi"/>
-          <w:color w:val="000000" w:themeColor="text1"/>
-        </w:rPr>
-        <w:t xml:space="preserve">Monitor </w:t>
-      </w:r>
-      <w:proofErr w:type="gramStart"/>
-      <w:r>
-        <w:rPr>
-          <w:rFonts w:cstheme="minorHAnsi"/>
-          <w:color w:val="000000" w:themeColor="text1"/>
-        </w:rPr>
-        <w:t>Lock :</w:t>
-      </w:r>
-      <w:proofErr w:type="gramEnd"/>
-      <w:r>
-        <w:rPr>
-          <w:rFonts w:cstheme="minorHAnsi"/>
-          <w:color w:val="000000" w:themeColor="text1"/>
-        </w:rPr>
-        <w:t xml:space="preserve"> </w:t>
-      </w:r>
-      <w:r>
-        <w:rPr>
-          <w:rFonts w:cstheme="minorHAnsi"/>
-          <w:color w:val="000000" w:themeColor="text1"/>
-        </w:rPr>
-        <w:t xml:space="preserve">A </w:t>
-      </w:r>
-      <w:r>
-        <w:rPr>
-          <w:rFonts w:cstheme="minorHAnsi"/>
-          <w:b/>
-          <w:bCs/>
-          <w:color w:val="000000" w:themeColor="text1"/>
-        </w:rPr>
-        <w:t>monitor lock</w:t>
-      </w:r>
-      <w:r>
-        <w:rPr>
-          <w:rFonts w:cstheme="minorHAnsi"/>
-          <w:color w:val="000000" w:themeColor="text1"/>
-        </w:rPr>
-        <w:t xml:space="preserve"> is Java's built-in mechanism for ensuring that </w:t>
-      </w:r>
-      <w:r>
-        <w:rPr>
-          <w:rFonts w:cstheme="minorHAnsi"/>
-          <w:color w:val="000000" w:themeColor="text1"/>
-        </w:rPr>
-        <w:t xml:space="preserve">only one thread at a time can execute a </w:t>
-      </w:r>
-      <w:r>
-        <w:rPr>
-          <w:rFonts w:cstheme="minorHAnsi"/>
-          <w:b/>
-          <w:bCs/>
-          <w:color w:val="000000" w:themeColor="text1"/>
-        </w:rPr>
-        <w:t>synchronized section</w:t>
-      </w:r>
-      <w:r>
-        <w:rPr>
-          <w:rFonts w:cstheme="minorHAnsi"/>
-          <w:color w:val="000000" w:themeColor="text1"/>
-        </w:rPr>
-        <w:t xml:space="preserve"> for a particular object.</w:t>
-      </w:r>
-    </w:p>
-    <w:p>
-      <w:pPr>
-        <w:spacing w:after="0"/>
-        <w:rPr>
-          <w:rFonts w:cstheme="minorHAnsi"/>
-          <w:color w:val="000000" w:themeColor="text1"/>
-        </w:rPr>
-      </w:pPr>
-      <w:r>
-        <w:rPr>
-          <w:rFonts w:cstheme="minorHAnsi"/>
-          <w:color w:val="000000" w:themeColor="text1"/>
-        </w:rPr>
-        <w:t xml:space="preserve"> </w:t>
-      </w:r>
-      <w:r>
-        <w:rPr>
-          <w:rFonts w:cstheme="minorHAnsi"/>
-          <w:color w:val="000000" w:themeColor="text1"/>
-        </w:rPr>
-        <w:t xml:space="preserve">A </w:t>
-      </w:r>
-      <w:r>
-        <w:rPr>
-          <w:rFonts w:cstheme="minorHAnsi"/>
-          <w:b/>
-          <w:bCs/>
-          <w:color w:val="000000" w:themeColor="text1"/>
-        </w:rPr>
-        <w:t>monitor lock belongs to an object</w:t>
-      </w:r>
-      <w:r>
-        <w:rPr>
-          <w:rFonts w:cstheme="minorHAnsi"/>
-          <w:color w:val="000000" w:themeColor="text1"/>
-        </w:rPr>
-        <w:t>, not to the synchronized keyword itself.</w:t>
       </w:r>
     </w:p>
     <w:p>

</xml_diff>

<commit_message>
java interview questions modified
</commit_message>
<xml_diff>
--- a/Java/Java_notes.docx
+++ b/Java/Java_notes.docx
@@ -32535,1585 +32535,6 @@
           <w:b/>
           <w:bCs/>
           <w:color w:val="000000" w:themeColor="text1"/>
-        </w:rPr>
-      </w:pPr>
-    </w:p>
-    <w:p>
-      <w:pPr>
-        <w:spacing w:after="0"/>
-        <w:rPr>
-          <w:rFonts w:cstheme="minorHAnsi"/>
-          <w:b/>
-          <w:bCs/>
-          <w:color w:val="000000" w:themeColor="text1"/>
-        </w:rPr>
-      </w:pPr>
-      <w:r>
-        <w:rPr>
-          <w:rFonts w:cstheme="minorHAnsi"/>
-          <w:b/>
-          <w:bCs/>
-          <w:color w:val="000000" w:themeColor="text1"/>
-        </w:rPr>
-        <w:lastRenderedPageBreak/>
-        <w:t>Interview questions:</w:t>
-      </w:r>
-    </w:p>
-    <w:p>
-      <w:pPr>
-        <w:spacing w:after="0"/>
-        <w:rPr>
-          <w:rFonts w:cstheme="minorHAnsi"/>
-          <w:color w:val="000000" w:themeColor="text1"/>
-        </w:rPr>
-      </w:pPr>
-      <w:r>
-        <w:rPr>
-          <w:rFonts w:cstheme="minorHAnsi"/>
-          <w:color w:val="000000" w:themeColor="text1"/>
-        </w:rPr>
-        <w:t xml:space="preserve">1. </w:t>
-      </w:r>
-      <w:r>
-        <w:rPr>
-          <w:rFonts w:cstheme="minorHAnsi"/>
-          <w:color w:val="000000" w:themeColor="text1"/>
-        </w:rPr>
-        <w:t>Equals</w:t>
-      </w:r>
-      <w:r>
-        <w:rPr>
-          <w:rFonts w:cstheme="minorHAnsi"/>
-          <w:color w:val="000000" w:themeColor="text1"/>
-        </w:rPr>
-        <w:t>,</w:t>
-      </w:r>
-      <w:r>
-        <w:rPr>
-          <w:rFonts w:cstheme="minorHAnsi"/>
-          <w:color w:val="000000" w:themeColor="text1"/>
-        </w:rPr>
-        <w:t xml:space="preserve"> </w:t>
-      </w:r>
-      <w:proofErr w:type="spellStart"/>
-      <w:r>
-        <w:rPr>
-          <w:rFonts w:cstheme="minorHAnsi"/>
-          <w:color w:val="000000" w:themeColor="text1"/>
-        </w:rPr>
-        <w:t>hascode</w:t>
-      </w:r>
-      <w:proofErr w:type="spellEnd"/>
-      <w:r>
-        <w:rPr>
-          <w:rFonts w:cstheme="minorHAnsi"/>
-          <w:color w:val="000000" w:themeColor="text1"/>
-        </w:rPr>
-        <w:t>, ==</w:t>
-      </w:r>
-    </w:p>
-    <w:p>
-      <w:pPr>
-        <w:spacing w:after="0"/>
-        <w:rPr>
-          <w:rFonts w:cstheme="minorHAnsi"/>
-          <w:b/>
-          <w:bCs/>
-          <w:color w:val="000000" w:themeColor="text1"/>
-        </w:rPr>
-      </w:pPr>
-      <w:proofErr w:type="gramStart"/>
-      <w:r>
-        <w:rPr>
-          <w:rFonts w:cstheme="minorHAnsi"/>
-          <w:b/>
-          <w:bCs/>
-          <w:color w:val="000000" w:themeColor="text1"/>
-        </w:rPr>
-        <w:t>equals(</w:t>
-      </w:r>
-      <w:proofErr w:type="gramEnd"/>
-      <w:r>
-        <w:rPr>
-          <w:rFonts w:cstheme="minorHAnsi"/>
-          <w:b/>
-          <w:bCs/>
-          <w:color w:val="000000" w:themeColor="text1"/>
-        </w:rPr>
-        <w:t xml:space="preserve">): </w:t>
-      </w:r>
-      <w:r>
-        <w:rPr>
-          <w:rFonts w:cstheme="minorHAnsi"/>
-          <w:b/>
-          <w:bCs/>
-          <w:color w:val="000000" w:themeColor="text1"/>
-        </w:rPr>
-        <w:t>compares</w:t>
-      </w:r>
-      <w:r>
-        <w:rPr>
-          <w:rFonts w:cstheme="minorHAnsi"/>
-          <w:b/>
-          <w:bCs/>
-          <w:color w:val="000000" w:themeColor="text1"/>
-        </w:rPr>
-        <w:t xml:space="preserve"> logically </w:t>
-      </w:r>
-      <w:r>
-        <w:rPr>
-          <w:rFonts w:cstheme="minorHAnsi"/>
-          <w:b/>
-          <w:bCs/>
-          <w:color w:val="000000" w:themeColor="text1"/>
-        </w:rPr>
-        <w:t>equality / value</w:t>
-      </w:r>
-      <w:r>
-        <w:rPr>
-          <w:rFonts w:cstheme="minorHAnsi"/>
-          <w:b/>
-          <w:bCs/>
-          <w:color w:val="000000" w:themeColor="text1"/>
-        </w:rPr>
-        <w:t>?"</w:t>
-      </w:r>
-    </w:p>
-    <w:p>
-      <w:pPr>
-        <w:spacing w:after="0"/>
-        <w:rPr>
-          <w:rFonts w:cstheme="minorHAnsi"/>
-          <w:b/>
-          <w:bCs/>
-          <w:color w:val="000000" w:themeColor="text1"/>
-        </w:rPr>
-      </w:pPr>
-      <w:r>
-        <w:rPr>
-          <w:rFonts w:cstheme="minorHAnsi"/>
-          <w:b/>
-          <w:bCs/>
-          <w:color w:val="000000" w:themeColor="text1"/>
-        </w:rPr>
-        <w:t>=</w:t>
-      </w:r>
-      <w:proofErr w:type="gramStart"/>
-      <w:r>
-        <w:rPr>
-          <w:rFonts w:cstheme="minorHAnsi"/>
-          <w:b/>
-          <w:bCs/>
-          <w:color w:val="000000" w:themeColor="text1"/>
-        </w:rPr>
-        <w:t>= :</w:t>
-      </w:r>
-      <w:proofErr w:type="gramEnd"/>
-      <w:r>
-        <w:rPr>
-          <w:rFonts w:cstheme="minorHAnsi"/>
-          <w:b/>
-          <w:bCs/>
-          <w:color w:val="000000" w:themeColor="text1"/>
-        </w:rPr>
-        <w:t xml:space="preserve"> compares </w:t>
-      </w:r>
-      <w:r>
-        <w:rPr>
-          <w:rFonts w:cstheme="minorHAnsi"/>
-          <w:b/>
-          <w:bCs/>
-          <w:color w:val="000000" w:themeColor="text1"/>
-        </w:rPr>
-        <w:t xml:space="preserve">object </w:t>
-      </w:r>
-      <w:r>
-        <w:rPr>
-          <w:rFonts w:cstheme="minorHAnsi"/>
-          <w:b/>
-          <w:bCs/>
-          <w:color w:val="000000" w:themeColor="text1"/>
-        </w:rPr>
-        <w:t>reference</w:t>
-      </w:r>
-      <w:r>
-        <w:rPr>
-          <w:rFonts w:cstheme="minorHAnsi"/>
-          <w:color w:val="000000" w:themeColor="text1"/>
-        </w:rPr>
-        <w:br/>
-      </w:r>
-      <w:proofErr w:type="spellStart"/>
-      <w:proofErr w:type="gramStart"/>
-      <w:r>
-        <w:rPr>
-          <w:rFonts w:cstheme="minorHAnsi"/>
-          <w:b/>
-          <w:bCs/>
-          <w:color w:val="000000" w:themeColor="text1"/>
-        </w:rPr>
-        <w:t>hashCode</w:t>
-      </w:r>
-      <w:proofErr w:type="spellEnd"/>
-      <w:r>
-        <w:rPr>
-          <w:rFonts w:cstheme="minorHAnsi"/>
-          <w:b/>
-          <w:bCs/>
-          <w:color w:val="000000" w:themeColor="text1"/>
-        </w:rPr>
-        <w:t>(</w:t>
-      </w:r>
-      <w:proofErr w:type="gramEnd"/>
-      <w:r>
-        <w:rPr>
-          <w:rFonts w:cstheme="minorHAnsi"/>
-          <w:b/>
-          <w:bCs/>
-          <w:color w:val="000000" w:themeColor="text1"/>
-        </w:rPr>
-        <w:t>) answers: "Which hash bucket should this object belong to?"</w:t>
-      </w:r>
-    </w:p>
-    <w:p>
-      <w:pPr>
-        <w:spacing w:after="0"/>
-        <w:rPr>
-          <w:rFonts w:cstheme="minorHAnsi"/>
-          <w:color w:val="000000" w:themeColor="text1"/>
-        </w:rPr>
-      </w:pPr>
-      <w:proofErr w:type="spellStart"/>
-      <w:proofErr w:type="gramStart"/>
-      <w:r>
-        <w:rPr>
-          <w:rFonts w:cstheme="minorHAnsi"/>
-          <w:color w:val="000000" w:themeColor="text1"/>
-        </w:rPr>
-        <w:t>hashCode</w:t>
-      </w:r>
-      <w:proofErr w:type="spellEnd"/>
-      <w:r>
-        <w:rPr>
-          <w:rFonts w:cstheme="minorHAnsi"/>
-          <w:color w:val="000000" w:themeColor="text1"/>
-        </w:rPr>
-        <w:t>(</w:t>
-      </w:r>
-      <w:proofErr w:type="gramEnd"/>
-      <w:r>
-        <w:rPr>
-          <w:rFonts w:cstheme="minorHAnsi"/>
-          <w:color w:val="000000" w:themeColor="text1"/>
-        </w:rPr>
-        <w:t>) generates a hash value that hash-based collections such as HashMap and HashSet use to determine the bucket/location where an object should be stored or searched."</w:t>
-      </w:r>
-    </w:p>
-    <w:p>
-      <w:pPr>
-        <w:spacing w:after="0"/>
-        <w:rPr>
-          <w:rFonts w:cstheme="minorHAnsi"/>
-          <w:color w:val="000000" w:themeColor="text1"/>
-        </w:rPr>
-      </w:pPr>
-    </w:p>
-    <w:p>
-      <w:pPr>
-        <w:tabs>
-          <w:tab w:val="left" w:pos="10420"/>
-        </w:tabs>
-        <w:spacing w:after="0"/>
-        <w:rPr>
-          <w:rFonts w:ascii="Consolas" w:hAnsi="Consolas" w:cstheme="minorHAnsi"/>
-          <w:color w:val="000000" w:themeColor="text1"/>
-          <w:sz w:val="16"/>
-          <w:szCs w:val="16"/>
-        </w:rPr>
-      </w:pPr>
-      <w:r>
-        <w:rPr>
-          <w:rFonts w:ascii="Consolas" w:hAnsi="Consolas" w:cstheme="minorHAnsi"/>
-          <w:color w:val="000000" w:themeColor="text1"/>
-          <w:sz w:val="16"/>
-          <w:szCs w:val="16"/>
-        </w:rPr>
-        <w:t xml:space="preserve">If </w:t>
-      </w:r>
-      <w:proofErr w:type="spellStart"/>
-      <w:proofErr w:type="gramStart"/>
-      <w:r>
-        <w:rPr>
-          <w:rFonts w:ascii="Consolas" w:hAnsi="Consolas" w:cstheme="minorHAnsi"/>
-          <w:color w:val="000000" w:themeColor="text1"/>
-          <w:sz w:val="16"/>
-          <w:szCs w:val="16"/>
-        </w:rPr>
-        <w:t>a.equals</w:t>
-      </w:r>
-      <w:proofErr w:type="spellEnd"/>
-      <w:proofErr w:type="gramEnd"/>
-      <w:r>
-        <w:rPr>
-          <w:rFonts w:ascii="Consolas" w:hAnsi="Consolas" w:cstheme="minorHAnsi"/>
-          <w:color w:val="000000" w:themeColor="text1"/>
-          <w:sz w:val="16"/>
-          <w:szCs w:val="16"/>
-        </w:rPr>
-        <w:t xml:space="preserve">(b) is true, then </w:t>
-      </w:r>
-      <w:proofErr w:type="spellStart"/>
-      <w:proofErr w:type="gramStart"/>
-      <w:r>
-        <w:rPr>
-          <w:rFonts w:ascii="Consolas" w:hAnsi="Consolas" w:cstheme="minorHAnsi"/>
-          <w:color w:val="000000" w:themeColor="text1"/>
-          <w:sz w:val="16"/>
-          <w:szCs w:val="16"/>
-        </w:rPr>
-        <w:t>a.hashCode</w:t>
-      </w:r>
-      <w:proofErr w:type="spellEnd"/>
-      <w:proofErr w:type="gramEnd"/>
-      <w:r>
-        <w:rPr>
-          <w:rFonts w:ascii="Consolas" w:hAnsi="Consolas" w:cstheme="minorHAnsi"/>
-          <w:color w:val="000000" w:themeColor="text1"/>
-          <w:sz w:val="16"/>
-          <w:szCs w:val="16"/>
-        </w:rPr>
-        <w:t xml:space="preserve">() MUST equal </w:t>
-      </w:r>
-      <w:proofErr w:type="spellStart"/>
-      <w:proofErr w:type="gramStart"/>
-      <w:r>
-        <w:rPr>
-          <w:rFonts w:ascii="Consolas" w:hAnsi="Consolas" w:cstheme="minorHAnsi"/>
-          <w:color w:val="000000" w:themeColor="text1"/>
-          <w:sz w:val="16"/>
-          <w:szCs w:val="16"/>
-        </w:rPr>
-        <w:t>b.hashCode</w:t>
-      </w:r>
-      <w:proofErr w:type="spellEnd"/>
-      <w:proofErr w:type="gramEnd"/>
-      <w:r>
-        <w:rPr>
-          <w:rFonts w:ascii="Consolas" w:hAnsi="Consolas" w:cstheme="minorHAnsi"/>
-          <w:color w:val="000000" w:themeColor="text1"/>
-          <w:sz w:val="16"/>
-          <w:szCs w:val="16"/>
-        </w:rPr>
-        <w:t>().</w:t>
-      </w:r>
-    </w:p>
-    <w:p>
-      <w:pPr>
-        <w:tabs>
-          <w:tab w:val="left" w:pos="10420"/>
-        </w:tabs>
-        <w:spacing w:after="0"/>
-        <w:rPr>
-          <w:rFonts w:ascii="Consolas" w:hAnsi="Consolas" w:cstheme="minorHAnsi"/>
-          <w:color w:val="000000" w:themeColor="text1"/>
-          <w:sz w:val="16"/>
-          <w:szCs w:val="16"/>
-        </w:rPr>
-      </w:pPr>
-    </w:p>
-    <w:p>
-      <w:pPr>
-        <w:tabs>
-          <w:tab w:val="left" w:pos="10420"/>
-        </w:tabs>
-        <w:spacing w:after="0"/>
-        <w:rPr>
-          <w:rFonts w:ascii="Consolas" w:hAnsi="Consolas" w:cstheme="minorHAnsi"/>
-          <w:color w:val="000000" w:themeColor="text1"/>
-          <w:sz w:val="16"/>
-          <w:szCs w:val="16"/>
-        </w:rPr>
-      </w:pPr>
-      <w:r>
-        <w:rPr>
-          <w:rFonts w:ascii="Consolas" w:hAnsi="Consolas" w:cstheme="minorHAnsi"/>
-          <w:color w:val="000000" w:themeColor="text1"/>
-          <w:sz w:val="16"/>
-          <w:szCs w:val="16"/>
-        </w:rPr>
-        <w:t xml:space="preserve">String a = new </w:t>
-      </w:r>
-      <w:proofErr w:type="gramStart"/>
-      <w:r>
-        <w:rPr>
-          <w:rFonts w:ascii="Consolas" w:hAnsi="Consolas" w:cstheme="minorHAnsi"/>
-          <w:color w:val="000000" w:themeColor="text1"/>
-          <w:sz w:val="16"/>
-          <w:szCs w:val="16"/>
-        </w:rPr>
-        <w:t>String(</w:t>
-      </w:r>
-      <w:proofErr w:type="gramEnd"/>
-      <w:r>
-        <w:rPr>
-          <w:rFonts w:ascii="Consolas" w:hAnsi="Consolas" w:cstheme="minorHAnsi"/>
-          <w:color w:val="000000" w:themeColor="text1"/>
-          <w:sz w:val="16"/>
-          <w:szCs w:val="16"/>
-        </w:rPr>
-        <w:t>"10");</w:t>
-      </w:r>
-    </w:p>
-    <w:p>
-      <w:pPr>
-        <w:tabs>
-          <w:tab w:val="left" w:pos="10420"/>
-        </w:tabs>
-        <w:spacing w:after="0"/>
-        <w:rPr>
-          <w:rFonts w:ascii="Consolas" w:hAnsi="Consolas" w:cstheme="minorHAnsi"/>
-          <w:color w:val="000000" w:themeColor="text1"/>
-          <w:sz w:val="16"/>
-          <w:szCs w:val="16"/>
-        </w:rPr>
-      </w:pPr>
-      <w:r>
-        <w:rPr>
-          <w:rFonts w:ascii="Consolas" w:hAnsi="Consolas" w:cstheme="minorHAnsi"/>
-          <w:color w:val="000000" w:themeColor="text1"/>
-          <w:sz w:val="16"/>
-          <w:szCs w:val="16"/>
-        </w:rPr>
-        <w:t xml:space="preserve">String b = new </w:t>
-      </w:r>
-      <w:proofErr w:type="gramStart"/>
-      <w:r>
-        <w:rPr>
-          <w:rFonts w:ascii="Consolas" w:hAnsi="Consolas" w:cstheme="minorHAnsi"/>
-          <w:color w:val="000000" w:themeColor="text1"/>
-          <w:sz w:val="16"/>
-          <w:szCs w:val="16"/>
-        </w:rPr>
-        <w:t>String(</w:t>
-      </w:r>
-      <w:proofErr w:type="gramEnd"/>
-      <w:r>
-        <w:rPr>
-          <w:rFonts w:ascii="Consolas" w:hAnsi="Consolas" w:cstheme="minorHAnsi"/>
-          <w:color w:val="000000" w:themeColor="text1"/>
-          <w:sz w:val="16"/>
-          <w:szCs w:val="16"/>
-        </w:rPr>
-        <w:t>"10");</w:t>
-      </w:r>
-    </w:p>
-    <w:p>
-      <w:pPr>
-        <w:tabs>
-          <w:tab w:val="left" w:pos="10420"/>
-        </w:tabs>
-        <w:spacing w:after="0"/>
-        <w:rPr>
-          <w:rFonts w:ascii="Consolas" w:hAnsi="Consolas" w:cstheme="minorHAnsi"/>
-          <w:color w:val="000000" w:themeColor="text1"/>
-          <w:sz w:val="16"/>
-          <w:szCs w:val="16"/>
-        </w:rPr>
-      </w:pPr>
-    </w:p>
-    <w:p>
-      <w:pPr>
-        <w:tabs>
-          <w:tab w:val="left" w:pos="10420"/>
-        </w:tabs>
-        <w:spacing w:after="0"/>
-        <w:rPr>
-          <w:rFonts w:ascii="Consolas" w:hAnsi="Consolas" w:cstheme="minorHAnsi"/>
-          <w:color w:val="000000" w:themeColor="text1"/>
-          <w:sz w:val="16"/>
-          <w:szCs w:val="16"/>
-        </w:rPr>
-      </w:pPr>
-      <w:proofErr w:type="spellStart"/>
-      <w:r>
-        <w:rPr>
-          <w:rFonts w:ascii="Consolas" w:hAnsi="Consolas" w:cstheme="minorHAnsi"/>
-          <w:color w:val="000000" w:themeColor="text1"/>
-          <w:sz w:val="16"/>
-          <w:szCs w:val="16"/>
-        </w:rPr>
-        <w:t>System.out.println</w:t>
-      </w:r>
-      <w:proofErr w:type="spellEnd"/>
-      <w:r>
-        <w:rPr>
-          <w:rFonts w:ascii="Consolas" w:hAnsi="Consolas" w:cstheme="minorHAnsi"/>
-          <w:color w:val="000000" w:themeColor="text1"/>
-          <w:sz w:val="16"/>
-          <w:szCs w:val="16"/>
-        </w:rPr>
-        <w:t>(</w:t>
-      </w:r>
-      <w:proofErr w:type="spellStart"/>
-      <w:proofErr w:type="gramStart"/>
-      <w:r>
-        <w:rPr>
-          <w:rFonts w:ascii="Consolas" w:hAnsi="Consolas" w:cstheme="minorHAnsi"/>
-          <w:color w:val="000000" w:themeColor="text1"/>
-          <w:sz w:val="16"/>
-          <w:szCs w:val="16"/>
-        </w:rPr>
-        <w:t>a.equals</w:t>
-      </w:r>
-      <w:proofErr w:type="spellEnd"/>
-      <w:proofErr w:type="gramEnd"/>
-      <w:r>
-        <w:rPr>
-          <w:rFonts w:ascii="Consolas" w:hAnsi="Consolas" w:cstheme="minorHAnsi"/>
-          <w:color w:val="000000" w:themeColor="text1"/>
-          <w:sz w:val="16"/>
-          <w:szCs w:val="16"/>
-        </w:rPr>
-        <w:t>(b)); // true</w:t>
-      </w:r>
-    </w:p>
-    <w:p>
-      <w:pPr>
-        <w:tabs>
-          <w:tab w:val="left" w:pos="10420"/>
-        </w:tabs>
-        <w:spacing w:after="0"/>
-        <w:rPr>
-          <w:rFonts w:ascii="Consolas" w:hAnsi="Consolas" w:cstheme="minorHAnsi"/>
-          <w:color w:val="000000" w:themeColor="text1"/>
-          <w:sz w:val="16"/>
-          <w:szCs w:val="16"/>
-        </w:rPr>
-      </w:pPr>
-      <w:proofErr w:type="spellStart"/>
-      <w:r>
-        <w:rPr>
-          <w:rFonts w:ascii="Consolas" w:hAnsi="Consolas" w:cstheme="minorHAnsi"/>
-          <w:color w:val="000000" w:themeColor="text1"/>
-          <w:sz w:val="16"/>
-          <w:szCs w:val="16"/>
-        </w:rPr>
-        <w:t>System.out.println</w:t>
-      </w:r>
-      <w:proofErr w:type="spellEnd"/>
-      <w:r>
-        <w:rPr>
-          <w:rFonts w:ascii="Consolas" w:hAnsi="Consolas" w:cstheme="minorHAnsi"/>
-          <w:color w:val="000000" w:themeColor="text1"/>
-          <w:sz w:val="16"/>
-          <w:szCs w:val="16"/>
-        </w:rPr>
-        <w:t>(a == b</w:t>
-      </w:r>
-      <w:proofErr w:type="gramStart"/>
-      <w:r>
-        <w:rPr>
-          <w:rFonts w:ascii="Consolas" w:hAnsi="Consolas" w:cstheme="minorHAnsi"/>
-          <w:color w:val="000000" w:themeColor="text1"/>
-          <w:sz w:val="16"/>
-          <w:szCs w:val="16"/>
-        </w:rPr>
-        <w:t xml:space="preserve">);   </w:t>
-      </w:r>
-      <w:proofErr w:type="gramEnd"/>
-      <w:r>
-        <w:rPr>
-          <w:rFonts w:ascii="Consolas" w:hAnsi="Consolas" w:cstheme="minorHAnsi"/>
-          <w:color w:val="000000" w:themeColor="text1"/>
-          <w:sz w:val="16"/>
-          <w:szCs w:val="16"/>
-        </w:rPr>
-        <w:t xml:space="preserve">   // false</w:t>
-      </w:r>
-    </w:p>
-    <w:p>
-      <w:pPr>
-        <w:tabs>
-          <w:tab w:val="left" w:pos="10420"/>
-        </w:tabs>
-        <w:spacing w:after="0"/>
-        <w:rPr>
-          <w:rFonts w:cstheme="minorHAnsi"/>
-          <w:color w:val="000000" w:themeColor="text1"/>
-        </w:rPr>
-      </w:pPr>
-      <w:r>
-        <w:rPr>
-          <w:rFonts w:cstheme="minorHAnsi"/>
-          <w:color w:val="000000" w:themeColor="text1"/>
-        </w:rPr>
-        <w:t>2.</w:t>
-      </w:r>
-    </w:p>
-    <w:p>
-      <w:pPr>
-        <w:tabs>
-          <w:tab w:val="left" w:pos="10420"/>
-        </w:tabs>
-        <w:spacing w:after="0"/>
-        <w:rPr>
-          <w:rFonts w:cstheme="minorHAnsi"/>
-          <w:b/>
-          <w:bCs/>
-          <w:color w:val="000000" w:themeColor="text1"/>
-        </w:rPr>
-      </w:pPr>
-      <w:r>
-        <w:rPr>
-          <w:rFonts w:cstheme="minorHAnsi"/>
-          <w:b/>
-          <w:bCs/>
-          <w:color w:val="000000" w:themeColor="text1"/>
-        </w:rPr>
-        <w:t>HashMap → fast but unsafe</w:t>
-      </w:r>
-      <w:r>
-        <w:rPr>
-          <w:rFonts w:cstheme="minorHAnsi"/>
-          <w:color w:val="000000" w:themeColor="text1"/>
-        </w:rPr>
-        <w:br/>
-      </w:r>
-      <w:proofErr w:type="spellStart"/>
-      <w:r>
-        <w:rPr>
-          <w:rFonts w:cstheme="minorHAnsi"/>
-          <w:b/>
-          <w:bCs/>
-          <w:color w:val="000000" w:themeColor="text1"/>
-        </w:rPr>
-        <w:t>Hashtable</w:t>
-      </w:r>
-      <w:proofErr w:type="spellEnd"/>
-      <w:r>
-        <w:rPr>
-          <w:rFonts w:cstheme="minorHAnsi"/>
-          <w:b/>
-          <w:bCs/>
-          <w:color w:val="000000" w:themeColor="text1"/>
-        </w:rPr>
-        <w:t xml:space="preserve"> → safe but coarse-grained locking</w:t>
-      </w:r>
-      <w:r>
-        <w:rPr>
-          <w:rFonts w:cstheme="minorHAnsi"/>
-          <w:color w:val="000000" w:themeColor="text1"/>
-        </w:rPr>
-        <w:br/>
-      </w:r>
-      <w:proofErr w:type="spellStart"/>
-      <w:r>
-        <w:rPr>
-          <w:rFonts w:cstheme="minorHAnsi"/>
-          <w:b/>
-          <w:bCs/>
-          <w:color w:val="000000" w:themeColor="text1"/>
-        </w:rPr>
-        <w:t>ConcurrentHashMap</w:t>
-      </w:r>
-      <w:proofErr w:type="spellEnd"/>
-      <w:r>
-        <w:rPr>
-          <w:rFonts w:cstheme="minorHAnsi"/>
-          <w:b/>
-          <w:bCs/>
-          <w:color w:val="000000" w:themeColor="text1"/>
-        </w:rPr>
-        <w:t xml:space="preserve"> → safe + designed for high concurrency</w:t>
-      </w:r>
-    </w:p>
-    <w:p>
-      <w:pPr>
-        <w:tabs>
-          <w:tab w:val="left" w:pos="10420"/>
-        </w:tabs>
-        <w:spacing w:after="0"/>
-        <w:rPr>
-          <w:rFonts w:cstheme="minorHAnsi"/>
-          <w:b/>
-          <w:bCs/>
-          <w:color w:val="000000" w:themeColor="text1"/>
-        </w:rPr>
-      </w:pPr>
-    </w:p>
-    <w:p>
-      <w:pPr>
-        <w:tabs>
-          <w:tab w:val="left" w:pos="10420"/>
-        </w:tabs>
-        <w:spacing w:after="0"/>
-        <w:rPr>
-          <w:rFonts w:cstheme="minorHAnsi"/>
-          <w:color w:val="000000" w:themeColor="text1"/>
-        </w:rPr>
-      </w:pPr>
-      <w:r>
-        <w:rPr>
-          <w:rFonts w:cstheme="minorHAnsi"/>
-          <w:color w:val="000000" w:themeColor="text1"/>
-        </w:rPr>
-        <w:t>3.</w:t>
-      </w:r>
-      <w:r>
-        <w:rPr>
-          <w:rFonts w:cstheme="minorHAnsi"/>
-          <w:color w:val="000000" w:themeColor="text1"/>
-        </w:rPr>
-        <w:br/>
-      </w:r>
-      <w:r>
-        <w:rPr>
-          <w:rFonts w:cstheme="minorHAnsi"/>
-          <w:b/>
-          <w:bCs/>
-          <w:color w:val="000000" w:themeColor="text1"/>
-        </w:rPr>
-        <w:t xml:space="preserve">String → </w:t>
-      </w:r>
-      <w:r>
-        <w:rPr>
-          <w:rFonts w:cstheme="minorHAnsi"/>
-          <w:color w:val="000000" w:themeColor="text1"/>
-        </w:rPr>
-        <w:t>immutable</w:t>
-      </w:r>
-      <w:r>
-        <w:rPr>
-          <w:rFonts w:cstheme="minorHAnsi"/>
-          <w:color w:val="000000" w:themeColor="text1"/>
-        </w:rPr>
-        <w:br/>
-      </w:r>
-      <w:r>
-        <w:rPr>
-          <w:rFonts w:cstheme="minorHAnsi"/>
-          <w:b/>
-          <w:bCs/>
-          <w:color w:val="000000" w:themeColor="text1"/>
-        </w:rPr>
-        <w:t xml:space="preserve">StringBuilder → </w:t>
-      </w:r>
-      <w:r>
-        <w:rPr>
-          <w:rFonts w:cstheme="minorHAnsi"/>
-          <w:color w:val="000000" w:themeColor="text1"/>
-        </w:rPr>
-        <w:t>mutable, not thread-safe, preferred for normal manipulation</w:t>
-      </w:r>
-      <w:r>
-        <w:rPr>
-          <w:rFonts w:cstheme="minorHAnsi"/>
-          <w:color w:val="000000" w:themeColor="text1"/>
-        </w:rPr>
-        <w:br/>
-      </w:r>
-      <w:proofErr w:type="spellStart"/>
-      <w:r>
-        <w:rPr>
-          <w:rFonts w:cstheme="minorHAnsi"/>
-          <w:b/>
-          <w:bCs/>
-          <w:color w:val="000000" w:themeColor="text1"/>
-        </w:rPr>
-        <w:t>StringBuffer</w:t>
-      </w:r>
-      <w:proofErr w:type="spellEnd"/>
-      <w:r>
-        <w:rPr>
-          <w:rFonts w:cstheme="minorHAnsi"/>
-          <w:b/>
-          <w:bCs/>
-          <w:color w:val="000000" w:themeColor="text1"/>
-        </w:rPr>
-        <w:t xml:space="preserve"> → </w:t>
-      </w:r>
-      <w:r>
-        <w:rPr>
-          <w:rFonts w:cstheme="minorHAnsi"/>
-          <w:color w:val="000000" w:themeColor="text1"/>
-        </w:rPr>
-        <w:t>mutable, synchronized/thread-safe, legacy/specialized use case</w:t>
-      </w:r>
-    </w:p>
-    <w:p>
-      <w:pPr>
-        <w:tabs>
-          <w:tab w:val="left" w:pos="10420"/>
-        </w:tabs>
-        <w:spacing w:after="0"/>
-        <w:rPr>
-          <w:rFonts w:cstheme="minorHAnsi"/>
-          <w:color w:val="000000" w:themeColor="text1"/>
-        </w:rPr>
-      </w:pPr>
-      <w:r>
-        <w:rPr>
-          <w:rFonts w:cstheme="minorHAnsi"/>
-          <w:color w:val="000000" w:themeColor="text1"/>
-        </w:rPr>
-        <w:t xml:space="preserve">4. </w:t>
-      </w:r>
-      <w:r>
-        <w:rPr>
-          <w:rFonts w:cstheme="minorHAnsi"/>
-          <w:color w:val="000000" w:themeColor="text1"/>
-        </w:rPr>
-        <w:t>ExecutorService</w:t>
-      </w:r>
-      <w:r>
-        <w:rPr>
-          <w:rFonts w:cstheme="minorHAnsi"/>
-          <w:color w:val="000000" w:themeColor="text1"/>
-        </w:rPr>
-        <w:t xml:space="preserve"> (see above note)</w:t>
-      </w:r>
-    </w:p>
-    <w:p>
-      <w:pPr>
-        <w:tabs>
-          <w:tab w:val="left" w:pos="10420"/>
-        </w:tabs>
-        <w:spacing w:after="0"/>
-        <w:rPr>
-          <w:rFonts w:cstheme="minorHAnsi"/>
-          <w:color w:val="000000" w:themeColor="text1"/>
-        </w:rPr>
-      </w:pPr>
-      <w:r>
-        <w:rPr>
-          <w:rFonts w:cstheme="minorHAnsi"/>
-          <w:color w:val="000000" w:themeColor="text1"/>
-        </w:rPr>
-        <w:t xml:space="preserve">5. </w:t>
-      </w:r>
-    </w:p>
-    <w:p>
-      <w:pPr>
-        <w:tabs>
-          <w:tab w:val="left" w:pos="10420"/>
-        </w:tabs>
-        <w:spacing w:after="0"/>
-        <w:rPr>
-          <w:rFonts w:cstheme="minorHAnsi"/>
-          <w:color w:val="000000" w:themeColor="text1"/>
-        </w:rPr>
-      </w:pPr>
-      <w:r>
-        <w:rPr>
-          <w:rFonts w:cstheme="minorHAnsi"/>
-          <w:b/>
-          <w:bCs/>
-          <w:color w:val="000000" w:themeColor="text1"/>
-        </w:rPr>
-        <w:t xml:space="preserve">final → </w:t>
-      </w:r>
-      <w:r>
-        <w:rPr>
-          <w:rFonts w:cstheme="minorHAnsi"/>
-          <w:color w:val="000000" w:themeColor="text1"/>
-        </w:rPr>
-        <w:t>restrict/change</w:t>
-      </w:r>
-    </w:p>
-    <w:p>
-      <w:pPr>
-        <w:tabs>
-          <w:tab w:val="left" w:pos="10420"/>
-        </w:tabs>
-        <w:spacing w:after="0"/>
-        <w:rPr>
-          <w:rFonts w:cstheme="minorHAnsi"/>
-          <w:color w:val="000000" w:themeColor="text1"/>
-          <w:sz w:val="22"/>
-          <w:szCs w:val="22"/>
-        </w:rPr>
-      </w:pPr>
-      <w:r>
-        <w:rPr>
-          <w:rFonts w:cstheme="minorHAnsi"/>
-          <w:color w:val="000000" w:themeColor="text1"/>
-          <w:sz w:val="22"/>
-          <w:szCs w:val="22"/>
-        </w:rPr>
-        <w:t>final is used to prevent modification, method overriding, or inheritance depending on whether it is applied to a variable, method, or class.</w:t>
-      </w:r>
-    </w:p>
-    <w:p>
-      <w:pPr>
-        <w:tabs>
-          <w:tab w:val="left" w:pos="10420"/>
-        </w:tabs>
-        <w:spacing w:after="0"/>
-        <w:rPr>
-          <w:rFonts w:ascii="Consolas" w:hAnsi="Consolas" w:cstheme="minorHAnsi"/>
-          <w:color w:val="000000" w:themeColor="text1"/>
-          <w:sz w:val="16"/>
-          <w:szCs w:val="16"/>
-        </w:rPr>
-      </w:pPr>
-      <w:r>
-        <w:rPr>
-          <w:rFonts w:ascii="Consolas" w:hAnsi="Consolas" w:cstheme="minorHAnsi"/>
-          <w:color w:val="000000" w:themeColor="text1"/>
-          <w:sz w:val="16"/>
-          <w:szCs w:val="16"/>
-        </w:rPr>
-        <w:t>class Parent {</w:t>
-      </w:r>
-    </w:p>
-    <w:p>
-      <w:pPr>
-        <w:tabs>
-          <w:tab w:val="left" w:pos="10420"/>
-        </w:tabs>
-        <w:spacing w:after="0"/>
-        <w:rPr>
-          <w:rFonts w:ascii="Consolas" w:hAnsi="Consolas" w:cstheme="minorHAnsi"/>
-          <w:color w:val="000000" w:themeColor="text1"/>
-          <w:sz w:val="16"/>
-          <w:szCs w:val="16"/>
-        </w:rPr>
-      </w:pPr>
-      <w:r>
-        <w:rPr>
-          <w:rFonts w:ascii="Consolas" w:hAnsi="Consolas" w:cstheme="minorHAnsi"/>
-          <w:color w:val="000000" w:themeColor="text1"/>
-          <w:sz w:val="16"/>
-          <w:szCs w:val="16"/>
-        </w:rPr>
-        <w:t xml:space="preserve">   </w:t>
-      </w:r>
-      <w:r>
-        <w:rPr>
-          <w:rFonts w:ascii="Consolas" w:hAnsi="Consolas" w:cstheme="minorHAnsi"/>
-          <w:b/>
-          <w:bCs/>
-          <w:color w:val="000000" w:themeColor="text1"/>
-          <w:sz w:val="16"/>
-          <w:szCs w:val="16"/>
-        </w:rPr>
-        <w:t>final</w:t>
-      </w:r>
-      <w:r>
-        <w:rPr>
-          <w:rFonts w:ascii="Consolas" w:hAnsi="Consolas" w:cstheme="minorHAnsi"/>
-          <w:color w:val="000000" w:themeColor="text1"/>
-          <w:sz w:val="16"/>
-          <w:szCs w:val="16"/>
-        </w:rPr>
-        <w:t xml:space="preserve"> int x = 10;</w:t>
-      </w:r>
-    </w:p>
-    <w:p>
-      <w:pPr>
-        <w:tabs>
-          <w:tab w:val="left" w:pos="10420"/>
-        </w:tabs>
-        <w:spacing w:after="0"/>
-        <w:rPr>
-          <w:rFonts w:ascii="Consolas" w:hAnsi="Consolas" w:cs="Segoe UI Emoji"/>
-          <w:color w:val="EE0000"/>
-          <w:sz w:val="16"/>
-          <w:szCs w:val="16"/>
-        </w:rPr>
-      </w:pPr>
-      <w:r>
-        <w:rPr>
-          <w:rFonts w:ascii="Consolas" w:hAnsi="Consolas" w:cstheme="minorHAnsi"/>
-          <w:color w:val="000000" w:themeColor="text1"/>
-          <w:sz w:val="16"/>
-          <w:szCs w:val="16"/>
-        </w:rPr>
-        <w:t xml:space="preserve">    </w:t>
-      </w:r>
-      <w:r>
-        <w:rPr>
-          <w:rFonts w:ascii="Consolas" w:hAnsi="Consolas" w:cstheme="minorHAnsi"/>
-          <w:color w:val="000000" w:themeColor="text1"/>
-          <w:sz w:val="16"/>
-          <w:szCs w:val="16"/>
-        </w:rPr>
-        <w:t xml:space="preserve">x = 20; // </w:t>
-      </w:r>
-      <w:r>
-        <w:rPr>
-          <w:rFonts w:ascii="Segoe UI Emoji" w:hAnsi="Segoe UI Emoji" w:cs="Segoe UI Emoji"/>
-          <w:color w:val="EE0000"/>
-          <w:sz w:val="16"/>
-          <w:szCs w:val="16"/>
-        </w:rPr>
-        <w:t>❌</w:t>
-      </w:r>
-    </w:p>
-    <w:p>
-      <w:pPr>
-        <w:tabs>
-          <w:tab w:val="left" w:pos="10420"/>
-        </w:tabs>
-        <w:spacing w:after="0"/>
-        <w:rPr>
-          <w:rFonts w:ascii="Consolas" w:hAnsi="Consolas" w:cstheme="minorHAnsi"/>
-          <w:color w:val="000000" w:themeColor="text1"/>
-          <w:sz w:val="16"/>
-          <w:szCs w:val="16"/>
-        </w:rPr>
-      </w:pPr>
-    </w:p>
-    <w:p>
-      <w:pPr>
-        <w:tabs>
-          <w:tab w:val="left" w:pos="10420"/>
-        </w:tabs>
-        <w:spacing w:after="0"/>
-        <w:rPr>
-          <w:rFonts w:ascii="Consolas" w:hAnsi="Consolas" w:cstheme="minorHAnsi"/>
-          <w:color w:val="000000" w:themeColor="text1"/>
-          <w:sz w:val="16"/>
-          <w:szCs w:val="16"/>
-        </w:rPr>
-      </w:pPr>
-      <w:r>
-        <w:rPr>
-          <w:rFonts w:ascii="Consolas" w:hAnsi="Consolas" w:cstheme="minorHAnsi"/>
-          <w:color w:val="000000" w:themeColor="text1"/>
-          <w:sz w:val="16"/>
-          <w:szCs w:val="16"/>
-        </w:rPr>
-        <w:t xml:space="preserve">    </w:t>
-      </w:r>
-      <w:r>
-        <w:rPr>
-          <w:rFonts w:ascii="Consolas" w:hAnsi="Consolas" w:cstheme="minorHAnsi"/>
-          <w:b/>
-          <w:bCs/>
-          <w:color w:val="000000" w:themeColor="text1"/>
-          <w:sz w:val="16"/>
-          <w:szCs w:val="16"/>
-        </w:rPr>
-        <w:t>final</w:t>
-      </w:r>
-      <w:r>
-        <w:rPr>
-          <w:rFonts w:ascii="Consolas" w:hAnsi="Consolas" w:cstheme="minorHAnsi"/>
-          <w:color w:val="000000" w:themeColor="text1"/>
-          <w:sz w:val="16"/>
-          <w:szCs w:val="16"/>
-        </w:rPr>
-        <w:t xml:space="preserve"> void </w:t>
-      </w:r>
-      <w:proofErr w:type="gramStart"/>
-      <w:r>
-        <w:rPr>
-          <w:rFonts w:ascii="Consolas" w:hAnsi="Consolas" w:cstheme="minorHAnsi"/>
-          <w:color w:val="000000" w:themeColor="text1"/>
-          <w:sz w:val="16"/>
-          <w:szCs w:val="16"/>
-        </w:rPr>
-        <w:t>show(</w:t>
-      </w:r>
-      <w:proofErr w:type="gramEnd"/>
-      <w:r>
-        <w:rPr>
-          <w:rFonts w:ascii="Consolas" w:hAnsi="Consolas" w:cstheme="minorHAnsi"/>
-          <w:color w:val="000000" w:themeColor="text1"/>
-          <w:sz w:val="16"/>
-          <w:szCs w:val="16"/>
-        </w:rPr>
-        <w:t>) {</w:t>
-      </w:r>
-    </w:p>
-    <w:p>
-      <w:pPr>
-        <w:tabs>
-          <w:tab w:val="left" w:pos="10420"/>
-        </w:tabs>
-        <w:spacing w:after="0"/>
-        <w:rPr>
-          <w:rFonts w:ascii="Consolas" w:hAnsi="Consolas" w:cstheme="minorHAnsi"/>
-          <w:color w:val="000000" w:themeColor="text1"/>
-          <w:sz w:val="16"/>
-          <w:szCs w:val="16"/>
-        </w:rPr>
-      </w:pPr>
-      <w:r>
-        <w:rPr>
-          <w:rFonts w:ascii="Consolas" w:hAnsi="Consolas" w:cstheme="minorHAnsi"/>
-          <w:color w:val="000000" w:themeColor="text1"/>
-          <w:sz w:val="16"/>
-          <w:szCs w:val="16"/>
-        </w:rPr>
-        <w:t xml:space="preserve">        </w:t>
-      </w:r>
-      <w:proofErr w:type="spellStart"/>
-      <w:r>
-        <w:rPr>
-          <w:rFonts w:ascii="Consolas" w:hAnsi="Consolas" w:cstheme="minorHAnsi"/>
-          <w:color w:val="000000" w:themeColor="text1"/>
-          <w:sz w:val="16"/>
-          <w:szCs w:val="16"/>
-        </w:rPr>
-        <w:t>System.out.println</w:t>
-      </w:r>
-      <w:proofErr w:type="spellEnd"/>
-      <w:r>
-        <w:rPr>
-          <w:rFonts w:ascii="Consolas" w:hAnsi="Consolas" w:cstheme="minorHAnsi"/>
-          <w:color w:val="000000" w:themeColor="text1"/>
-          <w:sz w:val="16"/>
-          <w:szCs w:val="16"/>
-        </w:rPr>
-        <w:t>("Hello");</w:t>
-      </w:r>
-    </w:p>
-    <w:p>
-      <w:pPr>
-        <w:tabs>
-          <w:tab w:val="left" w:pos="10420"/>
-        </w:tabs>
-        <w:spacing w:after="0"/>
-        <w:rPr>
-          <w:rFonts w:ascii="Consolas" w:hAnsi="Consolas" w:cstheme="minorHAnsi"/>
-          <w:color w:val="000000" w:themeColor="text1"/>
-          <w:sz w:val="16"/>
-          <w:szCs w:val="16"/>
-        </w:rPr>
-      </w:pPr>
-      <w:r>
-        <w:rPr>
-          <w:rFonts w:ascii="Consolas" w:hAnsi="Consolas" w:cstheme="minorHAnsi"/>
-          <w:color w:val="000000" w:themeColor="text1"/>
-          <w:sz w:val="16"/>
-          <w:szCs w:val="16"/>
-        </w:rPr>
-        <w:t xml:space="preserve">    }</w:t>
-      </w:r>
-    </w:p>
-    <w:p>
-      <w:pPr>
-        <w:tabs>
-          <w:tab w:val="left" w:pos="10420"/>
-        </w:tabs>
-        <w:spacing w:after="0"/>
-        <w:rPr>
-          <w:rFonts w:ascii="Consolas" w:hAnsi="Consolas" w:cstheme="minorHAnsi"/>
-          <w:color w:val="000000" w:themeColor="text1"/>
-          <w:sz w:val="16"/>
-          <w:szCs w:val="16"/>
-        </w:rPr>
-      </w:pPr>
-      <w:r>
-        <w:rPr>
-          <w:rFonts w:ascii="Consolas" w:hAnsi="Consolas" w:cstheme="minorHAnsi"/>
-          <w:color w:val="000000" w:themeColor="text1"/>
-          <w:sz w:val="16"/>
-          <w:szCs w:val="16"/>
-        </w:rPr>
-        <w:t>}</w:t>
-      </w:r>
-    </w:p>
-    <w:p>
-      <w:pPr>
-        <w:tabs>
-          <w:tab w:val="left" w:pos="10420"/>
-        </w:tabs>
-        <w:spacing w:after="0"/>
-        <w:rPr>
-          <w:rFonts w:ascii="Consolas" w:hAnsi="Consolas" w:cstheme="minorHAnsi"/>
-          <w:color w:val="000000" w:themeColor="text1"/>
-          <w:sz w:val="16"/>
-          <w:szCs w:val="16"/>
-        </w:rPr>
-      </w:pPr>
-      <w:r>
-        <w:rPr>
-          <w:rFonts w:ascii="Consolas" w:hAnsi="Consolas" w:cstheme="minorHAnsi"/>
-          <w:color w:val="000000" w:themeColor="text1"/>
-          <w:sz w:val="16"/>
-          <w:szCs w:val="16"/>
-        </w:rPr>
-        <w:t xml:space="preserve">A child class </w:t>
-      </w:r>
-      <w:r>
-        <w:rPr>
-          <w:rFonts w:ascii="Consolas" w:hAnsi="Consolas" w:cstheme="minorHAnsi"/>
-          <w:b/>
-          <w:bCs/>
-          <w:color w:val="000000" w:themeColor="text1"/>
-          <w:sz w:val="16"/>
-          <w:szCs w:val="16"/>
-        </w:rPr>
-        <w:t>cannot override</w:t>
-      </w:r>
-      <w:r>
-        <w:rPr>
-          <w:rFonts w:ascii="Consolas" w:hAnsi="Consolas" w:cstheme="minorHAnsi"/>
-          <w:color w:val="000000" w:themeColor="text1"/>
-          <w:sz w:val="16"/>
-          <w:szCs w:val="16"/>
-        </w:rPr>
-        <w:t xml:space="preserve"> </w:t>
-      </w:r>
-      <w:proofErr w:type="gramStart"/>
-      <w:r>
-        <w:rPr>
-          <w:rFonts w:ascii="Consolas" w:hAnsi="Consolas" w:cstheme="minorHAnsi"/>
-          <w:color w:val="000000" w:themeColor="text1"/>
-          <w:sz w:val="16"/>
-          <w:szCs w:val="16"/>
-        </w:rPr>
-        <w:t>show(</w:t>
-      </w:r>
-      <w:proofErr w:type="gramEnd"/>
-      <w:r>
-        <w:rPr>
-          <w:rFonts w:ascii="Consolas" w:hAnsi="Consolas" w:cstheme="minorHAnsi"/>
-          <w:color w:val="000000" w:themeColor="text1"/>
-          <w:sz w:val="16"/>
-          <w:szCs w:val="16"/>
-        </w:rPr>
-        <w:t>).</w:t>
-      </w:r>
-    </w:p>
-    <w:p>
-      <w:pPr>
-        <w:tabs>
-          <w:tab w:val="left" w:pos="10420"/>
-        </w:tabs>
-        <w:spacing w:after="0"/>
-        <w:rPr>
-          <w:rFonts w:ascii="Consolas" w:hAnsi="Consolas" w:cstheme="minorHAnsi"/>
-          <w:color w:val="000000" w:themeColor="text1"/>
-          <w:sz w:val="16"/>
-          <w:szCs w:val="16"/>
-        </w:rPr>
-      </w:pPr>
-    </w:p>
-    <w:p>
-      <w:pPr>
-        <w:tabs>
-          <w:tab w:val="left" w:pos="10420"/>
-        </w:tabs>
-        <w:spacing w:after="0"/>
-        <w:rPr>
-          <w:rFonts w:ascii="Consolas" w:hAnsi="Consolas" w:cstheme="minorHAnsi"/>
-          <w:color w:val="000000" w:themeColor="text1"/>
-          <w:sz w:val="16"/>
-          <w:szCs w:val="16"/>
-        </w:rPr>
-      </w:pPr>
-      <w:r>
-        <w:rPr>
-          <w:rFonts w:ascii="Consolas" w:hAnsi="Consolas" w:cstheme="minorHAnsi"/>
-          <w:b/>
-          <w:bCs/>
-          <w:color w:val="000000" w:themeColor="text1"/>
-          <w:sz w:val="16"/>
-          <w:szCs w:val="16"/>
-        </w:rPr>
-        <w:t>final</w:t>
-      </w:r>
-      <w:r>
-        <w:rPr>
-          <w:rFonts w:ascii="Consolas" w:hAnsi="Consolas" w:cstheme="minorHAnsi"/>
-          <w:color w:val="000000" w:themeColor="text1"/>
-          <w:sz w:val="16"/>
-          <w:szCs w:val="16"/>
-        </w:rPr>
-        <w:t xml:space="preserve"> class User {</w:t>
-      </w:r>
-    </w:p>
-    <w:p>
-      <w:pPr>
-        <w:tabs>
-          <w:tab w:val="left" w:pos="10420"/>
-        </w:tabs>
-        <w:spacing w:after="0"/>
-        <w:rPr>
-          <w:rFonts w:ascii="Consolas" w:hAnsi="Consolas" w:cstheme="minorHAnsi"/>
-          <w:color w:val="000000" w:themeColor="text1"/>
-          <w:sz w:val="16"/>
-          <w:szCs w:val="16"/>
-        </w:rPr>
-      </w:pPr>
-      <w:r>
-        <w:rPr>
-          <w:rFonts w:ascii="Consolas" w:hAnsi="Consolas" w:cstheme="minorHAnsi"/>
-          <w:color w:val="000000" w:themeColor="text1"/>
-          <w:sz w:val="16"/>
-          <w:szCs w:val="16"/>
-        </w:rPr>
-        <w:t>}</w:t>
-      </w:r>
-    </w:p>
-    <w:p>
-      <w:pPr>
-        <w:tabs>
-          <w:tab w:val="left" w:pos="10420"/>
-        </w:tabs>
-        <w:spacing w:after="0"/>
-        <w:rPr>
-          <w:rFonts w:ascii="Consolas" w:hAnsi="Consolas" w:cs="Segoe UI Emoji"/>
-          <w:color w:val="000000" w:themeColor="text1"/>
-          <w:sz w:val="16"/>
-          <w:szCs w:val="16"/>
-        </w:rPr>
-      </w:pPr>
-      <w:r>
-        <w:rPr>
-          <w:rFonts w:ascii="Consolas" w:hAnsi="Consolas" w:cstheme="minorHAnsi"/>
-          <w:color w:val="000000" w:themeColor="text1"/>
-          <w:sz w:val="16"/>
-          <w:szCs w:val="16"/>
-        </w:rPr>
-        <w:t xml:space="preserve">class Admin extends User </w:t>
-      </w:r>
-      <w:proofErr w:type="gramStart"/>
-      <w:r>
-        <w:rPr>
-          <w:rFonts w:ascii="Consolas" w:hAnsi="Consolas" w:cstheme="minorHAnsi"/>
-          <w:color w:val="000000" w:themeColor="text1"/>
-          <w:sz w:val="16"/>
-          <w:szCs w:val="16"/>
-        </w:rPr>
-        <w:t>{ }</w:t>
-      </w:r>
-      <w:proofErr w:type="gramEnd"/>
-      <w:r>
-        <w:rPr>
-          <w:rFonts w:ascii="Consolas" w:hAnsi="Consolas" w:cstheme="minorHAnsi"/>
-          <w:color w:val="000000" w:themeColor="text1"/>
-          <w:sz w:val="16"/>
-          <w:szCs w:val="16"/>
-        </w:rPr>
-        <w:t xml:space="preserve"> // </w:t>
-      </w:r>
-      <w:r>
-        <w:rPr>
-          <w:rFonts w:ascii="Segoe UI Emoji" w:hAnsi="Segoe UI Emoji" w:cs="Segoe UI Emoji"/>
-          <w:color w:val="EE0000"/>
-          <w:sz w:val="16"/>
-          <w:szCs w:val="16"/>
-        </w:rPr>
-        <w:t>❌</w:t>
-      </w:r>
-      <w:r>
-        <w:rPr>
-          <w:rFonts w:ascii="Consolas" w:hAnsi="Consolas"/>
-          <w:color w:val="EE0000"/>
-          <w:sz w:val="16"/>
-          <w:szCs w:val="16"/>
-        </w:rPr>
-        <w:t xml:space="preserve"> </w:t>
-      </w:r>
-      <w:r>
-        <w:rPr>
-          <w:rFonts w:ascii="Consolas" w:hAnsi="Consolas" w:cs="Segoe UI Emoji"/>
-          <w:color w:val="000000" w:themeColor="text1"/>
-          <w:sz w:val="16"/>
-          <w:szCs w:val="16"/>
-        </w:rPr>
-        <w:t>Cannot be inherited</w:t>
-      </w:r>
-    </w:p>
-    <w:p>
-      <w:pPr>
-        <w:tabs>
-          <w:tab w:val="left" w:pos="10420"/>
-        </w:tabs>
-        <w:spacing w:after="0"/>
-        <w:rPr>
-          <w:rFonts w:cstheme="minorHAnsi"/>
-          <w:color w:val="000000" w:themeColor="text1"/>
-        </w:rPr>
-      </w:pPr>
-      <w:r>
-        <w:rPr>
-          <w:rFonts w:cstheme="minorHAnsi"/>
-          <w:color w:val="000000" w:themeColor="text1"/>
-        </w:rPr>
-        <w:br/>
-      </w:r>
-      <w:r>
-        <w:rPr>
-          <w:rFonts w:cstheme="minorHAnsi"/>
-          <w:b/>
-          <w:bCs/>
-          <w:color w:val="000000" w:themeColor="text1"/>
-        </w:rPr>
-        <w:t xml:space="preserve">static → </w:t>
-      </w:r>
-      <w:r>
-        <w:rPr>
-          <w:rFonts w:cstheme="minorHAnsi"/>
-          <w:color w:val="000000" w:themeColor="text1"/>
-        </w:rPr>
-        <w:t>belongs to class</w:t>
-      </w:r>
-      <w:r>
-        <w:rPr>
-          <w:rFonts w:cstheme="minorHAnsi"/>
-          <w:color w:val="000000" w:themeColor="text1"/>
-        </w:rPr>
-        <w:br/>
-      </w:r>
-      <w:r>
-        <w:rPr>
-          <w:rFonts w:cstheme="minorHAnsi"/>
-          <w:b/>
-          <w:bCs/>
-          <w:color w:val="000000" w:themeColor="text1"/>
-        </w:rPr>
-        <w:t xml:space="preserve">abstract → </w:t>
-      </w:r>
-      <w:r>
-        <w:rPr>
-          <w:rFonts w:cstheme="minorHAnsi"/>
-          <w:color w:val="000000" w:themeColor="text1"/>
-        </w:rPr>
-        <w:t>incomplete, must be implemented</w:t>
-      </w:r>
-    </w:p>
-    <w:p>
-      <w:pPr>
-        <w:tabs>
-          <w:tab w:val="left" w:pos="10420"/>
-        </w:tabs>
-        <w:spacing w:after="0"/>
-        <w:rPr>
-          <w:rFonts w:cstheme="minorHAnsi"/>
-          <w:color w:val="000000" w:themeColor="text1"/>
-          <w:sz w:val="22"/>
-          <w:szCs w:val="22"/>
-        </w:rPr>
-      </w:pPr>
-      <w:r>
-        <w:rPr>
-          <w:rFonts w:cstheme="minorHAnsi"/>
-          <w:color w:val="000000" w:themeColor="text1"/>
-          <w:sz w:val="22"/>
-          <w:szCs w:val="22"/>
-        </w:rPr>
-        <w:t>abstract is used to define incomplete classes or methods. An abstract method has no implementation and must be implemented by a concrete subclass.</w:t>
-      </w:r>
-      <w:r>
-        <w:rPr>
-          <w:rFonts w:cstheme="minorHAnsi"/>
-          <w:color w:val="000000" w:themeColor="text1"/>
-          <w:sz w:val="22"/>
-          <w:szCs w:val="22"/>
-        </w:rPr>
-        <w:tab/>
-      </w:r>
-    </w:p>
-    <w:p>
-      <w:pPr>
-        <w:tabs>
-          <w:tab w:val="left" w:pos="10420"/>
-        </w:tabs>
-        <w:spacing w:after="0"/>
-        <w:rPr>
-          <w:rFonts w:cstheme="minorHAnsi"/>
-          <w:color w:val="000000" w:themeColor="text1"/>
-        </w:rPr>
-      </w:pPr>
-      <w:r>
-        <w:rPr>
-          <w:rFonts w:cstheme="minorHAnsi"/>
-          <w:color w:val="000000" w:themeColor="text1"/>
-        </w:rPr>
-        <w:t xml:space="preserve">6. </w:t>
-      </w:r>
-      <w:r>
-        <w:rPr>
-          <w:rFonts w:cstheme="minorHAnsi"/>
-          <w:color w:val="000000" w:themeColor="text1"/>
-        </w:rPr>
-        <w:t xml:space="preserve">HashMap / </w:t>
-      </w:r>
-      <w:proofErr w:type="spellStart"/>
-      <w:r>
-        <w:rPr>
-          <w:rFonts w:cstheme="minorHAnsi"/>
-          <w:color w:val="000000" w:themeColor="text1"/>
-        </w:rPr>
-        <w:t>ConcurrentHashMap</w:t>
-      </w:r>
-      <w:proofErr w:type="spellEnd"/>
-    </w:p>
-    <w:p>
-      <w:pPr>
-        <w:tabs>
-          <w:tab w:val="left" w:pos="10420"/>
-        </w:tabs>
-        <w:spacing w:after="0"/>
-        <w:rPr>
-          <w:rFonts w:cstheme="minorHAnsi"/>
-          <w:color w:val="000000" w:themeColor="text1"/>
-        </w:rPr>
-      </w:pPr>
-      <w:r>
-        <w:rPr>
-          <w:rFonts w:cstheme="minorHAnsi"/>
-          <w:b/>
-          <w:bCs/>
-          <w:color w:val="000000" w:themeColor="text1"/>
-        </w:rPr>
-        <w:t>HashMap</w:t>
-      </w:r>
-      <w:r>
-        <w:rPr>
-          <w:rFonts w:cstheme="minorHAnsi"/>
-          <w:color w:val="000000" w:themeColor="text1"/>
-        </w:rPr>
-        <w:t xml:space="preserve"> is not thread-safe and is generally used when the map is accessed by a single thread or externally synchronized. </w:t>
-      </w:r>
-    </w:p>
-    <w:p>
-      <w:pPr>
-        <w:tabs>
-          <w:tab w:val="left" w:pos="10420"/>
-        </w:tabs>
-        <w:spacing w:after="0"/>
-        <w:rPr>
-          <w:rFonts w:cstheme="minorHAnsi"/>
-          <w:color w:val="000000" w:themeColor="text1"/>
-        </w:rPr>
-      </w:pPr>
-      <w:proofErr w:type="spellStart"/>
-      <w:r>
-        <w:rPr>
-          <w:rFonts w:cstheme="minorHAnsi"/>
-          <w:b/>
-          <w:bCs/>
-          <w:color w:val="000000" w:themeColor="text1"/>
-        </w:rPr>
-        <w:t>ConcurrentHashMap</w:t>
-      </w:r>
-      <w:proofErr w:type="spellEnd"/>
-      <w:r>
-        <w:rPr>
-          <w:rFonts w:cstheme="minorHAnsi"/>
-          <w:color w:val="000000" w:themeColor="text1"/>
-        </w:rPr>
-        <w:t xml:space="preserve"> is designed for concurrent access by multiple threads and provides thread-safe operations with better concurrency than synchronizing the entire map. Unlike HashMap, it does not allow null keys or null values.</w:t>
-      </w:r>
-    </w:p>
-    <w:p>
-      <w:pPr>
-        <w:tabs>
-          <w:tab w:val="left" w:pos="10420"/>
-        </w:tabs>
-        <w:spacing w:after="0"/>
-        <w:rPr>
-          <w:rFonts w:cstheme="minorHAnsi"/>
-          <w:color w:val="000000" w:themeColor="text1"/>
-          <w:sz w:val="22"/>
-          <w:szCs w:val="22"/>
         </w:rPr>
       </w:pPr>
     </w:p>

</xml_diff>